<commit_message>
Expand CP1 literature review references
</commit_message>
<xml_diff>
--- a/docs/Nomobug_Capstone_Proposal_CP1_Updated.docx
+++ b/docs/Nomobug_Capstone_Proposal_CP1_Updated.docx
@@ -2252,21 +2252,7 @@
         </w:rPr>
       </w:pPr>
       <w:r>
-        <w:rPr>
-          <w:rFonts w:ascii="Times New Roman" w:hAnsi="Times New Roman" w:cs="Times New Roman"/>
-          <w:sz w:val="24"/>
-          <w:szCs w:val="24"/>
-        </w:rPr>
-        <w:t xml:space="preserve">This literature review reviews recent academic papers, technical documentation, and decision-support references related to the proposed system. In line with the supervisor feedback, the cited literature focuses on 2020 onwards. Older foundation methods such as DBSCAN, logistic </w:t>
-      </w:r>
-      <w:r>
-        <w:rPr>
-          <w:rFonts w:ascii="Times New Roman" w:hAnsi="Times New Roman" w:cs="Times New Roman"/>
-          <w:sz w:val="24"/>
-          <w:szCs w:val="24"/>
-        </w:rPr>
-        <w:lastRenderedPageBreak/>
-        <w:t>regression, KDE, and SHAP are discussed only as methodological concepts, while the cited support is drawn from recent studies and documentation. The chapter is organised around business intelligence for SMEs, weather-aware pest and service-risk analysis, digital pest decision-support systems, spatial-temporal hotspot detection, explainable prediction, and AI-assisted recommendations.</w:t>
+        <w:t>This literature review reviews recent academic papers, technical documentation, and decision-support references related to the proposed system. In line with supervisor feedback, the cited literature focuses on 2020 onwards and expands the review to cover approximately 25 academic or research-based sources, with separate technical references for APIs and tools. Older foundation methods such as DBSCAN, logistic regression, KDE, and SHAP are discussed only as methodological concepts, while the cited support is drawn from recent studies and documentation. The chapter is organised around business intelligence for SMEs, weather-aware pest management, digital pest decision-support systems, spatial-temporal hotspot detection, weather-based prediction, explainable modelling, and AI-assisted recommendations.</w:t>
       </w:r>
     </w:p>
     <w:p>
@@ -2353,6 +2339,18 @@
           <w:szCs w:val="24"/>
         </w:rPr>
         <w:t xml:space="preserve"> also connect business questions across sources: which ad sources produce better customers, which areas generate repeat problems, which service types cause higher refunds, and which package-fit recommendations are supported by historical patterns.</w:t>
+      </w:r>
+    </w:p>
+    <w:p>
+      <w:pPr/>
+      <w:r>
+        <w:t>Schulze et al. (2023) provide a systematic review of digital dashboards and show that dashboards are most useful when they combine clear visual design, reliable data, and action-oriented communication. This supports the proposed use of Apache Superset dashboards for management users who need to scan key service, warranty, payment, and scheduling indicators quickly. Blacketer et al. (2021) further demonstrate the value of a dedicated data quality dashboard, showing that decision-makers need visibility into completeness, conformance, and data reliability before trusting analytical outputs. For Nomobug, this supports including a Data Quality and Refresh module rather than treating cleaning as a hidden technical step.</w:t>
+      </w:r>
+    </w:p>
+    <w:p>
+      <w:pPr/>
+      <w:r>
+        <w:t>Fu et al. (2024) argue that data quality in industry should be understood as part of a wider data-driven workflow, not only as a technical database issue. Their review is relevant because Nomobug's raw data comes from practical operational sources such as Google Sheets and Google Calendar, where inconsistent labels, missing identifiers, and unmatched records are expected. This reinforces the project's decision to preserve raw staging data, create cleaning flags, and show data-quality coverage before interpreting risk or performance results.</w:t>
       </w:r>
     </w:p>
     <w:p>
@@ -2573,6 +2571,18 @@
       </w:r>
     </w:p>
     <w:p>
+      <w:pPr/>
+      <w:r>
+        <w:t>Tonle et al. (2024) propose a roadmap for developing decision support systems for integrated pest management and highlight the need for practical architectures that connect data sources, models, and user-facing decision outputs. Although their focus is agricultural IPM, the architecture principle is highly relevant to this project because the Nomobug system will connect operational data, weather enrichment, analytics marts, and dashboard recommendations. Marinko et al. (2024) also develop a typology for IPM decision support systems and implement it as a web application, showing that DSS features must be classified clearly so users understand whether the system provides monitoring, prediction, recommendation, or advisory support.</w:t>
+      </w:r>
+    </w:p>
+    <w:p>
+      <w:pPr/>
+      <w:r>
+        <w:t>Fiori et al. (2024) present SMARTerra, a high-resolution DSS for monitoring plant pests and diseases through risk maps and timely intervention support. This strengthens the justification for using weather-associated risk maps and area-level planning views in Nomobug. Marinko et al. (2025) examine barriers to DSS adoption in integrated pest management and show that practical uptake depends on trust, usability, data availability, and perceived usefulness. This is important for the capstone because the dashboard must be understandable to company users, not only technically impressive.</w:t>
+      </w:r>
+    </w:p>
+    <w:p>
       <w:pPr>
         <w:pStyle w:val="Heading2"/>
         <w:spacing w:line="360" w:lineRule="auto"/>
@@ -2638,6 +2648,12 @@
           <w:szCs w:val="24"/>
         </w:rPr>
         <w:t>KDE heatmaps complement clustering because they provide a smoother visual layer for dashboard users. In this project, DBSCAN will be used as the main clustering method for detecting candidate repeat-problem hotspots, while KDE-style heatmaps will be used mainly for visual interpretation. This keeps the method understandable for management while still providing a stronger spatial analysis contribution than a simple area-count table.</w:t>
+      </w:r>
+    </w:p>
+    <w:p>
+      <w:pPr/>
+      <w:r>
+        <w:t>Choi and Hong (2021) propose MDST-DBSCAN for multidimensional spatiotemporal data and show that density-based methods can identify clusters while supporting irregular cluster shapes and noise separation. This supports the choice of DBSCAN-style hotspot detection for repeat-problem and warranty records, because pest service outcomes may cluster around small local areas rather than fixed administrative boundaries. The proposed project will keep the method simpler than MDST-DBSCAN for implementation, but the study supports the suitability of density-based clustering for spatiotemporal analysis.</w:t>
       </w:r>
     </w:p>
     <w:p>
@@ -2701,12 +2717,19 @@
         </w:rPr>
       </w:pPr>
       <w:r>
-        <w:rPr>
-          <w:rFonts w:ascii="Times New Roman" w:hAnsi="Times New Roman" w:cs="Times New Roman"/>
-          <w:sz w:val="24"/>
-          <w:szCs w:val="24"/>
-        </w:rPr>
-        <w:t>This choice is methodologically important. Complex models such as random forests, XGBoost, or deep learning may appear advanced, but they can overfit small datasets and reduce explainability. A capstone system used by a real company should prioritise trustworthy, understandable indicators over black-box model accuracy that cannot be defended with limited data.</w:t>
+        <w:t>This choice is methodologically important. Complex models such as random forests, XGBoost, or deep learning may appear advanced, but they can overfit small datasets and reduce explainability. Because the expected warranty data volume is modest, the project will position complex ML as optional or future work and will focus first on defensible analytics: day/week/month descriptive trends, recurrence windows, DBSCAN/KDE hotspots, weather lag indicators, and simple logistic regression only where the data is sufficient.</w:t>
+      </w:r>
+    </w:p>
+    <w:p>
+      <w:pPr/>
+      <w:r>
+        <w:t>Ejike et al. (2025) compare logistic regression and random forest models for rainfall prediction in tropical and temperate climates, including Alor Setar as a tropical site. Their study supports the use of weather variables such as humidity, pressure, temperature, and rainfall in predictive modelling, but it also shows why model choice should match the problem and data size. For Nomobug, logistic regression and lag-based weather features are more defensible than heavier models because the warranty dataset is expected to contain only around 200+ records.</w:t>
+      </w:r>
+    </w:p>
+    <w:p>
+      <w:pPr/>
+      <w:r>
+        <w:t>Yao et al. (2026) use XGBoost and SHAP to analyse environmental, demographic, and socio-economic factors associated with mosquito density. This demonstrates the value of explainability when environmental factors are used in pest-related modelling. However, the proposed Nomobug system will treat SHAP-style explanations as future work or optional model interpretation, because the first implementation should prioritise robust descriptive, spatial, and recurrence analytics over complex models that may overfit limited warranty data.</w:t>
       </w:r>
     </w:p>
     <w:p>
@@ -2793,6 +2816,12 @@
           <w:szCs w:val="24"/>
         </w:rPr>
         <w:t>. The company can run Ollama locally in the future to explain why a case is high risk, why an area needs closer monitoring, or which action may reduce repeat visits. This is aligned with prescriptive analytics while avoiding external AI API cost.</w:t>
+      </w:r>
+    </w:p>
+    <w:p>
+      <w:pPr/>
+      <w:r>
+        <w:t>Leybourne et al. (2025) discuss whether AI can be integrated into pest monitoring schemes and emphasise that successful AI use requires both computational capability and practical acceptance by domain users. This supports the project's decision to keep Ollama as a future local explanation layer rather than making generative AI the main decision engine. Recommendations should first be produced by transparent analytics rules and stored in a recommendation log; local AI can later translate those results into clearer management-facing explanations.</w:t>
       </w:r>
     </w:p>
     <w:p>
@@ -5198,6 +5227,426 @@
           </w:p>
         </w:tc>
       </w:tr>
+      <w:tr>
+        <w:tc>
+          <w:tcPr>
+            <w:tcW w:type="dxa" w:w="2248"/>
+          </w:tcPr>
+          <w:p>
+            <w:r>
+              <w:t>Schulze et al. (2023)</w:t>
+            </w:r>
+          </w:p>
+        </w:tc>
+        <w:tc>
+          <w:tcPr>
+            <w:tcW w:type="dxa" w:w="2251"/>
+          </w:tcPr>
+          <w:p>
+            <w:r>
+              <w:t>Digital dashboard systematic review</w:t>
+            </w:r>
+          </w:p>
+        </w:tc>
+        <w:tc>
+          <w:tcPr>
+            <w:tcW w:type="dxa" w:w="2269"/>
+          </w:tcPr>
+          <w:p>
+            <w:r>
+              <w:t>Supports dashboard design and action-oriented visual communication</w:t>
+            </w:r>
+          </w:p>
+        </w:tc>
+        <w:tc>
+          <w:tcPr>
+            <w:tcW w:type="dxa" w:w="2248"/>
+          </w:tcPr>
+          <w:p>
+            <w:r>
+              <w:t>General public-health context</w:t>
+            </w:r>
+          </w:p>
+        </w:tc>
+      </w:tr>
+      <w:tr>
+        <w:tc>
+          <w:tcPr>
+            <w:tcW w:type="dxa" w:w="2248"/>
+          </w:tcPr>
+          <w:p>
+            <w:r>
+              <w:t>Blacketer et al. (2021)</w:t>
+            </w:r>
+          </w:p>
+        </w:tc>
+        <w:tc>
+          <w:tcPr>
+            <w:tcW w:type="dxa" w:w="2251"/>
+          </w:tcPr>
+          <w:p>
+            <w:r>
+              <w:t>Data Quality Dashboard</w:t>
+            </w:r>
+          </w:p>
+        </w:tc>
+        <w:tc>
+          <w:tcPr>
+            <w:tcW w:type="dxa" w:w="2269"/>
+          </w:tcPr>
+          <w:p>
+            <w:r>
+              <w:t>Supports data quality reporting before analytics interpretation</w:t>
+            </w:r>
+          </w:p>
+        </w:tc>
+        <w:tc>
+          <w:tcPr>
+            <w:tcW w:type="dxa" w:w="2248"/>
+          </w:tcPr>
+          <w:p>
+            <w:r>
+              <w:t>Healthcare context but transferable</w:t>
+            </w:r>
+          </w:p>
+        </w:tc>
+      </w:tr>
+      <w:tr>
+        <w:tc>
+          <w:tcPr>
+            <w:tcW w:type="dxa" w:w="2248"/>
+          </w:tcPr>
+          <w:p>
+            <w:r>
+              <w:t>Fu et al. (2024)</w:t>
+            </w:r>
+          </w:p>
+        </w:tc>
+        <w:tc>
+          <w:tcPr>
+            <w:tcW w:type="dxa" w:w="2251"/>
+          </w:tcPr>
+          <w:p>
+            <w:r>
+              <w:t>Industrial data quality review</w:t>
+            </w:r>
+          </w:p>
+        </w:tc>
+        <w:tc>
+          <w:tcPr>
+            <w:tcW w:type="dxa" w:w="2269"/>
+          </w:tcPr>
+          <w:p>
+            <w:r>
+              <w:t>Supports staging, cleaning flags, and governance workflow</w:t>
+            </w:r>
+          </w:p>
+        </w:tc>
+        <w:tc>
+          <w:tcPr>
+            <w:tcW w:type="dxa" w:w="2248"/>
+          </w:tcPr>
+          <w:p>
+            <w:r>
+              <w:t>Conceptual review</w:t>
+            </w:r>
+          </w:p>
+        </w:tc>
+      </w:tr>
+      <w:tr>
+        <w:tc>
+          <w:tcPr>
+            <w:tcW w:type="dxa" w:w="2248"/>
+          </w:tcPr>
+          <w:p>
+            <w:r>
+              <w:t>Tonle et al. (2024)</w:t>
+            </w:r>
+          </w:p>
+        </w:tc>
+        <w:tc>
+          <w:tcPr>
+            <w:tcW w:type="dxa" w:w="2251"/>
+          </w:tcPr>
+          <w:p>
+            <w:r>
+              <w:t>Pest management DSS roadmap</w:t>
+            </w:r>
+          </w:p>
+        </w:tc>
+        <w:tc>
+          <w:tcPr>
+            <w:tcW w:type="dxa" w:w="2269"/>
+          </w:tcPr>
+          <w:p>
+            <w:r>
+              <w:t>Supports architecture connecting data, models, and decision outputs</w:t>
+            </w:r>
+          </w:p>
+        </w:tc>
+        <w:tc>
+          <w:tcPr>
+            <w:tcW w:type="dxa" w:w="2248"/>
+          </w:tcPr>
+          <w:p>
+            <w:r>
+              <w:t>Agricultural IPM context</w:t>
+            </w:r>
+          </w:p>
+        </w:tc>
+      </w:tr>
+      <w:tr>
+        <w:tc>
+          <w:tcPr>
+            <w:tcW w:type="dxa" w:w="2248"/>
+          </w:tcPr>
+          <w:p>
+            <w:r>
+              <w:t>Marinko et al. (2024)</w:t>
+            </w:r>
+          </w:p>
+        </w:tc>
+        <w:tc>
+          <w:tcPr>
+            <w:tcW w:type="dxa" w:w="2251"/>
+          </w:tcPr>
+          <w:p>
+            <w:r>
+              <w:t>IPM DSS typology web app</w:t>
+            </w:r>
+          </w:p>
+        </w:tc>
+        <w:tc>
+          <w:tcPr>
+            <w:tcW w:type="dxa" w:w="2269"/>
+          </w:tcPr>
+          <w:p>
+            <w:r>
+              <w:t>Supports classifying monitoring, prediction, and recommendation features</w:t>
+            </w:r>
+          </w:p>
+        </w:tc>
+        <w:tc>
+          <w:tcPr>
+            <w:tcW w:type="dxa" w:w="2248"/>
+          </w:tcPr>
+          <w:p>
+            <w:r>
+              <w:t>Agricultural DSS focus</w:t>
+            </w:r>
+          </w:p>
+        </w:tc>
+      </w:tr>
+      <w:tr>
+        <w:tc>
+          <w:tcPr>
+            <w:tcW w:type="dxa" w:w="2248"/>
+          </w:tcPr>
+          <w:p>
+            <w:r>
+              <w:t>Fiori et al. (2024)</w:t>
+            </w:r>
+          </w:p>
+        </w:tc>
+        <w:tc>
+          <w:tcPr>
+            <w:tcW w:type="dxa" w:w="2251"/>
+          </w:tcPr>
+          <w:p>
+            <w:r>
+              <w:t>SMARTerra pest/disease DSS</w:t>
+            </w:r>
+          </w:p>
+        </w:tc>
+        <w:tc>
+          <w:tcPr>
+            <w:tcW w:type="dxa" w:w="2269"/>
+          </w:tcPr>
+          <w:p>
+            <w:r>
+              <w:t>Supports high-resolution risk maps and planning dashboards</w:t>
+            </w:r>
+          </w:p>
+        </w:tc>
+        <w:tc>
+          <w:tcPr>
+            <w:tcW w:type="dxa" w:w="2248"/>
+          </w:tcPr>
+          <w:p>
+            <w:r>
+              <w:t>Plant pest/disease context</w:t>
+            </w:r>
+          </w:p>
+        </w:tc>
+      </w:tr>
+      <w:tr>
+        <w:tc>
+          <w:tcPr>
+            <w:tcW w:type="dxa" w:w="2248"/>
+          </w:tcPr>
+          <w:p>
+            <w:r>
+              <w:t>Marinko et al. (2025)</w:t>
+            </w:r>
+          </w:p>
+        </w:tc>
+        <w:tc>
+          <w:tcPr>
+            <w:tcW w:type="dxa" w:w="2251"/>
+          </w:tcPr>
+          <w:p>
+            <w:r>
+              <w:t>DSS adoption barriers</w:t>
+            </w:r>
+          </w:p>
+        </w:tc>
+        <w:tc>
+          <w:tcPr>
+            <w:tcW w:type="dxa" w:w="2269"/>
+          </w:tcPr>
+          <w:p>
+            <w:r>
+              <w:t>Supports usability, trust, and adoption evaluation</w:t>
+            </w:r>
+          </w:p>
+        </w:tc>
+        <w:tc>
+          <w:tcPr>
+            <w:tcW w:type="dxa" w:w="2248"/>
+          </w:tcPr>
+          <w:p>
+            <w:r>
+              <w:t>European IPM setting</w:t>
+            </w:r>
+          </w:p>
+        </w:tc>
+      </w:tr>
+      <w:tr>
+        <w:tc>
+          <w:tcPr>
+            <w:tcW w:type="dxa" w:w="2248"/>
+          </w:tcPr>
+          <w:p>
+            <w:r>
+              <w:t>Choi &amp; Hong (2021)</w:t>
+            </w:r>
+          </w:p>
+        </w:tc>
+        <w:tc>
+          <w:tcPr>
+            <w:tcW w:type="dxa" w:w="2251"/>
+          </w:tcPr>
+          <w:p>
+            <w:r>
+              <w:t>MDST-DBSCAN spatiotemporal clustering</w:t>
+            </w:r>
+          </w:p>
+        </w:tc>
+        <w:tc>
+          <w:tcPr>
+            <w:tcW w:type="dxa" w:w="2269"/>
+          </w:tcPr>
+          <w:p>
+            <w:r>
+              <w:t>Supports density-based hotspot detection with noisy spatial data</w:t>
+            </w:r>
+          </w:p>
+        </w:tc>
+        <w:tc>
+          <w:tcPr>
+            <w:tcW w:type="dxa" w:w="2248"/>
+          </w:tcPr>
+          <w:p>
+            <w:r>
+              <w:t>More advanced than required</w:t>
+            </w:r>
+          </w:p>
+        </w:tc>
+      </w:tr>
+      <w:tr>
+        <w:tc>
+          <w:tcPr>
+            <w:tcW w:type="dxa" w:w="2248"/>
+          </w:tcPr>
+          <w:p>
+            <w:r>
+              <w:t>Ejike et al. (2025)</w:t>
+            </w:r>
+          </w:p>
+        </w:tc>
+        <w:tc>
+          <w:tcPr>
+            <w:tcW w:type="dxa" w:w="2251"/>
+          </w:tcPr>
+          <w:p>
+            <w:r>
+              <w:t>Rainfall prediction using ML</w:t>
+            </w:r>
+          </w:p>
+        </w:tc>
+        <w:tc>
+          <w:tcPr>
+            <w:tcW w:type="dxa" w:w="2269"/>
+          </w:tcPr>
+          <w:p>
+            <w:r>
+              <w:t>Supports lightweight weather modelling and logistic regression comparison</w:t>
+            </w:r>
+          </w:p>
+        </w:tc>
+        <w:tc>
+          <w:tcPr>
+            <w:tcW w:type="dxa" w:w="2248"/>
+          </w:tcPr>
+          <w:p>
+            <w:r>
+              <w:t>Weather prediction, not pest outcome</w:t>
+            </w:r>
+          </w:p>
+        </w:tc>
+      </w:tr>
+      <w:tr>
+        <w:tc>
+          <w:tcPr>
+            <w:tcW w:type="dxa" w:w="2248"/>
+          </w:tcPr>
+          <w:p>
+            <w:r>
+              <w:t>Leybourne et al. (2025)</w:t>
+            </w:r>
+          </w:p>
+        </w:tc>
+        <w:tc>
+          <w:tcPr>
+            <w:tcW w:type="dxa" w:w="2251"/>
+          </w:tcPr>
+          <w:p>
+            <w:r>
+              <w:t>AI in pest monitoring schemes</w:t>
+            </w:r>
+          </w:p>
+        </w:tc>
+        <w:tc>
+          <w:tcPr>
+            <w:tcW w:type="dxa" w:w="2269"/>
+          </w:tcPr>
+          <w:p>
+            <w:r>
+              <w:t>Supports future AI explanation layer and adoption caution</w:t>
+            </w:r>
+          </w:p>
+        </w:tc>
+        <w:tc>
+          <w:tcPr>
+            <w:tcW w:type="dxa" w:w="2248"/>
+          </w:tcPr>
+          <w:p>
+            <w:r>
+              <w:t>Agricultural monitoring focus</w:t>
+            </w:r>
+          </w:p>
+        </w:tc>
+      </w:tr>
     </w:tbl>
     <w:p>
       <w:pPr>
@@ -17950,535 +18399,224 @@
       </w:r>
     </w:p>
     <w:p>
-      <w:pPr>
-        <w:spacing w:line="360" w:lineRule="auto"/>
-        <w:ind w:left="360" w:hanging="360"/>
-        <w:rPr>
-          <w:rFonts w:ascii="Times New Roman" w:hAnsi="Times New Roman" w:cs="Times New Roman"/>
-          <w:sz w:val="24"/>
-          <w:szCs w:val="24"/>
-        </w:rPr>
-      </w:pPr>
+      <w:pPr/>
       <w:r>
-        <w:rPr>
-          <w:rFonts w:ascii="Times New Roman" w:hAnsi="Times New Roman" w:cs="Times New Roman"/>
-          <w:sz w:val="24"/>
-          <w:szCs w:val="24"/>
-        </w:rPr>
         <w:t>Apache Superset. (2026). Google BigQuery database support. https://superset.apache.org/user-docs/databases/supported/google-bigquery</w:t>
       </w:r>
     </w:p>
     <w:p>
-      <w:pPr>
-        <w:spacing w:line="360" w:lineRule="auto"/>
-        <w:ind w:left="360" w:hanging="360"/>
-        <w:rPr>
-          <w:rFonts w:ascii="Times New Roman" w:hAnsi="Times New Roman" w:cs="Times New Roman"/>
-          <w:sz w:val="24"/>
-          <w:szCs w:val="24"/>
-        </w:rPr>
-      </w:pPr>
+      <w:pPr/>
       <w:r>
-        <w:rPr>
-          <w:rFonts w:ascii="Times New Roman" w:hAnsi="Times New Roman" w:cs="Times New Roman"/>
-          <w:sz w:val="24"/>
-          <w:szCs w:val="24"/>
-        </w:rPr>
         <w:t>Apache Superset. (2026). Introduction to Apache Superset. https://superset.apache.org/user-docs/intro/</w:t>
       </w:r>
     </w:p>
     <w:p>
-      <w:pPr>
-        <w:spacing w:line="360" w:lineRule="auto"/>
-        <w:ind w:left="360" w:hanging="360"/>
-        <w:rPr>
-          <w:rFonts w:ascii="Times New Roman" w:hAnsi="Times New Roman" w:cs="Times New Roman"/>
-          <w:sz w:val="24"/>
-          <w:szCs w:val="24"/>
-        </w:rPr>
-      </w:pPr>
+      <w:pPr/>
       <w:r>
-        <w:rPr>
-          <w:rFonts w:ascii="Times New Roman" w:hAnsi="Times New Roman" w:cs="Times New Roman"/>
-          <w:sz w:val="24"/>
-          <w:szCs w:val="24"/>
-        </w:rPr>
         <w:t>Biswas, S., Mohite, J., &amp; Pappula, S. (2022). Systems and methods for pest forecasting using historical pesticide usage information. U.S. Patent No. US11397837B2. https://patents.google.com/patent/US11397837B2</w:t>
       </w:r>
     </w:p>
     <w:p>
-      <w:pPr>
-        <w:spacing w:line="360" w:lineRule="auto"/>
-        <w:ind w:left="360" w:hanging="360"/>
-        <w:rPr>
-          <w:rFonts w:ascii="Times New Roman" w:hAnsi="Times New Roman" w:cs="Times New Roman"/>
-          <w:sz w:val="24"/>
-          <w:szCs w:val="24"/>
-        </w:rPr>
-      </w:pPr>
+      <w:pPr/>
       <w:r>
-        <w:rPr>
-          <w:rFonts w:ascii="Times New Roman" w:hAnsi="Times New Roman" w:cs="Times New Roman"/>
-          <w:sz w:val="24"/>
-          <w:szCs w:val="24"/>
-        </w:rPr>
+        <w:t>Blacketer, C., Defalco, F. J., Ryan, P. B., &amp; Rijnbeek, P. R. (2021). Increasing trust in real-world evidence through evaluation of observational data quality. Journal of the American Medical Informatics Association, 28(10), 2251-2257. https://doi.org/10.1093/jamia/ocab132</w:t>
+      </w:r>
+    </w:p>
+    <w:p>
+      <w:pPr/>
+      <w:r>
         <w:t>Brimblecombe, P., Muller, G., Schmidt, M., Tischhauser, W., Landau, I., &amp; Querner, P. (2023). Urban pest abundance and public enquiries in Zurich 1991-2022. Insects, 14(10), 798. https://doi.org/10.3390/insects14100798</w:t>
       </w:r>
     </w:p>
     <w:p>
-      <w:pPr>
-        <w:spacing w:line="360" w:lineRule="auto"/>
-        <w:ind w:left="360" w:hanging="360"/>
-        <w:rPr>
-          <w:rFonts w:ascii="Times New Roman" w:hAnsi="Times New Roman" w:cs="Times New Roman"/>
-          <w:sz w:val="24"/>
-          <w:szCs w:val="24"/>
-        </w:rPr>
-      </w:pPr>
+      <w:pPr/>
       <w:r>
-        <w:rPr>
-          <w:rFonts w:ascii="Times New Roman" w:hAnsi="Times New Roman" w:cs="Times New Roman"/>
-          <w:sz w:val="24"/>
-          <w:szCs w:val="24"/>
-        </w:rPr>
         <w:t>Calatayud, J., Jornet, M., Mateu, J., &amp; Pinto, C. M. A. (2023). A new population model for urban infestations. Chaos, Solitons &amp; Fractals, 175, 113939. https://doi.org/10.1016/j.chaos.2023.113939</w:t>
       </w:r>
     </w:p>
     <w:p>
-      <w:pPr>
-        <w:spacing w:line="360" w:lineRule="auto"/>
-        <w:ind w:left="360" w:hanging="360"/>
-        <w:rPr>
-          <w:rFonts w:ascii="Times New Roman" w:hAnsi="Times New Roman" w:cs="Times New Roman"/>
-          <w:sz w:val="24"/>
-          <w:szCs w:val="24"/>
-        </w:rPr>
-      </w:pPr>
+      <w:pPr/>
       <w:r>
-        <w:rPr>
-          <w:rFonts w:ascii="Times New Roman" w:hAnsi="Times New Roman" w:cs="Times New Roman"/>
-          <w:sz w:val="24"/>
-          <w:szCs w:val="24"/>
-        </w:rPr>
+        <w:t>Choi, C., &amp; Hong, S.-Y. (2021). MDST-DBSCAN: A density-based clustering method for multidimensional spatiotemporal data. ISPRS International Journal of Geo-Information, 10(6), 391. https://doi.org/10.3390/ijgi10060391</w:t>
+      </w:r>
+    </w:p>
+    <w:p>
+      <w:pPr/>
+      <w:r>
         <w:t>Cordon, J. A. (2026). Temporal evolution of predictive heat maps for Periplaneta americana infestation in urban sanitation networks (April 7 - June 23, 2022). Zenodo. https://doi.org/10.5281/zenodo.18186918</w:t>
       </w:r>
     </w:p>
     <w:p>
-      <w:pPr>
-        <w:spacing w:line="360" w:lineRule="auto"/>
-        <w:ind w:left="360" w:hanging="360"/>
-        <w:rPr>
-          <w:rFonts w:ascii="Times New Roman" w:hAnsi="Times New Roman" w:cs="Times New Roman"/>
-          <w:sz w:val="24"/>
-          <w:szCs w:val="24"/>
-        </w:rPr>
-      </w:pPr>
+      <w:pPr/>
       <w:r>
-        <w:rPr>
-          <w:rFonts w:ascii="Times New Roman" w:hAnsi="Times New Roman" w:cs="Times New Roman"/>
-          <w:sz w:val="24"/>
-          <w:szCs w:val="24"/>
-        </w:rPr>
         <w:t>Dey, S., &amp; Roy, S. (2025). Digital Guardians: Revolutionizing pest management with AI and IoT for a greener future. In IoT and advanced intelligence computation for smart agriculture. CRC Press. https://doi.org/10.1201/9781003527664-5</w:t>
       </w:r>
     </w:p>
     <w:p>
-      <w:pPr>
-        <w:spacing w:line="360" w:lineRule="auto"/>
-        <w:ind w:left="360" w:hanging="360"/>
-        <w:rPr>
-          <w:rFonts w:ascii="Times New Roman" w:hAnsi="Times New Roman" w:cs="Times New Roman"/>
-          <w:sz w:val="24"/>
-          <w:szCs w:val="24"/>
-        </w:rPr>
-      </w:pPr>
+      <w:pPr/>
       <w:r>
-        <w:rPr>
-          <w:rFonts w:ascii="Times New Roman" w:hAnsi="Times New Roman" w:cs="Times New Roman"/>
-          <w:sz w:val="24"/>
-          <w:szCs w:val="24"/>
-        </w:rPr>
+        <w:t>Ejike, O., Ndzi, D., &amp; Shakir, M. Z. (2025). Comparative study of machine learning-based rainfall prediction in tropical and temperate climates. Climate, 13(8), 167. https://doi.org/10.3390/cli13080167</w:t>
+      </w:r>
+    </w:p>
+    <w:p>
+      <w:pPr/>
+      <w:r>
         <w:t>Erguler, K., et al. (2024). VEClim: An early warning decision support system for climate-sensitive vector activity and vector-borne disease risk assessment. Wellcome Open Research, 9, 697. https://doi.org/10.12688/wellcomeopenres.23122.1</w:t>
       </w:r>
     </w:p>
     <w:p>
-      <w:pPr>
-        <w:spacing w:line="360" w:lineRule="auto"/>
-        <w:ind w:left="360" w:hanging="360"/>
-        <w:rPr>
-          <w:rFonts w:ascii="Times New Roman" w:hAnsi="Times New Roman" w:cs="Times New Roman"/>
-          <w:sz w:val="24"/>
-          <w:szCs w:val="24"/>
-        </w:rPr>
-      </w:pPr>
+      <w:pPr/>
       <w:r>
-        <w:rPr>
-          <w:rFonts w:ascii="Times New Roman" w:hAnsi="Times New Roman" w:cs="Times New Roman"/>
-          <w:sz w:val="24"/>
-          <w:szCs w:val="24"/>
-        </w:rPr>
-        <w:lastRenderedPageBreak/>
+        <w:t>Fiori, M., Fois, G., Gerardi, M. S., Maggio, F., Milesi, C., &amp; Pinna, A. (2024). SMARTerra, a high-resolution decision support system for monitoring plant pests and diseases. Applied Sciences, 14(18), 8275. https://doi.org/10.3390/app14188275</w:t>
+      </w:r>
+    </w:p>
+    <w:p>
+      <w:pPr/>
+      <w:r>
+        <w:t>Fu, Q., Nicholson, G. L., &amp; Easton, J. M. (2024). Understanding data quality in a data-driven industry context: Insights from the fundamentals. Journal of Industrial Information Integration, 42, 100729. https://doi.org/10.1016/j.jii.2024.100729</w:t>
+      </w:r>
+    </w:p>
+    <w:p>
+      <w:pPr/>
+      <w:r>
         <w:t>Google Calendar. (2026). Google Calendar API overview. https://developers.google.com/workspace/calendar/api/guides/overview</w:t>
       </w:r>
     </w:p>
     <w:p>
-      <w:pPr>
-        <w:spacing w:line="360" w:lineRule="auto"/>
-        <w:ind w:left="360" w:hanging="360"/>
-        <w:rPr>
-          <w:rFonts w:ascii="Times New Roman" w:hAnsi="Times New Roman" w:cs="Times New Roman"/>
-          <w:sz w:val="24"/>
-          <w:szCs w:val="24"/>
-        </w:rPr>
-      </w:pPr>
+      <w:pPr/>
       <w:r>
-        <w:rPr>
-          <w:rFonts w:ascii="Times New Roman" w:hAnsi="Times New Roman" w:cs="Times New Roman"/>
-          <w:sz w:val="24"/>
-          <w:szCs w:val="24"/>
-        </w:rPr>
         <w:t>Google Calendar. (2026). Events: list. https://developers.google.com/workspace/calendar/api/v3/reference/events/list</w:t>
       </w:r>
     </w:p>
     <w:p>
-      <w:pPr>
-        <w:spacing w:line="360" w:lineRule="auto"/>
-        <w:ind w:left="360" w:hanging="360"/>
-        <w:rPr>
-          <w:rFonts w:ascii="Times New Roman" w:hAnsi="Times New Roman" w:cs="Times New Roman"/>
-          <w:sz w:val="24"/>
-          <w:szCs w:val="24"/>
-        </w:rPr>
-      </w:pPr>
+      <w:pPr/>
       <w:r>
-        <w:rPr>
-          <w:rFonts w:ascii="Times New Roman" w:hAnsi="Times New Roman" w:cs="Times New Roman"/>
-          <w:sz w:val="24"/>
-          <w:szCs w:val="24"/>
-        </w:rPr>
         <w:t>Google Cloud. (2026). BigQuery documentation. https://cloud.google.com/bigquery/docs</w:t>
       </w:r>
     </w:p>
     <w:p>
-      <w:pPr>
-        <w:spacing w:line="360" w:lineRule="auto"/>
-        <w:ind w:left="360" w:hanging="360"/>
-        <w:rPr>
-          <w:rFonts w:ascii="Times New Roman" w:hAnsi="Times New Roman" w:cs="Times New Roman"/>
-          <w:sz w:val="24"/>
-          <w:szCs w:val="24"/>
-        </w:rPr>
-      </w:pPr>
+      <w:pPr/>
       <w:r>
-        <w:rPr>
-          <w:rFonts w:ascii="Times New Roman" w:hAnsi="Times New Roman" w:cs="Times New Roman"/>
-          <w:sz w:val="24"/>
-          <w:szCs w:val="24"/>
-        </w:rPr>
         <w:t>Google Cloud. (2026). Introduction to BigQuery. https://cloud.google.com/bigquery/docs/introduction</w:t>
       </w:r>
     </w:p>
     <w:p>
-      <w:pPr>
-        <w:spacing w:line="360" w:lineRule="auto"/>
-        <w:ind w:left="360" w:hanging="360"/>
-        <w:rPr>
-          <w:rFonts w:ascii="Times New Roman" w:hAnsi="Times New Roman" w:cs="Times New Roman"/>
-          <w:sz w:val="24"/>
-          <w:szCs w:val="24"/>
-        </w:rPr>
-      </w:pPr>
+      <w:pPr/>
       <w:r>
-        <w:rPr>
-          <w:rFonts w:ascii="Times New Roman" w:hAnsi="Times New Roman" w:cs="Times New Roman"/>
-          <w:sz w:val="24"/>
-          <w:szCs w:val="24"/>
-        </w:rPr>
         <w:t>Gurcan, F., Ayaz, A., Menekse Dalveren, G. G., &amp; Derawi, M. (2023). Business intelligence strategies, best practices, and latest trends: Analysis of scientometric data from 2003 to 2023 using machine learning. Sustainability, 15(13), 9854. https://doi.org/10.3390/su15139854</w:t>
       </w:r>
     </w:p>
     <w:p>
-      <w:pPr>
-        <w:spacing w:line="360" w:lineRule="auto"/>
-        <w:ind w:left="360" w:hanging="360"/>
-        <w:rPr>
-          <w:rFonts w:ascii="Times New Roman" w:hAnsi="Times New Roman" w:cs="Times New Roman"/>
-          <w:sz w:val="24"/>
-          <w:szCs w:val="24"/>
-        </w:rPr>
-      </w:pPr>
+      <w:pPr/>
       <w:r>
-        <w:rPr>
-          <w:rFonts w:ascii="Times New Roman" w:hAnsi="Times New Roman" w:cs="Times New Roman"/>
-          <w:sz w:val="24"/>
-          <w:szCs w:val="24"/>
-        </w:rPr>
         <w:t>Hiscox, A., Spencer, F., Dennehy, J., Dyall, W., Jenkins, A., Narendran, A., Das, A., Logan, J. G., &amp; Jones, R. T. (2025). The impact of adverse weather events on cockroaches and flies, and the possible effects on disease. Medical and Veterinary Entomology, 39(3), 500-514. https://doi.org/10.1111/mve.12797</w:t>
       </w:r>
     </w:p>
     <w:p>
-      <w:pPr>
-        <w:spacing w:line="360" w:lineRule="auto"/>
-        <w:ind w:left="360" w:hanging="360"/>
-        <w:rPr>
-          <w:rFonts w:ascii="Times New Roman" w:hAnsi="Times New Roman" w:cs="Times New Roman"/>
-          <w:sz w:val="24"/>
-          <w:szCs w:val="24"/>
-        </w:rPr>
-      </w:pPr>
+      <w:pPr/>
       <w:r>
-        <w:rPr>
-          <w:rFonts w:ascii="Times New Roman" w:hAnsi="Times New Roman" w:cs="Times New Roman"/>
-          <w:sz w:val="24"/>
-          <w:szCs w:val="24"/>
-        </w:rPr>
         <w:t>Kaloudis, E., Agrafioti, P., Sakka, M. K., &amp; Lampiri, E. (2026). A temperature-driven population dynamics model based on biweekly insect trap counts for stored-product pest management. Preprints. https://www.preprints.org/manuscript/202603.0573</w:t>
       </w:r>
     </w:p>
     <w:p>
-      <w:pPr>
-        <w:spacing w:line="360" w:lineRule="auto"/>
-        <w:ind w:left="360" w:hanging="360"/>
-        <w:rPr>
-          <w:rFonts w:ascii="Times New Roman" w:hAnsi="Times New Roman" w:cs="Times New Roman"/>
-          <w:sz w:val="24"/>
-          <w:szCs w:val="24"/>
-        </w:rPr>
-      </w:pPr>
+      <w:pPr/>
       <w:r>
-        <w:rPr>
-          <w:rFonts w:ascii="Times New Roman" w:hAnsi="Times New Roman" w:cs="Times New Roman"/>
-          <w:sz w:val="24"/>
-          <w:szCs w:val="24"/>
-        </w:rPr>
+        <w:t>Leybourne, D. J., Musa, N., &amp; Yang, P. (2025). Can artificial intelligence be integrated into pest monitoring schemes to help achieve sustainable agriculture? An entomological, management and computational perspective. Agricultural and Forest Entomology, 27(1), 8-17. https://doi.org/10.1111/afe.12630</w:t>
+      </w:r>
+    </w:p>
+    <w:p>
+      <w:pPr/>
+      <w:r>
         <w:t>Li, W., Dodwell, E., &amp; Cook, D. (2023). A clustering algorithm to organize satellite hotspot data for the purpose of tracking bushfires remotely. The R Journal, 15(1), 17-33. https://journal.r-project.org/articles/RJ-2023-022/</w:t>
       </w:r>
     </w:p>
     <w:p>
-      <w:pPr>
-        <w:spacing w:line="360" w:lineRule="auto"/>
-        <w:ind w:left="360" w:hanging="360"/>
-        <w:rPr>
-          <w:rFonts w:ascii="Times New Roman" w:hAnsi="Times New Roman" w:cs="Times New Roman"/>
-          <w:sz w:val="24"/>
-          <w:szCs w:val="24"/>
-        </w:rPr>
-      </w:pPr>
+      <w:pPr/>
       <w:r>
-        <w:rPr>
-          <w:rFonts w:ascii="Times New Roman" w:hAnsi="Times New Roman" w:cs="Times New Roman"/>
-          <w:sz w:val="24"/>
-          <w:szCs w:val="24"/>
-        </w:rPr>
         <w:t>Lu, X., Wijayaratna, K., Huang, Y., &amp; Qiu, A. (2022). AI-enabled opportunities and transformation challenges for SMEs in the post-pandemic era: A review and research agenda. Frontiers in Public Health, 10, 885067. https://doi.org/10.3389/fpubh.2022.885067</w:t>
       </w:r>
     </w:p>
     <w:p>
-      <w:pPr>
-        <w:spacing w:line="360" w:lineRule="auto"/>
-        <w:ind w:left="360" w:hanging="360"/>
-        <w:rPr>
-          <w:rFonts w:ascii="Times New Roman" w:hAnsi="Times New Roman" w:cs="Times New Roman"/>
-          <w:sz w:val="24"/>
-          <w:szCs w:val="24"/>
-        </w:rPr>
-      </w:pPr>
+      <w:pPr/>
       <w:r>
-        <w:rPr>
-          <w:rFonts w:ascii="Times New Roman" w:hAnsi="Times New Roman" w:cs="Times New Roman"/>
-          <w:sz w:val="24"/>
-          <w:szCs w:val="24"/>
-        </w:rPr>
         <w:t>Malaysia OpenAPI. (2026). Weather: Malaysia official Open API. https://developer.data.gov.my/realtime-api/weather</w:t>
       </w:r>
     </w:p>
     <w:p>
-      <w:pPr>
-        <w:spacing w:line="360" w:lineRule="auto"/>
-        <w:ind w:left="360" w:hanging="360"/>
-        <w:rPr>
-          <w:rFonts w:ascii="Times New Roman" w:hAnsi="Times New Roman" w:cs="Times New Roman"/>
-          <w:sz w:val="24"/>
-          <w:szCs w:val="24"/>
-        </w:rPr>
-      </w:pPr>
+      <w:pPr/>
       <w:r>
-        <w:rPr>
-          <w:rFonts w:ascii="Times New Roman" w:hAnsi="Times New Roman" w:cs="Times New Roman"/>
-          <w:sz w:val="24"/>
-          <w:szCs w:val="24"/>
-        </w:rPr>
         <w:t>Malaysian Meteorological Department. (2026). Web Service API. https://api.met.gov.my/</w:t>
       </w:r>
     </w:p>
     <w:p>
-      <w:pPr>
-        <w:spacing w:line="360" w:lineRule="auto"/>
-        <w:ind w:left="360" w:hanging="360"/>
-        <w:rPr>
-          <w:rFonts w:ascii="Times New Roman" w:hAnsi="Times New Roman" w:cs="Times New Roman"/>
-          <w:sz w:val="24"/>
-          <w:szCs w:val="24"/>
-        </w:rPr>
-      </w:pPr>
+      <w:pPr/>
       <w:r>
-        <w:rPr>
-          <w:rFonts w:ascii="Times New Roman" w:hAnsi="Times New Roman" w:cs="Times New Roman"/>
-          <w:sz w:val="24"/>
-          <w:szCs w:val="24"/>
-        </w:rPr>
+        <w:t>Marinko, J., Blazica, B., Jorgensen, L. N., Matzen, N., Ramsden, M., &amp; Debeljak, M. (2024). Typology for decision support systems in integrated pest management and its implementation as a web application. Agronomy, 14(3), 485. https://doi.org/10.3390/agronomy14030485</w:t>
+      </w:r>
+    </w:p>
+    <w:p>
+      <w:pPr/>
+      <w:r>
+        <w:t>Marinko, J., Kuzmanovski, V., Ramsden, M., &amp; Debeljak, M. (2025). Overcoming barriers to the adoption of decision support systems in integrated pest management in some European countries. Agronomy, 15(2), 426. https://doi.org/10.3390/agronomy15020426</w:t>
+      </w:r>
+    </w:p>
+    <w:p>
+      <w:pPr/>
+      <w:r>
         <w:t>Open-Meteo. (2026). Historical Weather API. https://open-meteo.com/en/docs/historical-weather-api</w:t>
       </w:r>
     </w:p>
     <w:p>
-      <w:pPr>
-        <w:spacing w:line="360" w:lineRule="auto"/>
-        <w:ind w:left="360" w:hanging="360"/>
-        <w:rPr>
-          <w:rFonts w:ascii="Times New Roman" w:hAnsi="Times New Roman" w:cs="Times New Roman"/>
-          <w:sz w:val="24"/>
-          <w:szCs w:val="24"/>
-        </w:rPr>
-      </w:pPr>
+      <w:pPr/>
       <w:r>
-        <w:rPr>
-          <w:rFonts w:ascii="Times New Roman" w:hAnsi="Times New Roman" w:cs="Times New Roman"/>
-          <w:sz w:val="24"/>
-          <w:szCs w:val="24"/>
-        </w:rPr>
-        <w:lastRenderedPageBreak/>
         <w:t>Open-Meteo. (2026). Licence and data sources. https://open-meteo.com/en/licence</w:t>
       </w:r>
     </w:p>
     <w:p>
-      <w:pPr>
-        <w:spacing w:line="360" w:lineRule="auto"/>
-        <w:ind w:left="360" w:hanging="360"/>
-        <w:rPr>
-          <w:rFonts w:ascii="Times New Roman" w:hAnsi="Times New Roman" w:cs="Times New Roman"/>
-          <w:sz w:val="24"/>
-          <w:szCs w:val="24"/>
-        </w:rPr>
-      </w:pPr>
+      <w:pPr/>
       <w:r>
-        <w:rPr>
-          <w:rFonts w:ascii="Times New Roman" w:hAnsi="Times New Roman" w:cs="Times New Roman"/>
-          <w:sz w:val="24"/>
-          <w:szCs w:val="24"/>
-        </w:rPr>
         <w:t>Pinto, A. F., Olmstead, D., Calixto, A. A., &amp; Gomez, M. I. (2025). Network for Environment and Weather Applications: An overview of the digital pest management decision support tool. Applied Economics Teaching Resources. https://www.aetrjournal.org/UserFiles/file/AETR_2025_0218%20Final.pdf</w:t>
       </w:r>
     </w:p>
     <w:p>
-      <w:pPr>
-        <w:spacing w:line="360" w:lineRule="auto"/>
-        <w:ind w:left="360" w:hanging="360"/>
-        <w:rPr>
-          <w:rFonts w:ascii="Times New Roman" w:hAnsi="Times New Roman" w:cs="Times New Roman"/>
-          <w:sz w:val="24"/>
-          <w:szCs w:val="24"/>
-        </w:rPr>
-      </w:pPr>
+      <w:pPr/>
       <w:r>
-        <w:rPr>
-          <w:rFonts w:ascii="Times New Roman" w:hAnsi="Times New Roman" w:cs="Times New Roman"/>
-          <w:sz w:val="24"/>
-          <w:szCs w:val="24"/>
-        </w:rPr>
         <w:t>Ragazou, K., Passas, I., Garefalakis, A., &amp; Zopounidis, C. (2023). Business intelligence model empowering SMEs to make better decisions and enhance their competitive advantage. Discover Analytics, 1, 2. https://doi.org/10.1007/s44257-022-00002-3</w:t>
       </w:r>
     </w:p>
     <w:p>
-      <w:pPr>
-        <w:spacing w:line="360" w:lineRule="auto"/>
-        <w:ind w:left="360" w:hanging="360"/>
-        <w:rPr>
-          <w:rFonts w:ascii="Times New Roman" w:hAnsi="Times New Roman" w:cs="Times New Roman"/>
-          <w:sz w:val="24"/>
-          <w:szCs w:val="24"/>
-        </w:rPr>
-      </w:pPr>
+      <w:pPr/>
       <w:r>
-        <w:rPr>
-          <w:rFonts w:ascii="Times New Roman" w:hAnsi="Times New Roman" w:cs="Times New Roman"/>
-          <w:sz w:val="24"/>
-          <w:szCs w:val="24"/>
-        </w:rPr>
         <w:t>Richardson, J. L., McCoy, E. P., Parlavecchio, N., et al. (2025). Increasing rat numbers in cities are linked to climate warming, urbanization, and human population. Science Advances, 11(5), eads6782. https://doi.org/10.1126/sciadv.ads6782</w:t>
       </w:r>
     </w:p>
     <w:p>
-      <w:pPr>
-        <w:spacing w:line="360" w:lineRule="auto"/>
-        <w:ind w:left="360" w:hanging="360"/>
-        <w:rPr>
-          <w:rFonts w:ascii="Times New Roman" w:hAnsi="Times New Roman" w:cs="Times New Roman"/>
-          <w:sz w:val="24"/>
-          <w:szCs w:val="24"/>
-        </w:rPr>
-      </w:pPr>
+      <w:pPr/>
       <w:r>
-        <w:rPr>
-          <w:rFonts w:ascii="Times New Roman" w:hAnsi="Times New Roman" w:cs="Times New Roman"/>
-          <w:sz w:val="24"/>
-          <w:szCs w:val="24"/>
-        </w:rPr>
-        <w:t xml:space="preserve">Sumido, E. C., Feliscuzo, L. S., &amp; Aliac, C. J. G. (2023). Pest classification and prediction: Analyzing the impact of weather </w:t>
-      </w:r>
-      <w:proofErr w:type="gramStart"/>
-      <w:r>
-        <w:rPr>
-          <w:rFonts w:ascii="Times New Roman" w:hAnsi="Times New Roman" w:cs="Times New Roman"/>
-          <w:sz w:val="24"/>
-          <w:szCs w:val="24"/>
-        </w:rPr>
-        <w:t>to</w:t>
-      </w:r>
-      <w:proofErr w:type="gramEnd"/>
-      <w:r>
-        <w:rPr>
-          <w:rFonts w:ascii="Times New Roman" w:hAnsi="Times New Roman" w:cs="Times New Roman"/>
-          <w:sz w:val="24"/>
-          <w:szCs w:val="24"/>
-        </w:rPr>
-        <w:t xml:space="preserve"> pest occurrence through machine learning. Journal of Engineering Science and Technology, 18, 124-138.</w:t>
+        <w:t>Schulze, A., Brand, F., Geppert, J., &amp; Bol, G.-F. (2023). Digital dashboards visualizing public health data: A systematic review. Frontiers in Public Health, 11, 999958. https://doi.org/10.3389/fpubh.2023.999958</w:t>
       </w:r>
     </w:p>
     <w:p>
-      <w:pPr>
-        <w:spacing w:line="360" w:lineRule="auto"/>
-        <w:ind w:left="360" w:hanging="360"/>
-        <w:rPr>
-          <w:rFonts w:ascii="Times New Roman" w:hAnsi="Times New Roman" w:cs="Times New Roman"/>
-          <w:sz w:val="24"/>
-          <w:szCs w:val="24"/>
-        </w:rPr>
-      </w:pPr>
+      <w:pPr/>
       <w:r>
-        <w:rPr>
-          <w:rFonts w:ascii="Times New Roman" w:hAnsi="Times New Roman" w:cs="Times New Roman"/>
-          <w:sz w:val="24"/>
-          <w:szCs w:val="24"/>
-        </w:rPr>
+        <w:t>Sumido, E. C., Feliscuzo, L. S., &amp; Aliac, C. J. G. (2023). Pest classification and prediction: Analyzing the impact of weather to pest occurrence through machine learning. Journal of Engineering Science and Technology, 18, 124-138.</w:t>
+      </w:r>
+    </w:p>
+    <w:p>
+      <w:pPr/>
+      <w:r>
+        <w:t>Tonle, F. B. N., Niassy, S., Ndadji, M. M. Z., Tchendji, M. T., Nzeukou, A., Mudereri, B. T., Senagi, K., &amp; Tonnang, H. E. Z. (2024). A road map for developing novel decision support system (DSS) for disseminating integrated pest management (IPM) technologies. Computers and Electronics in Agriculture, 217, 108526. https://doi.org/10.1016/j.compag.2023.108526</w:t>
+      </w:r>
+    </w:p>
+    <w:p>
+      <w:pPr/>
+      <w:r>
         <w:t>Yao, J., Zhou, Z., Liu, H., Yao, S., &amp; Wu, J. (2026). Analyzing the influence of environment, demographic and socio-economic factors on Aedes albopictus (Diptera: Culicidae) mosquito density at the micro-level using XGBoost and SHAP. Parasites &amp; Vectors, 19, 71. https://doi.org/10.1186/s13071-025-07220-0</w:t>
       </w:r>
     </w:p>
     <w:p>
-      <w:pPr>
-        <w:spacing w:line="360" w:lineRule="auto"/>
-        <w:ind w:left="360" w:hanging="360"/>
-        <w:rPr>
-          <w:rFonts w:ascii="Times New Roman" w:hAnsi="Times New Roman" w:cs="Times New Roman"/>
-          <w:sz w:val="24"/>
-          <w:szCs w:val="24"/>
-        </w:rPr>
-      </w:pPr>
+      <w:pPr/>
       <w:r>
-        <w:rPr>
-          <w:rFonts w:ascii="Times New Roman" w:hAnsi="Times New Roman" w:cs="Times New Roman"/>
-          <w:sz w:val="24"/>
-          <w:szCs w:val="24"/>
-        </w:rPr>
         <w:t>Zippenfenig, P. (2023). Open-Meteo.com Weather API [Computer software]. Zenodo. https://doi.org/10.5281/zenodo.7970649</w:t>
       </w:r>
     </w:p>

</xml_diff>

<commit_message>
Finalize proposal reference cleanup state
</commit_message>
<xml_diff>
--- a/docs/Nomobug_Capstone_Proposal_CP1_Updated.docx
+++ b/docs/Nomobug_Capstone_Proposal_CP1_Updated.docx
@@ -2252,7 +2252,11 @@
         </w:rPr>
       </w:pPr>
       <w:r>
-        <w:t>This literature review reviews recent academic papers, technical documentation, and decision-support references related to the proposed system. In line with supervisor feedback, the cited literature focuses on 2020 onwards and expands the review to cover approximately 25 academic or research-based sources, with separate technical references for APIs and tools. Older foundation methods such as DBSCAN, logistic regression, KDE, and SHAP are discussed only as methodological concepts, while the cited support is drawn from recent studies and documentation. The chapter is organised around business intelligence for SMEs, weather-aware pest management, digital pest decision-support systems, spatial-temporal hotspot detection, weather-based prediction, explainable modelling, and AI-assisted recommendations.</w:t>
+        <w:t xml:space="preserve">This literature review reviews recent academic papers, technical documentation, and decision-support references related to the proposed system. In line with supervisor feedback, the cited literature focuses on 2020 onwards and expands the review to cover approximately 25 academic or </w:t>
+      </w:r>
+      <w:r>
+        <w:lastRenderedPageBreak/>
+        <w:t>research-based sources, with separate technical references for APIs and tools. Older foundation methods such as DBSCAN, logistic regression, KDE, and SHAP are discussed only as methodological concepts, while the cited support is drawn from recent studies and documentation. The chapter is organised around business intelligence for SMEs, weather-aware pest management, digital pest decision-support systems, spatial-temporal hotspot detection, weather-based prediction, explainable modelling, and AI-assisted recommendations.</w:t>
       </w:r>
     </w:p>
     <w:p>
@@ -2342,15 +2346,87 @@
       </w:r>
     </w:p>
     <w:p>
-      <w:pPr/>
+      <w:pPr>
+        <w:spacing w:line="360" w:lineRule="auto"/>
+        <w:jc w:val="both"/>
+        <w:rPr>
+          <w:rFonts w:ascii="Times New Roman" w:hAnsi="Times New Roman" w:cs="Times New Roman"/>
+          <w:sz w:val="24"/>
+          <w:szCs w:val="24"/>
+        </w:rPr>
+      </w:pPr>
       <w:r>
-        <w:t>Schulze et al. (2023) provide a systematic review of digital dashboards and show that dashboards are most useful when they combine clear visual design, reliable data, and action-oriented communication. This supports the proposed use of Apache Superset dashboards for management users who need to scan key service, warranty, payment, and scheduling indicators quickly. Blacketer et al. (2021) further demonstrate the value of a dedicated data quality dashboard, showing that decision-makers need visibility into completeness, conformance, and data reliability before trusting analytical outputs. For Nomobug, this supports including a Data Quality and Refresh module rather than treating cleaning as a hidden technical step.</w:t>
+        <w:rPr>
+          <w:rFonts w:ascii="Times New Roman" w:hAnsi="Times New Roman" w:cs="Times New Roman"/>
+          <w:sz w:val="24"/>
+          <w:szCs w:val="24"/>
+        </w:rPr>
+        <w:t>Schulze et al. (2023) provide a systematic review of digital dashboards and show that dashboards are most useful when they combine clear visual design, reliable data, and action-oriented communication. This supports the proposed use of Apache Superset dashboards for management users who need to scan key service, warranty, payment, and scheduling indicators quickly. Blacketer et al. (2021) further demonstrate the value of a dedicated data quality dashboard, showing that decision-makers need visibility into c</w:t>
+      </w:r>
+      <w:r>
+        <w:rPr>
+          <w:rFonts w:ascii="Times New Roman" w:hAnsi="Times New Roman" w:cs="Times New Roman"/>
+          <w:sz w:val="24"/>
+          <w:szCs w:val="24"/>
+        </w:rPr>
+        <w:t xml:space="preserve">ompleteness, conformance, and data reliability before trusting analytical outputs. For Nomobug, this </w:t>
+      </w:r>
+      <w:proofErr w:type="gramStart"/>
+      <w:r>
+        <w:rPr>
+          <w:rFonts w:ascii="Times New Roman" w:hAnsi="Times New Roman" w:cs="Times New Roman"/>
+          <w:sz w:val="24"/>
+          <w:szCs w:val="24"/>
+        </w:rPr>
+        <w:t>supports including</w:t>
+      </w:r>
+      <w:proofErr w:type="gramEnd"/>
+      <w:r>
+        <w:rPr>
+          <w:rFonts w:ascii="Times New Roman" w:hAnsi="Times New Roman" w:cs="Times New Roman"/>
+          <w:sz w:val="24"/>
+          <w:szCs w:val="24"/>
+        </w:rPr>
+        <w:t xml:space="preserve"> a Data Quality and Refresh module rather than treating cleaning as a hidden technical step.</w:t>
       </w:r>
     </w:p>
     <w:p>
-      <w:pPr/>
+      <w:pPr>
+        <w:spacing w:line="360" w:lineRule="auto"/>
+        <w:jc w:val="both"/>
+        <w:rPr>
+          <w:rFonts w:ascii="Times New Roman" w:hAnsi="Times New Roman" w:cs="Times New Roman"/>
+          <w:sz w:val="24"/>
+          <w:szCs w:val="24"/>
+        </w:rPr>
+      </w:pPr>
+    </w:p>
+    <w:p>
+      <w:pPr>
+        <w:spacing w:line="360" w:lineRule="auto"/>
+        <w:jc w:val="both"/>
+        <w:rPr>
+          <w:rFonts w:ascii="Times New Roman" w:hAnsi="Times New Roman" w:cs="Times New Roman"/>
+          <w:sz w:val="24"/>
+          <w:szCs w:val="24"/>
+        </w:rPr>
+      </w:pPr>
       <w:r>
-        <w:t>Fu et al. (2024) argue that data quality in industry should be understood as part of a wider data-driven workflow, not only as a technical database issue. Their review is relevant because Nomobug's raw data comes from practical operational sources such as Google Sheets and Google Calendar, where inconsistent labels, missing identifiers, and unmatched records are expected. This reinforces the project's decision to preserve raw staging data, create cleaning flags, and show data-quality coverage before interpreting risk or performance results.</w:t>
+        <w:rPr>
+          <w:rFonts w:ascii="Times New Roman" w:hAnsi="Times New Roman" w:cs="Times New Roman"/>
+          <w:sz w:val="24"/>
+          <w:szCs w:val="24"/>
+        </w:rPr>
+        <w:t xml:space="preserve">Fu et al. (2024) argue that data quality in industry should be understood as part of a wider data-driven workflow, not only as a technical database issue. Their review is relevant because </w:t>
+      </w:r>
+      <w:r>
+        <w:rPr>
+          <w:rFonts w:ascii="Times New Roman" w:hAnsi="Times New Roman" w:cs="Times New Roman"/>
+          <w:sz w:val="24"/>
+          <w:szCs w:val="24"/>
+        </w:rPr>
+        <w:lastRenderedPageBreak/>
+        <w:t>Nomobug's raw data comes from practical operational sources such as Google Sheets and Google Calendar, where inconsistent labels, missing identifiers, and unmatched records are expected. This reinforces the project's decision to preserve raw staging data, create cleaning flags, and show data-quality coverage before interpreting risk or performance results.</w:t>
       </w:r>
     </w:p>
     <w:p>
@@ -2472,16 +2548,7 @@
           <w:sz w:val="24"/>
           <w:szCs w:val="24"/>
         </w:rPr>
-        <w:t xml:space="preserve"> that rat numbers are linked with climate warming, urbanization, and population density. While the study is not specific to Malaysian pest control service records, it demonstrates the importance of combining pest reports with environmental and urban context. Brimblecombe et al. (2023) </w:t>
-      </w:r>
-      <w:r>
-        <w:rPr>
-          <w:rFonts w:ascii="Times New Roman" w:hAnsi="Times New Roman" w:cs="Times New Roman"/>
-          <w:sz w:val="24"/>
-          <w:szCs w:val="24"/>
-        </w:rPr>
-        <w:lastRenderedPageBreak/>
-        <w:t>also show that urban pest enquiry databases can reveal long-term patterns, but such records are heterogeneous and may be affected by reporting bias. These studies justify using Nomobug's internal service outcomes carefully as business evidence rather than as universal ecological proof.</w:t>
+        <w:t xml:space="preserve"> that rat numbers are linked with climate warming, urbanization, and population density. While the study is not specific to Malaysian pest control service records, it demonstrates the importance of combining pest reports with environmental and urban context. Brimblecombe et al. (2023) also show that urban pest enquiry databases can reveal long-term patterns, but such records are heterogeneous and may be affected by reporting bias. These studies justify using Nomobug's internal service outcomes carefully as business evidence rather than as universal ecological proof.</w:t>
       </w:r>
     </w:p>
     <w:p>
@@ -2567,19 +2634,134 @@
           <w:sz w:val="24"/>
           <w:szCs w:val="24"/>
         </w:rPr>
-        <w:t>The research gap is that most pest decision-support examples focus on agriculture or public-sector surveillance, while SME pest control operations need analytics around customer service outcomes, warranty costs, technician review indicators, and upsell planning. This project therefore contributes by applying weather-aware decision support to a real commercial service dataset rather than only biological pest observations.</w:t>
+        <w:t xml:space="preserve">The research gap is that most pest decision-support examples focus on agriculture or public-sector surveillance, while SME pest control operations need analytics around customer service </w:t>
+      </w:r>
+      <w:r>
+        <w:rPr>
+          <w:rFonts w:ascii="Times New Roman" w:hAnsi="Times New Roman" w:cs="Times New Roman"/>
+          <w:sz w:val="24"/>
+          <w:szCs w:val="24"/>
+        </w:rPr>
+        <w:lastRenderedPageBreak/>
+        <w:t>outcomes, warranty costs, technician review indicators, and upsell planning. This project therefore contributes by applying weather-aware decision support to a real commercial service dataset rather than only biological pest observations.</w:t>
       </w:r>
     </w:p>
     <w:p>
-      <w:pPr/>
+      <w:pPr>
+        <w:spacing w:line="360" w:lineRule="auto"/>
+        <w:jc w:val="both"/>
+        <w:rPr>
+          <w:rFonts w:ascii="Times New Roman" w:hAnsi="Times New Roman" w:cs="Times New Roman"/>
+          <w:sz w:val="24"/>
+          <w:szCs w:val="24"/>
+        </w:rPr>
+      </w:pPr>
       <w:r>
-        <w:t>Tonle et al. (2024) propose a roadmap for developing decision support systems for integrated pest management and highlight the need for practical architectures that connect data sources, models, and user-facing decision outputs. Although their focus is agricultural IPM, the architecture principle is highly relevant to this project because the Nomobug system will connect operational data, weather enrichment, analytics marts, and dashboard recommendations. Marinko et al. (2024) also develop a typology for IPM decision support systems and implement it as a web application, showing that DSS features must be classified clearly so users understand whether the system provides monitoring, prediction, recommendation, or advisory support.</w:t>
+        <w:rPr>
+          <w:rFonts w:ascii="Times New Roman" w:hAnsi="Times New Roman" w:cs="Times New Roman"/>
+          <w:sz w:val="24"/>
+          <w:szCs w:val="24"/>
+        </w:rPr>
+        <w:t xml:space="preserve">Tonle et al. (2024) </w:t>
+      </w:r>
+      <w:proofErr w:type="gramStart"/>
+      <w:r>
+        <w:rPr>
+          <w:rFonts w:ascii="Times New Roman" w:hAnsi="Times New Roman" w:cs="Times New Roman"/>
+          <w:sz w:val="24"/>
+          <w:szCs w:val="24"/>
+        </w:rPr>
+        <w:t>propose</w:t>
+      </w:r>
+      <w:proofErr w:type="gramEnd"/>
+      <w:r>
+        <w:rPr>
+          <w:rFonts w:ascii="Times New Roman" w:hAnsi="Times New Roman" w:cs="Times New Roman"/>
+          <w:sz w:val="24"/>
+          <w:szCs w:val="24"/>
+        </w:rPr>
+        <w:t xml:space="preserve"> a roadmap for developing decision support systems for integrated pest management and </w:t>
+      </w:r>
+      <w:proofErr w:type="gramStart"/>
+      <w:r>
+        <w:rPr>
+          <w:rFonts w:ascii="Times New Roman" w:hAnsi="Times New Roman" w:cs="Times New Roman"/>
+          <w:sz w:val="24"/>
+          <w:szCs w:val="24"/>
+        </w:rPr>
+        <w:t>highlight</w:t>
+      </w:r>
+      <w:proofErr w:type="gramEnd"/>
+      <w:r>
+        <w:rPr>
+          <w:rFonts w:ascii="Times New Roman" w:hAnsi="Times New Roman" w:cs="Times New Roman"/>
+          <w:sz w:val="24"/>
+          <w:szCs w:val="24"/>
+        </w:rPr>
+        <w:t xml:space="preserve"> the need for practical architectures that connect data sources, models, and user-facing decision outputs. Although their focus is agricultural IPM, the architecture principle is highly relevant to this project because the Nomobug system will connect operational data, weather enrichment, analytics marts, and dashboard recommendations. Marinko et al. (2024) also develop a typology for IPM decision support sy</w:t>
+      </w:r>
+      <w:r>
+        <w:rPr>
+          <w:rFonts w:ascii="Times New Roman" w:hAnsi="Times New Roman" w:cs="Times New Roman"/>
+          <w:sz w:val="24"/>
+          <w:szCs w:val="24"/>
+        </w:rPr>
+        <w:t>stems and implement it as a web application, showing that DSS features must be classified clearly so users understand whether the system provides monitoring, prediction, recommendation, or advisory support.</w:t>
       </w:r>
     </w:p>
     <w:p>
-      <w:pPr/>
+      <w:pPr>
+        <w:spacing w:line="360" w:lineRule="auto"/>
+        <w:rPr>
+          <w:rFonts w:ascii="Times New Roman" w:hAnsi="Times New Roman" w:cs="Times New Roman"/>
+          <w:sz w:val="24"/>
+          <w:szCs w:val="24"/>
+        </w:rPr>
+      </w:pPr>
+    </w:p>
+    <w:p>
+      <w:pPr>
+        <w:spacing w:line="360" w:lineRule="auto"/>
+        <w:jc w:val="both"/>
+        <w:rPr>
+          <w:rFonts w:ascii="Times New Roman" w:hAnsi="Times New Roman" w:cs="Times New Roman"/>
+          <w:sz w:val="24"/>
+          <w:szCs w:val="24"/>
+        </w:rPr>
+      </w:pPr>
       <w:r>
-        <w:t>Fiori et al. (2024) present SMARTerra, a high-resolution DSS for monitoring plant pests and diseases through risk maps and timely intervention support. This strengthens the justification for using weather-associated risk maps and area-level planning views in Nomobug. Marinko et al. (2025) examine barriers to DSS adoption in integrated pest management and show that practical uptake depends on trust, usability, data availability, and perceived usefulness. This is important for the capstone because the dashboard must be understandable to company users, not only technically impressive.</w:t>
+        <w:rPr>
+          <w:rFonts w:ascii="Times New Roman" w:hAnsi="Times New Roman" w:cs="Times New Roman"/>
+          <w:sz w:val="24"/>
+          <w:szCs w:val="24"/>
+        </w:rPr>
+        <w:t>Fiori et al. (2024) present SMARTerra, a high-resolution DSS for monitoring plant pests and diseases through risk maps and timely intervention support. This strengthens the justification for using weather-associated risk maps and area-level planning views in Nomobug. Marinko et al. (2025) examine barriers to DSS adoption in integrated pest management and show that practical uptake depends on trust, usability, data availability, and perceived usefulness. This is important for the capstone because the dashboa</w:t>
+      </w:r>
+      <w:r>
+        <w:rPr>
+          <w:rFonts w:ascii="Times New Roman" w:hAnsi="Times New Roman" w:cs="Times New Roman"/>
+          <w:sz w:val="24"/>
+          <w:szCs w:val="24"/>
+        </w:rPr>
+        <w:t xml:space="preserve">rd must be understandable to company users, </w:t>
+      </w:r>
+      <w:proofErr w:type="gramStart"/>
+      <w:r>
+        <w:rPr>
+          <w:rFonts w:ascii="Times New Roman" w:hAnsi="Times New Roman" w:cs="Times New Roman"/>
+          <w:sz w:val="24"/>
+          <w:szCs w:val="24"/>
+        </w:rPr>
+        <w:t>not only technically</w:t>
+      </w:r>
+      <w:proofErr w:type="gramEnd"/>
+      <w:r>
+        <w:rPr>
+          <w:rFonts w:ascii="Times New Roman" w:hAnsi="Times New Roman" w:cs="Times New Roman"/>
+          <w:sz w:val="24"/>
+          <w:szCs w:val="24"/>
+        </w:rPr>
+        <w:t xml:space="preserve"> impressive.</w:t>
       </w:r>
     </w:p>
     <w:p>
@@ -2647,13 +2829,54 @@
           <w:sz w:val="24"/>
           <w:szCs w:val="24"/>
         </w:rPr>
-        <w:t>KDE heatmaps complement clustering because they provide a smoother visual layer for dashboard users. In this project, DBSCAN will be used as the main clustering method for detecting candidate repeat-problem hotspots, while KDE-style heatmaps will be used mainly for visual interpretation. This keeps the method understandable for management while still providing a stronger spatial analysis contribution than a simple area-count table.</w:t>
+        <w:t xml:space="preserve">KDE heatmaps complement clustering because they provide a smoother visual layer for dashboard users. In this project, DBSCAN will be used as the main clustering method for detecting candidate repeat-problem hotspots, while KDE-style heatmaps will be used mainly </w:t>
+      </w:r>
+      <w:r>
+        <w:rPr>
+          <w:rFonts w:ascii="Times New Roman" w:hAnsi="Times New Roman" w:cs="Times New Roman"/>
+          <w:sz w:val="24"/>
+          <w:szCs w:val="24"/>
+        </w:rPr>
+        <w:lastRenderedPageBreak/>
+        <w:t>for visual interpretation. This keeps the method understandable for management while still providing a stronger spatial analysis contribution than a simple area-count table.</w:t>
       </w:r>
     </w:p>
     <w:p>
-      <w:pPr/>
+      <w:pPr>
+        <w:spacing w:line="360" w:lineRule="auto"/>
+        <w:jc w:val="both"/>
+        <w:rPr>
+          <w:rFonts w:ascii="Times New Roman" w:hAnsi="Times New Roman" w:cs="Times New Roman"/>
+          <w:sz w:val="24"/>
+          <w:szCs w:val="24"/>
+        </w:rPr>
+      </w:pPr>
+    </w:p>
+    <w:p>
+      <w:pPr>
+        <w:spacing w:line="360" w:lineRule="auto"/>
+        <w:jc w:val="both"/>
+        <w:rPr>
+          <w:rFonts w:ascii="Times New Roman" w:hAnsi="Times New Roman" w:cs="Times New Roman"/>
+          <w:sz w:val="24"/>
+          <w:szCs w:val="24"/>
+        </w:rPr>
+      </w:pPr>
       <w:r>
-        <w:t>Choi and Hong (2021) propose MDST-DBSCAN for multidimensional spatiotemporal data and show that density-based methods can identify clusters while supporting irregular cluster shapes and noise separation. This supports the choice of DBSCAN-style hotspot detection for repeat-problem and warranty records, because pest service outcomes may cluster around small local areas rather than fixed administrative boundaries. The proposed project will keep the method simpler than MDST-DBSCAN for implementation, but the study supports the suitability of density-based clustering for spatiotemporal analysis.</w:t>
+        <w:rPr>
+          <w:rFonts w:ascii="Times New Roman" w:hAnsi="Times New Roman" w:cs="Times New Roman"/>
+          <w:sz w:val="24"/>
+          <w:szCs w:val="24"/>
+        </w:rPr>
+        <w:t>Choi and Hong (2021) propose MDST-DBSCAN for multidimensional spatiotemporal data and show that density-based methods can identify clusters while supporting irregular cluster shapes and noise separation. This supports the choice of DBSCAN-style hotspot detection for repeat-problem and warranty records, because pest service outcomes may cluster around small local areas rather than fixed administrative boundaries. The proposed project will keep the method simpler than MDST-DBSCAN for implementation, but the s</w:t>
+      </w:r>
+      <w:r>
+        <w:rPr>
+          <w:rFonts w:ascii="Times New Roman" w:hAnsi="Times New Roman" w:cs="Times New Roman"/>
+          <w:sz w:val="24"/>
+          <w:szCs w:val="24"/>
+        </w:rPr>
+        <w:t>tudy supports the suitability of density-based clustering for spatiotemporal analysis.</w:t>
       </w:r>
     </w:p>
     <w:p>
@@ -2672,7 +2895,6 @@
           <w:sz w:val="24"/>
           <w:szCs w:val="24"/>
         </w:rPr>
-        <w:lastRenderedPageBreak/>
         <w:t>2.5 Weather-Based Prediction and Explainable Modelling</w:t>
       </w:r>
     </w:p>
@@ -2717,19 +2939,78 @@
         </w:rPr>
       </w:pPr>
       <w:r>
+        <w:rPr>
+          <w:rFonts w:ascii="Times New Roman" w:hAnsi="Times New Roman" w:cs="Times New Roman"/>
+          <w:sz w:val="24"/>
+          <w:szCs w:val="24"/>
+        </w:rPr>
         <w:t>This choice is methodologically important. Complex models such as random forests, XGBoost, or deep learning may appear advanced, but they can overfit small datasets and reduce explainability. Because the expected warranty data volume is modest, the project will position complex ML as optional or future work and will focus first on defensible analytics: day/week/month descriptive trends, recurrence windows, DBSCAN/KDE hotspots, weather lag indicators, and simple logistic regression only where the data is sufficient.</w:t>
       </w:r>
     </w:p>
     <w:p>
-      <w:pPr/>
+      <w:pPr>
+        <w:spacing w:line="360" w:lineRule="auto"/>
+        <w:jc w:val="both"/>
+        <w:rPr>
+          <w:rFonts w:ascii="Times New Roman" w:hAnsi="Times New Roman" w:cs="Times New Roman"/>
+          <w:sz w:val="28"/>
+          <w:szCs w:val="28"/>
+        </w:rPr>
+      </w:pPr>
+    </w:p>
+    <w:p>
+      <w:pPr>
+        <w:spacing w:line="360" w:lineRule="auto"/>
+        <w:jc w:val="both"/>
+        <w:rPr>
+          <w:rFonts w:ascii="Times New Roman" w:hAnsi="Times New Roman" w:cs="Times New Roman"/>
+          <w:sz w:val="24"/>
+          <w:szCs w:val="24"/>
+        </w:rPr>
+      </w:pPr>
       <w:r>
-        <w:t>Ejike et al. (2025) compare logistic regression and random forest models for rainfall prediction in tropical and temperate climates, including Alor Setar as a tropical site. Their study supports the use of weather variables such as humidity, pressure, temperature, and rainfall in predictive modelling, but it also shows why model choice should match the problem and data size. For Nomobug, logistic regression and lag-based weather features are more defensible than heavier models because the warranty dataset is expected to contain only around 200+ records.</w:t>
+        <w:rPr>
+          <w:rFonts w:ascii="Times New Roman" w:hAnsi="Times New Roman" w:cs="Times New Roman"/>
+          <w:sz w:val="24"/>
+          <w:szCs w:val="24"/>
+        </w:rPr>
+        <w:t xml:space="preserve">Ejike et al. (2025) compare logistic regression and random forest models for rainfall prediction in tropical and temperate climates, including Alor Setar as a tropical site. Their study supports the use of weather variables such as humidity, pressure, temperature, and rainfall in predictive modelling, but it also shows why model choice should match the problem and data size. For </w:t>
+      </w:r>
+      <w:r>
+        <w:rPr>
+          <w:rFonts w:ascii="Times New Roman" w:hAnsi="Times New Roman" w:cs="Times New Roman"/>
+          <w:sz w:val="24"/>
+          <w:szCs w:val="24"/>
+        </w:rPr>
+        <w:lastRenderedPageBreak/>
+        <w:t>Nomobug, logistic regression and lag-based weather features are more defensible than heavier models because the warranty dataset is expected to contain only around 200+ records.</w:t>
       </w:r>
     </w:p>
     <w:p>
-      <w:pPr/>
+      <w:pPr>
+        <w:spacing w:line="360" w:lineRule="auto"/>
+        <w:jc w:val="both"/>
+        <w:rPr>
+          <w:rFonts w:ascii="Times New Roman" w:hAnsi="Times New Roman" w:cs="Times New Roman"/>
+          <w:sz w:val="24"/>
+          <w:szCs w:val="24"/>
+        </w:rPr>
+      </w:pPr>
       <w:r>
-        <w:t>Yao et al. (2026) use XGBoost and SHAP to analyse environmental, demographic, and socio-economic factors associated with mosquito density. This demonstrates the value of explainability when environmental factors are used in pest-related modelling. However, the proposed Nomobug system will treat SHAP-style explanations as future work or optional model interpretation, because the first implementation should prioritise robust descriptive, spatial, and recurrence analytics over complex models that may overfit limited warranty data.</w:t>
+        <w:rPr>
+          <w:rFonts w:ascii="Times New Roman" w:hAnsi="Times New Roman" w:cs="Times New Roman"/>
+          <w:sz w:val="24"/>
+          <w:szCs w:val="24"/>
+        </w:rPr>
+        <w:t>Yao et al. (2026) use XGBoost and SHAP to analyse environmental, demographic, and socio-economic factors associated with mosquito density. This demonstrates the value of explainability when environmental factors are used in pest-related modelling. However, the proposed Nomobug system will treat SHAP-style explanations as future work or optional model interpretation, because the first implementation should prioritise robust descriptive, spatial, and recurrence analytics over complex models that may overfit l</w:t>
+      </w:r>
+      <w:r>
+        <w:rPr>
+          <w:rFonts w:ascii="Times New Roman" w:hAnsi="Times New Roman" w:cs="Times New Roman"/>
+          <w:sz w:val="24"/>
+          <w:szCs w:val="24"/>
+        </w:rPr>
+        <w:t>imited warranty data.</w:t>
       </w:r>
     </w:p>
     <w:p>
@@ -2819,9 +3100,41 @@
       </w:r>
     </w:p>
     <w:p>
-      <w:pPr/>
+      <w:pPr>
+        <w:spacing w:line="360" w:lineRule="auto"/>
+        <w:jc w:val="both"/>
+        <w:rPr>
+          <w:rFonts w:ascii="Times New Roman" w:hAnsi="Times New Roman" w:cs="Times New Roman"/>
+          <w:sz w:val="24"/>
+          <w:szCs w:val="24"/>
+        </w:rPr>
+      </w:pPr>
+    </w:p>
+    <w:p>
+      <w:pPr>
+        <w:spacing w:line="360" w:lineRule="auto"/>
+        <w:jc w:val="both"/>
+        <w:rPr>
+          <w:rFonts w:ascii="Times New Roman" w:hAnsi="Times New Roman" w:cs="Times New Roman"/>
+          <w:sz w:val="24"/>
+          <w:szCs w:val="24"/>
+        </w:rPr>
+      </w:pPr>
       <w:r>
-        <w:t>Leybourne et al. (2025) discuss whether AI can be integrated into pest monitoring schemes and emphasise that successful AI use requires both computational capability and practical acceptance by domain users. This supports the project's decision to keep Ollama as a future local explanation layer rather than making generative AI the main decision engine. Recommendations should first be produced by transparent analytics rules and stored in a recommendation log; local AI can later translate those results into clearer management-facing explanations.</w:t>
+        <w:rPr>
+          <w:rFonts w:ascii="Times New Roman" w:hAnsi="Times New Roman" w:cs="Times New Roman"/>
+          <w:sz w:val="24"/>
+          <w:szCs w:val="24"/>
+        </w:rPr>
+        <w:t>Leybourne et al. (2025) discuss whether AI can be integrated into pest monitoring schemes and emphasise that successful AI use requires both computational capability and practical acceptance by domain users. This supports the project's decision to keep Ollama as a future local explanation layer rather than making generative AI the main decision engine. Recommendations should first be produced by transparent analytics rules and stored in a recommendation log; local AI can later translate those results into c</w:t>
+      </w:r>
+      <w:r>
+        <w:rPr>
+          <w:rFonts w:ascii="Times New Roman" w:hAnsi="Times New Roman" w:cs="Times New Roman"/>
+          <w:sz w:val="24"/>
+          <w:szCs w:val="24"/>
+        </w:rPr>
+        <w:t>learer management-facing explanations.</w:t>
       </w:r>
     </w:p>
     <w:p>
@@ -2835,6 +3148,7 @@
         </w:rPr>
       </w:pPr>
       <w:r>
+        <w:lastRenderedPageBreak/>
         <w:t>2.7 Comparative Review of Selected Studies</w:t>
       </w:r>
     </w:p>
@@ -2854,16 +3168,7 @@
           <w:sz w:val="24"/>
           <w:szCs w:val="24"/>
         </w:rPr>
-        <w:t xml:space="preserve">Ragazou et al. (2023) proposed a business intelligence model for empowering SMEs to make better decisions and improve competitive advantage. Their work supports the idea that scattered operational data can become useful management information when it is organised into a </w:t>
-      </w:r>
-      <w:r>
-        <w:rPr>
-          <w:rFonts w:ascii="Times New Roman" w:hAnsi="Times New Roman" w:cs="Times New Roman"/>
-          <w:sz w:val="24"/>
-          <w:szCs w:val="24"/>
-        </w:rPr>
-        <w:lastRenderedPageBreak/>
-        <w:t xml:space="preserve">structured analytics model. This is relevant to Nomobug because the company already records leads, services, payments, warranty claims, refunds, calendar events, and </w:t>
+        <w:t xml:space="preserve">Ragazou et al. (2023) proposed a business intelligence model for empowering SMEs to make better decisions and improve competitive advantage. Their work supports the idea that scattered operational data can become useful management information when it is organised into a structured analytics model. This is relevant to Nomobug because the company already records leads, services, payments, warranty claims, refunds, calendar events, and </w:t>
       </w:r>
       <w:proofErr w:type="gramStart"/>
       <w:r>
@@ -3019,7 +3324,16 @@
           <w:sz w:val="24"/>
           <w:szCs w:val="24"/>
         </w:rPr>
-        <w:t>Hiscox et al. (2025) reviewed the impact of adverse weather events on cockroaches and flies and reported that temperature, extreme rainfall, and flooding may influence pest ecology and human-pest interaction. This supports the inclusion of rainfall, humidity, and temperature as weather-associated indicators. The study also supports cautious wording because pest activity can be affected by sanitation, building condition, habitat disturbance, and other confounding factors.</w:t>
+        <w:t xml:space="preserve">Hiscox et al. (2025) reviewed the impact of adverse weather events on cockroaches and flies and reported that temperature, extreme rainfall, and flooding may influence pest ecology and </w:t>
+      </w:r>
+      <w:r>
+        <w:rPr>
+          <w:rFonts w:ascii="Times New Roman" w:hAnsi="Times New Roman" w:cs="Times New Roman"/>
+          <w:sz w:val="24"/>
+          <w:szCs w:val="24"/>
+        </w:rPr>
+        <w:lastRenderedPageBreak/>
+        <w:t>human-pest interaction. This supports the inclusion of rainfall, humidity, and temperature as weather-associated indicators. The study also supports cautious wording because pest activity can be affected by sanitation, building condition, habitat disturbance, and other confounding factors.</w:t>
       </w:r>
     </w:p>
     <w:p>
@@ -3038,7 +3352,6 @@
           <w:sz w:val="24"/>
           <w:szCs w:val="24"/>
         </w:rPr>
-        <w:lastRenderedPageBreak/>
         <w:t>Richardson et al. (2025) examined urban rat reports and linked increasing rat numbers with climate warming, urbanisation, and human population. Although the study is not based on Malaysian pest-control service records, it supports the broader idea that urban pest issues should be analysed together with environmental and urban context. This is relevant to the proposed area risk, treatment difficulty, and recurrence analytics modules.</w:t>
       </w:r>
     </w:p>
@@ -3159,16 +3472,8 @@
           <w:sz w:val="24"/>
           <w:szCs w:val="24"/>
         </w:rPr>
-        <w:t xml:space="preserve">Yao et al. (2026) analysed environmental, demographic, and socio-economic factors influencing Aedes albopictus mosquito density using XGBoost and SHAP. The study supports the value of combining environmental variables with interpretable machine-learning explanations. However, because Nomobug has a smaller warranty dataset, the project will not </w:t>
-      </w:r>
-      <w:r>
-        <w:rPr>
-          <w:rFonts w:ascii="Times New Roman" w:hAnsi="Times New Roman" w:cs="Times New Roman"/>
-          <w:sz w:val="24"/>
-          <w:szCs w:val="24"/>
-        </w:rPr>
         <w:lastRenderedPageBreak/>
-        <w:t>rely on complex XGBoost modelling as the main approach; instead, it will use the study to justify explainable features and future model improvement.</w:t>
+        <w:t>Yao et al. (2026) analysed environmental, demographic, and socio-economic factors influencing Aedes albopictus mosquito density using XGBoost and SHAP. The study supports the value of combining environmental variables with interpretable machine-learning explanations. However, because Nomobug has a smaller warranty dataset, the project will not rely on complex XGBoost modelling as the main approach; instead, it will use the study to justify explainable features and future model improvement.</w:t>
       </w:r>
     </w:p>
     <w:p>
@@ -3336,16 +3641,8 @@
           <w:sz w:val="24"/>
           <w:szCs w:val="24"/>
         </w:rPr>
-        <w:t xml:space="preserve">Google Calendar API documentation shows that calendar events can be retrieved and processed through API calls. This supports using Google Calendar as an operational data source for scheduling capacity, service stage, team workload, and warranty or extra-service identification. </w:t>
-      </w:r>
-      <w:r>
-        <w:rPr>
-          <w:rFonts w:ascii="Times New Roman" w:hAnsi="Times New Roman" w:cs="Times New Roman"/>
-          <w:sz w:val="24"/>
-          <w:szCs w:val="24"/>
-        </w:rPr>
         <w:lastRenderedPageBreak/>
-        <w:t>Because calendar titles and descriptions are semi-structured, the methodology will include parsing rules and match-confidence flags.</w:t>
+        <w:t>Google Calendar API documentation shows that calendar events can be retrieved and processed through API calls. This supports using Google Calendar as an operational data source for scheduling capacity, service stage, team workload, and warranty or extra-service identification. Because calendar titles and descriptions are semi-structured, the methodology will include parsing rules and match-confidence flags.</w:t>
       </w:r>
     </w:p>
     <w:p>
@@ -4086,7 +4383,16 @@
                 <w:sz w:val="24"/>
                 <w:szCs w:val="24"/>
               </w:rPr>
-              <w:t>Supports environmental and urban context analysis</w:t>
+              <w:t xml:space="preserve">Supports environmental and </w:t>
+            </w:r>
+            <w:r>
+              <w:rPr>
+                <w:rFonts w:ascii="Times New Roman" w:hAnsi="Times New Roman" w:cs="Times New Roman"/>
+                <w:sz w:val="24"/>
+                <w:szCs w:val="24"/>
+              </w:rPr>
+              <w:lastRenderedPageBreak/>
+              <w:t>urban context analysis</w:t>
             </w:r>
           </w:p>
         </w:tc>
@@ -4110,6 +4416,7 @@
                 <w:sz w:val="24"/>
                 <w:szCs w:val="24"/>
               </w:rPr>
+              <w:lastRenderedPageBreak/>
               <w:t>Different pest and setting</w:t>
             </w:r>
           </w:p>
@@ -4139,7 +4446,6 @@
                 <w:sz w:val="24"/>
                 <w:szCs w:val="24"/>
               </w:rPr>
-              <w:lastRenderedPageBreak/>
               <w:t>Brimblecombe et al. (2023)</w:t>
             </w:r>
           </w:p>
@@ -5150,6 +5456,7 @@
                 <w:sz w:val="24"/>
                 <w:szCs w:val="24"/>
               </w:rPr>
+              <w:lastRenderedPageBreak/>
               <w:t>Google Cloud / Superset (2026)</w:t>
             </w:r>
           </w:p>
@@ -5228,420 +5535,971 @@
         </w:tc>
       </w:tr>
       <w:tr>
-        <w:tc>
-          <w:tcPr>
-            <w:tcW w:type="dxa" w:w="2248"/>
-          </w:tcPr>
-          <w:p>
-            <w:r>
+        <w:trPr>
+          <w:jc w:val="center"/>
+        </w:trPr>
+        <w:tc>
+          <w:tcPr>
+            <w:tcW w:w="2248" w:type="dxa"/>
+          </w:tcPr>
+          <w:p>
+            <w:pPr>
+              <w:spacing w:line="360" w:lineRule="auto"/>
+              <w:rPr>
+                <w:rFonts w:ascii="Times New Roman" w:hAnsi="Times New Roman" w:cs="Times New Roman"/>
+                <w:sz w:val="24"/>
+                <w:szCs w:val="24"/>
+              </w:rPr>
+            </w:pPr>
+            <w:r>
+              <w:rPr>
+                <w:rFonts w:ascii="Times New Roman" w:hAnsi="Times New Roman" w:cs="Times New Roman"/>
+                <w:sz w:val="24"/>
+                <w:szCs w:val="24"/>
+              </w:rPr>
               <w:t>Schulze et al. (2023)</w:t>
             </w:r>
           </w:p>
         </w:tc>
         <w:tc>
           <w:tcPr>
-            <w:tcW w:type="dxa" w:w="2251"/>
-          </w:tcPr>
-          <w:p>
-            <w:r>
+            <w:tcW w:w="2251" w:type="dxa"/>
+          </w:tcPr>
+          <w:p>
+            <w:pPr>
+              <w:spacing w:line="360" w:lineRule="auto"/>
+              <w:rPr>
+                <w:rFonts w:ascii="Times New Roman" w:hAnsi="Times New Roman" w:cs="Times New Roman"/>
+                <w:sz w:val="24"/>
+                <w:szCs w:val="24"/>
+              </w:rPr>
+            </w:pPr>
+            <w:r>
+              <w:rPr>
+                <w:rFonts w:ascii="Times New Roman" w:hAnsi="Times New Roman" w:cs="Times New Roman"/>
+                <w:sz w:val="24"/>
+                <w:szCs w:val="24"/>
+              </w:rPr>
               <w:t>Digital dashboard systematic review</w:t>
             </w:r>
           </w:p>
         </w:tc>
         <w:tc>
           <w:tcPr>
-            <w:tcW w:type="dxa" w:w="2269"/>
-          </w:tcPr>
-          <w:p>
-            <w:r>
+            <w:tcW w:w="2269" w:type="dxa"/>
+          </w:tcPr>
+          <w:p>
+            <w:pPr>
+              <w:spacing w:line="360" w:lineRule="auto"/>
+              <w:rPr>
+                <w:rFonts w:ascii="Times New Roman" w:hAnsi="Times New Roman" w:cs="Times New Roman"/>
+                <w:sz w:val="24"/>
+                <w:szCs w:val="24"/>
+              </w:rPr>
+            </w:pPr>
+            <w:r>
+              <w:rPr>
+                <w:rFonts w:ascii="Times New Roman" w:hAnsi="Times New Roman" w:cs="Times New Roman"/>
+                <w:sz w:val="24"/>
+                <w:szCs w:val="24"/>
+              </w:rPr>
               <w:t>Supports dashboard design and action-oriented visual communication</w:t>
             </w:r>
           </w:p>
         </w:tc>
         <w:tc>
           <w:tcPr>
-            <w:tcW w:type="dxa" w:w="2248"/>
-          </w:tcPr>
-          <w:p>
-            <w:r>
+            <w:tcW w:w="2248" w:type="dxa"/>
+          </w:tcPr>
+          <w:p>
+            <w:pPr>
+              <w:spacing w:line="360" w:lineRule="auto"/>
+              <w:rPr>
+                <w:rFonts w:ascii="Times New Roman" w:hAnsi="Times New Roman" w:cs="Times New Roman"/>
+                <w:sz w:val="24"/>
+                <w:szCs w:val="24"/>
+              </w:rPr>
+            </w:pPr>
+            <w:r>
+              <w:rPr>
+                <w:rFonts w:ascii="Times New Roman" w:hAnsi="Times New Roman" w:cs="Times New Roman"/>
+                <w:sz w:val="24"/>
+                <w:szCs w:val="24"/>
+              </w:rPr>
               <w:t>General public-health context</w:t>
             </w:r>
           </w:p>
         </w:tc>
       </w:tr>
       <w:tr>
-        <w:tc>
-          <w:tcPr>
-            <w:tcW w:type="dxa" w:w="2248"/>
-          </w:tcPr>
-          <w:p>
-            <w:r>
+        <w:trPr>
+          <w:jc w:val="center"/>
+        </w:trPr>
+        <w:tc>
+          <w:tcPr>
+            <w:tcW w:w="2248" w:type="dxa"/>
+          </w:tcPr>
+          <w:p>
+            <w:pPr>
+              <w:spacing w:line="360" w:lineRule="auto"/>
+              <w:rPr>
+                <w:rFonts w:ascii="Times New Roman" w:hAnsi="Times New Roman" w:cs="Times New Roman"/>
+                <w:sz w:val="24"/>
+                <w:szCs w:val="24"/>
+              </w:rPr>
+            </w:pPr>
+            <w:r>
+              <w:rPr>
+                <w:rFonts w:ascii="Times New Roman" w:hAnsi="Times New Roman" w:cs="Times New Roman"/>
+                <w:sz w:val="24"/>
+                <w:szCs w:val="24"/>
+              </w:rPr>
               <w:t>Blacketer et al. (2021)</w:t>
             </w:r>
           </w:p>
         </w:tc>
         <w:tc>
           <w:tcPr>
-            <w:tcW w:type="dxa" w:w="2251"/>
-          </w:tcPr>
-          <w:p>
-            <w:r>
+            <w:tcW w:w="2251" w:type="dxa"/>
+          </w:tcPr>
+          <w:p>
+            <w:pPr>
+              <w:spacing w:line="360" w:lineRule="auto"/>
+              <w:rPr>
+                <w:rFonts w:ascii="Times New Roman" w:hAnsi="Times New Roman" w:cs="Times New Roman"/>
+                <w:sz w:val="24"/>
+                <w:szCs w:val="24"/>
+              </w:rPr>
+            </w:pPr>
+            <w:r>
+              <w:rPr>
+                <w:rFonts w:ascii="Times New Roman" w:hAnsi="Times New Roman" w:cs="Times New Roman"/>
+                <w:sz w:val="24"/>
+                <w:szCs w:val="24"/>
+              </w:rPr>
               <w:t>Data Quality Dashboard</w:t>
             </w:r>
           </w:p>
         </w:tc>
         <w:tc>
           <w:tcPr>
-            <w:tcW w:type="dxa" w:w="2269"/>
-          </w:tcPr>
-          <w:p>
-            <w:r>
+            <w:tcW w:w="2269" w:type="dxa"/>
+          </w:tcPr>
+          <w:p>
+            <w:pPr>
+              <w:spacing w:line="360" w:lineRule="auto"/>
+              <w:rPr>
+                <w:rFonts w:ascii="Times New Roman" w:hAnsi="Times New Roman" w:cs="Times New Roman"/>
+                <w:sz w:val="24"/>
+                <w:szCs w:val="24"/>
+              </w:rPr>
+            </w:pPr>
+            <w:r>
+              <w:rPr>
+                <w:rFonts w:ascii="Times New Roman" w:hAnsi="Times New Roman" w:cs="Times New Roman"/>
+                <w:sz w:val="24"/>
+                <w:szCs w:val="24"/>
+              </w:rPr>
               <w:t>Supports data quality reporting before analytics interpretation</w:t>
             </w:r>
           </w:p>
         </w:tc>
         <w:tc>
           <w:tcPr>
-            <w:tcW w:type="dxa" w:w="2248"/>
-          </w:tcPr>
-          <w:p>
-            <w:r>
+            <w:tcW w:w="2248" w:type="dxa"/>
+          </w:tcPr>
+          <w:p>
+            <w:pPr>
+              <w:spacing w:line="360" w:lineRule="auto"/>
+              <w:rPr>
+                <w:rFonts w:ascii="Times New Roman" w:hAnsi="Times New Roman" w:cs="Times New Roman"/>
+                <w:sz w:val="24"/>
+                <w:szCs w:val="24"/>
+              </w:rPr>
+            </w:pPr>
+            <w:r>
+              <w:rPr>
+                <w:rFonts w:ascii="Times New Roman" w:hAnsi="Times New Roman" w:cs="Times New Roman"/>
+                <w:sz w:val="24"/>
+                <w:szCs w:val="24"/>
+              </w:rPr>
               <w:t>Healthcare context but transferable</w:t>
             </w:r>
           </w:p>
         </w:tc>
       </w:tr>
       <w:tr>
-        <w:tc>
-          <w:tcPr>
-            <w:tcW w:type="dxa" w:w="2248"/>
-          </w:tcPr>
-          <w:p>
-            <w:r>
+        <w:trPr>
+          <w:jc w:val="center"/>
+        </w:trPr>
+        <w:tc>
+          <w:tcPr>
+            <w:tcW w:w="2248" w:type="dxa"/>
+          </w:tcPr>
+          <w:p>
+            <w:pPr>
+              <w:spacing w:line="360" w:lineRule="auto"/>
+              <w:rPr>
+                <w:rFonts w:ascii="Times New Roman" w:hAnsi="Times New Roman" w:cs="Times New Roman"/>
+                <w:sz w:val="24"/>
+                <w:szCs w:val="24"/>
+              </w:rPr>
+            </w:pPr>
+            <w:r>
+              <w:rPr>
+                <w:rFonts w:ascii="Times New Roman" w:hAnsi="Times New Roman" w:cs="Times New Roman"/>
+                <w:sz w:val="24"/>
+                <w:szCs w:val="24"/>
+              </w:rPr>
               <w:t>Fu et al. (2024)</w:t>
             </w:r>
           </w:p>
         </w:tc>
         <w:tc>
           <w:tcPr>
-            <w:tcW w:type="dxa" w:w="2251"/>
-          </w:tcPr>
-          <w:p>
-            <w:r>
+            <w:tcW w:w="2251" w:type="dxa"/>
+          </w:tcPr>
+          <w:p>
+            <w:pPr>
+              <w:spacing w:line="360" w:lineRule="auto"/>
+              <w:rPr>
+                <w:rFonts w:ascii="Times New Roman" w:hAnsi="Times New Roman" w:cs="Times New Roman"/>
+                <w:sz w:val="24"/>
+                <w:szCs w:val="24"/>
+              </w:rPr>
+            </w:pPr>
+            <w:r>
+              <w:rPr>
+                <w:rFonts w:ascii="Times New Roman" w:hAnsi="Times New Roman" w:cs="Times New Roman"/>
+                <w:sz w:val="24"/>
+                <w:szCs w:val="24"/>
+              </w:rPr>
               <w:t>Industrial data quality review</w:t>
             </w:r>
           </w:p>
         </w:tc>
         <w:tc>
           <w:tcPr>
-            <w:tcW w:type="dxa" w:w="2269"/>
-          </w:tcPr>
-          <w:p>
-            <w:r>
+            <w:tcW w:w="2269" w:type="dxa"/>
+          </w:tcPr>
+          <w:p>
+            <w:pPr>
+              <w:spacing w:line="360" w:lineRule="auto"/>
+              <w:rPr>
+                <w:rFonts w:ascii="Times New Roman" w:hAnsi="Times New Roman" w:cs="Times New Roman"/>
+                <w:sz w:val="24"/>
+                <w:szCs w:val="24"/>
+              </w:rPr>
+            </w:pPr>
+            <w:r>
+              <w:rPr>
+                <w:rFonts w:ascii="Times New Roman" w:hAnsi="Times New Roman" w:cs="Times New Roman"/>
+                <w:sz w:val="24"/>
+                <w:szCs w:val="24"/>
+              </w:rPr>
               <w:t>Supports staging, cleaning flags, and governance workflow</w:t>
             </w:r>
           </w:p>
         </w:tc>
         <w:tc>
           <w:tcPr>
-            <w:tcW w:type="dxa" w:w="2248"/>
-          </w:tcPr>
-          <w:p>
-            <w:r>
+            <w:tcW w:w="2248" w:type="dxa"/>
+          </w:tcPr>
+          <w:p>
+            <w:pPr>
+              <w:spacing w:line="360" w:lineRule="auto"/>
+              <w:rPr>
+                <w:rFonts w:ascii="Times New Roman" w:hAnsi="Times New Roman" w:cs="Times New Roman"/>
+                <w:sz w:val="24"/>
+                <w:szCs w:val="24"/>
+              </w:rPr>
+            </w:pPr>
+            <w:r>
+              <w:rPr>
+                <w:rFonts w:ascii="Times New Roman" w:hAnsi="Times New Roman" w:cs="Times New Roman"/>
+                <w:sz w:val="24"/>
+                <w:szCs w:val="24"/>
+              </w:rPr>
               <w:t>Conceptual review</w:t>
             </w:r>
           </w:p>
         </w:tc>
       </w:tr>
       <w:tr>
-        <w:tc>
-          <w:tcPr>
-            <w:tcW w:type="dxa" w:w="2248"/>
-          </w:tcPr>
-          <w:p>
-            <w:r>
+        <w:trPr>
+          <w:jc w:val="center"/>
+        </w:trPr>
+        <w:tc>
+          <w:tcPr>
+            <w:tcW w:w="2248" w:type="dxa"/>
+          </w:tcPr>
+          <w:p>
+            <w:pPr>
+              <w:spacing w:line="360" w:lineRule="auto"/>
+              <w:rPr>
+                <w:rFonts w:ascii="Times New Roman" w:hAnsi="Times New Roman" w:cs="Times New Roman"/>
+                <w:sz w:val="24"/>
+                <w:szCs w:val="24"/>
+              </w:rPr>
+            </w:pPr>
+            <w:r>
+              <w:rPr>
+                <w:rFonts w:ascii="Times New Roman" w:hAnsi="Times New Roman" w:cs="Times New Roman"/>
+                <w:sz w:val="24"/>
+                <w:szCs w:val="24"/>
+              </w:rPr>
               <w:t>Tonle et al. (2024)</w:t>
             </w:r>
           </w:p>
         </w:tc>
         <w:tc>
           <w:tcPr>
-            <w:tcW w:type="dxa" w:w="2251"/>
-          </w:tcPr>
-          <w:p>
-            <w:r>
+            <w:tcW w:w="2251" w:type="dxa"/>
+          </w:tcPr>
+          <w:p>
+            <w:pPr>
+              <w:spacing w:line="360" w:lineRule="auto"/>
+              <w:rPr>
+                <w:rFonts w:ascii="Times New Roman" w:hAnsi="Times New Roman" w:cs="Times New Roman"/>
+                <w:sz w:val="24"/>
+                <w:szCs w:val="24"/>
+              </w:rPr>
+            </w:pPr>
+            <w:r>
+              <w:rPr>
+                <w:rFonts w:ascii="Times New Roman" w:hAnsi="Times New Roman" w:cs="Times New Roman"/>
+                <w:sz w:val="24"/>
+                <w:szCs w:val="24"/>
+              </w:rPr>
               <w:t>Pest management DSS roadmap</w:t>
             </w:r>
           </w:p>
         </w:tc>
         <w:tc>
           <w:tcPr>
-            <w:tcW w:type="dxa" w:w="2269"/>
-          </w:tcPr>
-          <w:p>
-            <w:r>
+            <w:tcW w:w="2269" w:type="dxa"/>
+          </w:tcPr>
+          <w:p>
+            <w:pPr>
+              <w:spacing w:line="360" w:lineRule="auto"/>
+              <w:rPr>
+                <w:rFonts w:ascii="Times New Roman" w:hAnsi="Times New Roman" w:cs="Times New Roman"/>
+                <w:sz w:val="24"/>
+                <w:szCs w:val="24"/>
+              </w:rPr>
+            </w:pPr>
+            <w:r>
+              <w:rPr>
+                <w:rFonts w:ascii="Times New Roman" w:hAnsi="Times New Roman" w:cs="Times New Roman"/>
+                <w:sz w:val="24"/>
+                <w:szCs w:val="24"/>
+              </w:rPr>
               <w:t>Supports architecture connecting data, models, and decision outputs</w:t>
             </w:r>
           </w:p>
         </w:tc>
         <w:tc>
           <w:tcPr>
-            <w:tcW w:type="dxa" w:w="2248"/>
-          </w:tcPr>
-          <w:p>
-            <w:r>
+            <w:tcW w:w="2248" w:type="dxa"/>
+          </w:tcPr>
+          <w:p>
+            <w:pPr>
+              <w:spacing w:line="360" w:lineRule="auto"/>
+              <w:rPr>
+                <w:rFonts w:ascii="Times New Roman" w:hAnsi="Times New Roman" w:cs="Times New Roman"/>
+                <w:sz w:val="24"/>
+                <w:szCs w:val="24"/>
+              </w:rPr>
+            </w:pPr>
+            <w:r>
+              <w:rPr>
+                <w:rFonts w:ascii="Times New Roman" w:hAnsi="Times New Roman" w:cs="Times New Roman"/>
+                <w:sz w:val="24"/>
+                <w:szCs w:val="24"/>
+              </w:rPr>
               <w:t>Agricultural IPM context</w:t>
             </w:r>
           </w:p>
         </w:tc>
       </w:tr>
       <w:tr>
-        <w:tc>
-          <w:tcPr>
-            <w:tcW w:type="dxa" w:w="2248"/>
-          </w:tcPr>
-          <w:p>
-            <w:r>
+        <w:trPr>
+          <w:jc w:val="center"/>
+        </w:trPr>
+        <w:tc>
+          <w:tcPr>
+            <w:tcW w:w="2248" w:type="dxa"/>
+          </w:tcPr>
+          <w:p>
+            <w:pPr>
+              <w:spacing w:line="360" w:lineRule="auto"/>
+              <w:rPr>
+                <w:rFonts w:ascii="Times New Roman" w:hAnsi="Times New Roman" w:cs="Times New Roman"/>
+                <w:sz w:val="24"/>
+                <w:szCs w:val="24"/>
+              </w:rPr>
+            </w:pPr>
+            <w:r>
+              <w:rPr>
+                <w:rFonts w:ascii="Times New Roman" w:hAnsi="Times New Roman" w:cs="Times New Roman"/>
+                <w:sz w:val="24"/>
+                <w:szCs w:val="24"/>
+              </w:rPr>
               <w:t>Marinko et al. (2024)</w:t>
             </w:r>
           </w:p>
         </w:tc>
         <w:tc>
           <w:tcPr>
-            <w:tcW w:type="dxa" w:w="2251"/>
-          </w:tcPr>
-          <w:p>
-            <w:r>
+            <w:tcW w:w="2251" w:type="dxa"/>
+          </w:tcPr>
+          <w:p>
+            <w:pPr>
+              <w:spacing w:line="360" w:lineRule="auto"/>
+              <w:rPr>
+                <w:rFonts w:ascii="Times New Roman" w:hAnsi="Times New Roman" w:cs="Times New Roman"/>
+                <w:sz w:val="24"/>
+                <w:szCs w:val="24"/>
+              </w:rPr>
+            </w:pPr>
+            <w:r>
+              <w:rPr>
+                <w:rFonts w:ascii="Times New Roman" w:hAnsi="Times New Roman" w:cs="Times New Roman"/>
+                <w:sz w:val="24"/>
+                <w:szCs w:val="24"/>
+              </w:rPr>
               <w:t>IPM DSS typology web app</w:t>
             </w:r>
           </w:p>
         </w:tc>
         <w:tc>
           <w:tcPr>
-            <w:tcW w:type="dxa" w:w="2269"/>
-          </w:tcPr>
-          <w:p>
-            <w:r>
+            <w:tcW w:w="2269" w:type="dxa"/>
+          </w:tcPr>
+          <w:p>
+            <w:pPr>
+              <w:spacing w:line="360" w:lineRule="auto"/>
+              <w:rPr>
+                <w:rFonts w:ascii="Times New Roman" w:hAnsi="Times New Roman" w:cs="Times New Roman"/>
+                <w:sz w:val="24"/>
+                <w:szCs w:val="24"/>
+              </w:rPr>
+            </w:pPr>
+            <w:r>
+              <w:rPr>
+                <w:rFonts w:ascii="Times New Roman" w:hAnsi="Times New Roman" w:cs="Times New Roman"/>
+                <w:sz w:val="24"/>
+                <w:szCs w:val="24"/>
+              </w:rPr>
               <w:t>Supports classifying monitoring, prediction, and recommendation features</w:t>
             </w:r>
           </w:p>
         </w:tc>
         <w:tc>
           <w:tcPr>
-            <w:tcW w:type="dxa" w:w="2248"/>
-          </w:tcPr>
-          <w:p>
-            <w:r>
+            <w:tcW w:w="2248" w:type="dxa"/>
+          </w:tcPr>
+          <w:p>
+            <w:pPr>
+              <w:spacing w:line="360" w:lineRule="auto"/>
+              <w:rPr>
+                <w:rFonts w:ascii="Times New Roman" w:hAnsi="Times New Roman" w:cs="Times New Roman"/>
+                <w:sz w:val="24"/>
+                <w:szCs w:val="24"/>
+              </w:rPr>
+            </w:pPr>
+            <w:r>
+              <w:rPr>
+                <w:rFonts w:ascii="Times New Roman" w:hAnsi="Times New Roman" w:cs="Times New Roman"/>
+                <w:sz w:val="24"/>
+                <w:szCs w:val="24"/>
+              </w:rPr>
               <w:t>Agricultural DSS focus</w:t>
             </w:r>
           </w:p>
         </w:tc>
       </w:tr>
       <w:tr>
-        <w:tc>
-          <w:tcPr>
-            <w:tcW w:type="dxa" w:w="2248"/>
-          </w:tcPr>
-          <w:p>
-            <w:r>
+        <w:trPr>
+          <w:jc w:val="center"/>
+        </w:trPr>
+        <w:tc>
+          <w:tcPr>
+            <w:tcW w:w="2248" w:type="dxa"/>
+          </w:tcPr>
+          <w:p>
+            <w:pPr>
+              <w:spacing w:line="360" w:lineRule="auto"/>
+              <w:rPr>
+                <w:rFonts w:ascii="Times New Roman" w:hAnsi="Times New Roman" w:cs="Times New Roman"/>
+                <w:sz w:val="24"/>
+                <w:szCs w:val="24"/>
+              </w:rPr>
+            </w:pPr>
+            <w:r>
+              <w:rPr>
+                <w:rFonts w:ascii="Times New Roman" w:hAnsi="Times New Roman" w:cs="Times New Roman"/>
+                <w:sz w:val="24"/>
+                <w:szCs w:val="24"/>
+              </w:rPr>
               <w:t>Fiori et al. (2024)</w:t>
             </w:r>
           </w:p>
         </w:tc>
         <w:tc>
           <w:tcPr>
-            <w:tcW w:type="dxa" w:w="2251"/>
-          </w:tcPr>
-          <w:p>
-            <w:r>
+            <w:tcW w:w="2251" w:type="dxa"/>
+          </w:tcPr>
+          <w:p>
+            <w:pPr>
+              <w:spacing w:line="360" w:lineRule="auto"/>
+              <w:rPr>
+                <w:rFonts w:ascii="Times New Roman" w:hAnsi="Times New Roman" w:cs="Times New Roman"/>
+                <w:sz w:val="24"/>
+                <w:szCs w:val="24"/>
+              </w:rPr>
+            </w:pPr>
+            <w:r>
+              <w:rPr>
+                <w:rFonts w:ascii="Times New Roman" w:hAnsi="Times New Roman" w:cs="Times New Roman"/>
+                <w:sz w:val="24"/>
+                <w:szCs w:val="24"/>
+              </w:rPr>
               <w:t>SMARTerra pest/disease DSS</w:t>
             </w:r>
           </w:p>
         </w:tc>
         <w:tc>
           <w:tcPr>
-            <w:tcW w:type="dxa" w:w="2269"/>
-          </w:tcPr>
-          <w:p>
-            <w:r>
+            <w:tcW w:w="2269" w:type="dxa"/>
+          </w:tcPr>
+          <w:p>
+            <w:pPr>
+              <w:spacing w:line="360" w:lineRule="auto"/>
+              <w:rPr>
+                <w:rFonts w:ascii="Times New Roman" w:hAnsi="Times New Roman" w:cs="Times New Roman"/>
+                <w:sz w:val="24"/>
+                <w:szCs w:val="24"/>
+              </w:rPr>
+            </w:pPr>
+            <w:r>
+              <w:rPr>
+                <w:rFonts w:ascii="Times New Roman" w:hAnsi="Times New Roman" w:cs="Times New Roman"/>
+                <w:sz w:val="24"/>
+                <w:szCs w:val="24"/>
+              </w:rPr>
               <w:t>Supports high-resolution risk maps and planning dashboards</w:t>
             </w:r>
           </w:p>
         </w:tc>
         <w:tc>
           <w:tcPr>
-            <w:tcW w:type="dxa" w:w="2248"/>
-          </w:tcPr>
-          <w:p>
-            <w:r>
+            <w:tcW w:w="2248" w:type="dxa"/>
+          </w:tcPr>
+          <w:p>
+            <w:pPr>
+              <w:spacing w:line="360" w:lineRule="auto"/>
+              <w:rPr>
+                <w:rFonts w:ascii="Times New Roman" w:hAnsi="Times New Roman" w:cs="Times New Roman"/>
+                <w:sz w:val="24"/>
+                <w:szCs w:val="24"/>
+              </w:rPr>
+            </w:pPr>
+            <w:r>
+              <w:rPr>
+                <w:rFonts w:ascii="Times New Roman" w:hAnsi="Times New Roman" w:cs="Times New Roman"/>
+                <w:sz w:val="24"/>
+                <w:szCs w:val="24"/>
+              </w:rPr>
               <w:t>Plant pest/disease context</w:t>
             </w:r>
           </w:p>
         </w:tc>
       </w:tr>
       <w:tr>
-        <w:tc>
-          <w:tcPr>
-            <w:tcW w:type="dxa" w:w="2248"/>
-          </w:tcPr>
-          <w:p>
-            <w:r>
+        <w:trPr>
+          <w:jc w:val="center"/>
+        </w:trPr>
+        <w:tc>
+          <w:tcPr>
+            <w:tcW w:w="2248" w:type="dxa"/>
+          </w:tcPr>
+          <w:p>
+            <w:pPr>
+              <w:spacing w:line="360" w:lineRule="auto"/>
+              <w:rPr>
+                <w:rFonts w:ascii="Times New Roman" w:hAnsi="Times New Roman" w:cs="Times New Roman"/>
+                <w:sz w:val="24"/>
+                <w:szCs w:val="24"/>
+              </w:rPr>
+            </w:pPr>
+            <w:r>
+              <w:rPr>
+                <w:rFonts w:ascii="Times New Roman" w:hAnsi="Times New Roman" w:cs="Times New Roman"/>
+                <w:sz w:val="24"/>
+                <w:szCs w:val="24"/>
+              </w:rPr>
               <w:t>Marinko et al. (2025)</w:t>
             </w:r>
           </w:p>
         </w:tc>
         <w:tc>
           <w:tcPr>
-            <w:tcW w:type="dxa" w:w="2251"/>
-          </w:tcPr>
-          <w:p>
-            <w:r>
+            <w:tcW w:w="2251" w:type="dxa"/>
+          </w:tcPr>
+          <w:p>
+            <w:pPr>
+              <w:spacing w:line="360" w:lineRule="auto"/>
+              <w:rPr>
+                <w:rFonts w:ascii="Times New Roman" w:hAnsi="Times New Roman" w:cs="Times New Roman"/>
+                <w:sz w:val="24"/>
+                <w:szCs w:val="24"/>
+              </w:rPr>
+            </w:pPr>
+            <w:r>
+              <w:rPr>
+                <w:rFonts w:ascii="Times New Roman" w:hAnsi="Times New Roman" w:cs="Times New Roman"/>
+                <w:sz w:val="24"/>
+                <w:szCs w:val="24"/>
+              </w:rPr>
               <w:t>DSS adoption barriers</w:t>
             </w:r>
           </w:p>
         </w:tc>
         <w:tc>
           <w:tcPr>
-            <w:tcW w:type="dxa" w:w="2269"/>
-          </w:tcPr>
-          <w:p>
-            <w:r>
+            <w:tcW w:w="2269" w:type="dxa"/>
+          </w:tcPr>
+          <w:p>
+            <w:pPr>
+              <w:spacing w:line="360" w:lineRule="auto"/>
+              <w:rPr>
+                <w:rFonts w:ascii="Times New Roman" w:hAnsi="Times New Roman" w:cs="Times New Roman"/>
+                <w:sz w:val="24"/>
+                <w:szCs w:val="24"/>
+              </w:rPr>
+            </w:pPr>
+            <w:r>
+              <w:rPr>
+                <w:rFonts w:ascii="Times New Roman" w:hAnsi="Times New Roman" w:cs="Times New Roman"/>
+                <w:sz w:val="24"/>
+                <w:szCs w:val="24"/>
+              </w:rPr>
               <w:t>Supports usability, trust, and adoption evaluation</w:t>
             </w:r>
           </w:p>
         </w:tc>
         <w:tc>
           <w:tcPr>
-            <w:tcW w:type="dxa" w:w="2248"/>
-          </w:tcPr>
-          <w:p>
-            <w:r>
+            <w:tcW w:w="2248" w:type="dxa"/>
+          </w:tcPr>
+          <w:p>
+            <w:pPr>
+              <w:spacing w:line="360" w:lineRule="auto"/>
+              <w:rPr>
+                <w:rFonts w:ascii="Times New Roman" w:hAnsi="Times New Roman" w:cs="Times New Roman"/>
+                <w:sz w:val="24"/>
+                <w:szCs w:val="24"/>
+              </w:rPr>
+            </w:pPr>
+            <w:r>
+              <w:rPr>
+                <w:rFonts w:ascii="Times New Roman" w:hAnsi="Times New Roman" w:cs="Times New Roman"/>
+                <w:sz w:val="24"/>
+                <w:szCs w:val="24"/>
+              </w:rPr>
               <w:t>European IPM setting</w:t>
             </w:r>
           </w:p>
         </w:tc>
       </w:tr>
       <w:tr>
-        <w:tc>
-          <w:tcPr>
-            <w:tcW w:type="dxa" w:w="2248"/>
-          </w:tcPr>
-          <w:p>
-            <w:r>
+        <w:trPr>
+          <w:jc w:val="center"/>
+        </w:trPr>
+        <w:tc>
+          <w:tcPr>
+            <w:tcW w:w="2248" w:type="dxa"/>
+          </w:tcPr>
+          <w:p>
+            <w:pPr>
+              <w:spacing w:line="360" w:lineRule="auto"/>
+              <w:rPr>
+                <w:rFonts w:ascii="Times New Roman" w:hAnsi="Times New Roman" w:cs="Times New Roman"/>
+                <w:sz w:val="24"/>
+                <w:szCs w:val="24"/>
+              </w:rPr>
+            </w:pPr>
+            <w:r>
+              <w:rPr>
+                <w:rFonts w:ascii="Times New Roman" w:hAnsi="Times New Roman" w:cs="Times New Roman"/>
+                <w:sz w:val="24"/>
+                <w:szCs w:val="24"/>
+              </w:rPr>
+              <w:lastRenderedPageBreak/>
               <w:t>Choi &amp; Hong (2021)</w:t>
             </w:r>
           </w:p>
         </w:tc>
         <w:tc>
           <w:tcPr>
-            <w:tcW w:type="dxa" w:w="2251"/>
-          </w:tcPr>
-          <w:p>
-            <w:r>
+            <w:tcW w:w="2251" w:type="dxa"/>
+          </w:tcPr>
+          <w:p>
+            <w:pPr>
+              <w:spacing w:line="360" w:lineRule="auto"/>
+              <w:rPr>
+                <w:rFonts w:ascii="Times New Roman" w:hAnsi="Times New Roman" w:cs="Times New Roman"/>
+                <w:sz w:val="24"/>
+                <w:szCs w:val="24"/>
+              </w:rPr>
+            </w:pPr>
+            <w:r>
+              <w:rPr>
+                <w:rFonts w:ascii="Times New Roman" w:hAnsi="Times New Roman" w:cs="Times New Roman"/>
+                <w:sz w:val="24"/>
+                <w:szCs w:val="24"/>
+              </w:rPr>
               <w:t>MDST-DBSCAN spatiotemporal clustering</w:t>
             </w:r>
           </w:p>
         </w:tc>
         <w:tc>
           <w:tcPr>
-            <w:tcW w:type="dxa" w:w="2269"/>
-          </w:tcPr>
-          <w:p>
-            <w:r>
+            <w:tcW w:w="2269" w:type="dxa"/>
+          </w:tcPr>
+          <w:p>
+            <w:pPr>
+              <w:spacing w:line="360" w:lineRule="auto"/>
+              <w:rPr>
+                <w:rFonts w:ascii="Times New Roman" w:hAnsi="Times New Roman" w:cs="Times New Roman"/>
+                <w:sz w:val="24"/>
+                <w:szCs w:val="24"/>
+              </w:rPr>
+            </w:pPr>
+            <w:r>
+              <w:rPr>
+                <w:rFonts w:ascii="Times New Roman" w:hAnsi="Times New Roman" w:cs="Times New Roman"/>
+                <w:sz w:val="24"/>
+                <w:szCs w:val="24"/>
+              </w:rPr>
               <w:t>Supports density-based hotspot detection with noisy spatial data</w:t>
             </w:r>
           </w:p>
         </w:tc>
         <w:tc>
           <w:tcPr>
-            <w:tcW w:type="dxa" w:w="2248"/>
-          </w:tcPr>
-          <w:p>
-            <w:r>
+            <w:tcW w:w="2248" w:type="dxa"/>
+          </w:tcPr>
+          <w:p>
+            <w:pPr>
+              <w:spacing w:line="360" w:lineRule="auto"/>
+              <w:rPr>
+                <w:rFonts w:ascii="Times New Roman" w:hAnsi="Times New Roman" w:cs="Times New Roman"/>
+                <w:sz w:val="24"/>
+                <w:szCs w:val="24"/>
+              </w:rPr>
+            </w:pPr>
+            <w:r>
+              <w:rPr>
+                <w:rFonts w:ascii="Times New Roman" w:hAnsi="Times New Roman" w:cs="Times New Roman"/>
+                <w:sz w:val="24"/>
+                <w:szCs w:val="24"/>
+              </w:rPr>
               <w:t>More advanced than required</w:t>
             </w:r>
           </w:p>
         </w:tc>
       </w:tr>
       <w:tr>
-        <w:tc>
-          <w:tcPr>
-            <w:tcW w:type="dxa" w:w="2248"/>
-          </w:tcPr>
-          <w:p>
-            <w:r>
+        <w:trPr>
+          <w:jc w:val="center"/>
+        </w:trPr>
+        <w:tc>
+          <w:tcPr>
+            <w:tcW w:w="2248" w:type="dxa"/>
+          </w:tcPr>
+          <w:p>
+            <w:pPr>
+              <w:spacing w:line="360" w:lineRule="auto"/>
+              <w:rPr>
+                <w:rFonts w:ascii="Times New Roman" w:hAnsi="Times New Roman" w:cs="Times New Roman"/>
+                <w:sz w:val="24"/>
+                <w:szCs w:val="24"/>
+              </w:rPr>
+            </w:pPr>
+            <w:r>
+              <w:rPr>
+                <w:rFonts w:ascii="Times New Roman" w:hAnsi="Times New Roman" w:cs="Times New Roman"/>
+                <w:sz w:val="24"/>
+                <w:szCs w:val="24"/>
+              </w:rPr>
               <w:t>Ejike et al. (2025)</w:t>
             </w:r>
           </w:p>
         </w:tc>
         <w:tc>
           <w:tcPr>
-            <w:tcW w:type="dxa" w:w="2251"/>
-          </w:tcPr>
-          <w:p>
-            <w:r>
+            <w:tcW w:w="2251" w:type="dxa"/>
+          </w:tcPr>
+          <w:p>
+            <w:pPr>
+              <w:spacing w:line="360" w:lineRule="auto"/>
+              <w:rPr>
+                <w:rFonts w:ascii="Times New Roman" w:hAnsi="Times New Roman" w:cs="Times New Roman"/>
+                <w:sz w:val="24"/>
+                <w:szCs w:val="24"/>
+              </w:rPr>
+            </w:pPr>
+            <w:r>
+              <w:rPr>
+                <w:rFonts w:ascii="Times New Roman" w:hAnsi="Times New Roman" w:cs="Times New Roman"/>
+                <w:sz w:val="24"/>
+                <w:szCs w:val="24"/>
+              </w:rPr>
               <w:t>Rainfall prediction using ML</w:t>
             </w:r>
           </w:p>
         </w:tc>
         <w:tc>
           <w:tcPr>
-            <w:tcW w:type="dxa" w:w="2269"/>
-          </w:tcPr>
-          <w:p>
-            <w:r>
+            <w:tcW w:w="2269" w:type="dxa"/>
+          </w:tcPr>
+          <w:p>
+            <w:pPr>
+              <w:spacing w:line="360" w:lineRule="auto"/>
+              <w:rPr>
+                <w:rFonts w:ascii="Times New Roman" w:hAnsi="Times New Roman" w:cs="Times New Roman"/>
+                <w:sz w:val="24"/>
+                <w:szCs w:val="24"/>
+              </w:rPr>
+            </w:pPr>
+            <w:r>
+              <w:rPr>
+                <w:rFonts w:ascii="Times New Roman" w:hAnsi="Times New Roman" w:cs="Times New Roman"/>
+                <w:sz w:val="24"/>
+                <w:szCs w:val="24"/>
+              </w:rPr>
               <w:t>Supports lightweight weather modelling and logistic regression comparison</w:t>
             </w:r>
           </w:p>
         </w:tc>
         <w:tc>
           <w:tcPr>
-            <w:tcW w:type="dxa" w:w="2248"/>
-          </w:tcPr>
-          <w:p>
-            <w:r>
+            <w:tcW w:w="2248" w:type="dxa"/>
+          </w:tcPr>
+          <w:p>
+            <w:pPr>
+              <w:spacing w:line="360" w:lineRule="auto"/>
+              <w:rPr>
+                <w:rFonts w:ascii="Times New Roman" w:hAnsi="Times New Roman" w:cs="Times New Roman"/>
+                <w:sz w:val="24"/>
+                <w:szCs w:val="24"/>
+              </w:rPr>
+            </w:pPr>
+            <w:r>
+              <w:rPr>
+                <w:rFonts w:ascii="Times New Roman" w:hAnsi="Times New Roman" w:cs="Times New Roman"/>
+                <w:sz w:val="24"/>
+                <w:szCs w:val="24"/>
+              </w:rPr>
               <w:t>Weather prediction, not pest outcome</w:t>
             </w:r>
           </w:p>
         </w:tc>
       </w:tr>
       <w:tr>
-        <w:tc>
-          <w:tcPr>
-            <w:tcW w:type="dxa" w:w="2248"/>
-          </w:tcPr>
-          <w:p>
-            <w:r>
+        <w:trPr>
+          <w:jc w:val="center"/>
+        </w:trPr>
+        <w:tc>
+          <w:tcPr>
+            <w:tcW w:w="2248" w:type="dxa"/>
+          </w:tcPr>
+          <w:p>
+            <w:pPr>
+              <w:spacing w:line="360" w:lineRule="auto"/>
+              <w:rPr>
+                <w:rFonts w:ascii="Times New Roman" w:hAnsi="Times New Roman" w:cs="Times New Roman"/>
+                <w:sz w:val="24"/>
+                <w:szCs w:val="24"/>
+              </w:rPr>
+            </w:pPr>
+            <w:r>
+              <w:rPr>
+                <w:rFonts w:ascii="Times New Roman" w:hAnsi="Times New Roman" w:cs="Times New Roman"/>
+                <w:sz w:val="24"/>
+                <w:szCs w:val="24"/>
+              </w:rPr>
               <w:t>Leybourne et al. (2025)</w:t>
             </w:r>
           </w:p>
         </w:tc>
         <w:tc>
           <w:tcPr>
-            <w:tcW w:type="dxa" w:w="2251"/>
-          </w:tcPr>
-          <w:p>
-            <w:r>
+            <w:tcW w:w="2251" w:type="dxa"/>
+          </w:tcPr>
+          <w:p>
+            <w:pPr>
+              <w:spacing w:line="360" w:lineRule="auto"/>
+              <w:rPr>
+                <w:rFonts w:ascii="Times New Roman" w:hAnsi="Times New Roman" w:cs="Times New Roman"/>
+                <w:sz w:val="24"/>
+                <w:szCs w:val="24"/>
+              </w:rPr>
+            </w:pPr>
+            <w:r>
+              <w:rPr>
+                <w:rFonts w:ascii="Times New Roman" w:hAnsi="Times New Roman" w:cs="Times New Roman"/>
+                <w:sz w:val="24"/>
+                <w:szCs w:val="24"/>
+              </w:rPr>
               <w:t>AI in pest monitoring schemes</w:t>
             </w:r>
           </w:p>
         </w:tc>
         <w:tc>
           <w:tcPr>
-            <w:tcW w:type="dxa" w:w="2269"/>
-          </w:tcPr>
-          <w:p>
-            <w:r>
+            <w:tcW w:w="2269" w:type="dxa"/>
+          </w:tcPr>
+          <w:p>
+            <w:pPr>
+              <w:spacing w:line="360" w:lineRule="auto"/>
+              <w:rPr>
+                <w:rFonts w:ascii="Times New Roman" w:hAnsi="Times New Roman" w:cs="Times New Roman"/>
+                <w:sz w:val="24"/>
+                <w:szCs w:val="24"/>
+              </w:rPr>
+            </w:pPr>
+            <w:r>
+              <w:rPr>
+                <w:rFonts w:ascii="Times New Roman" w:hAnsi="Times New Roman" w:cs="Times New Roman"/>
+                <w:sz w:val="24"/>
+                <w:szCs w:val="24"/>
+              </w:rPr>
               <w:t>Supports future AI explanation layer and adoption caution</w:t>
             </w:r>
           </w:p>
         </w:tc>
         <w:tc>
           <w:tcPr>
-            <w:tcW w:type="dxa" w:w="2248"/>
-          </w:tcPr>
-          <w:p>
-            <w:r>
+            <w:tcW w:w="2248" w:type="dxa"/>
+          </w:tcPr>
+          <w:p>
+            <w:pPr>
+              <w:spacing w:line="360" w:lineRule="auto"/>
+              <w:rPr>
+                <w:rFonts w:ascii="Times New Roman" w:hAnsi="Times New Roman" w:cs="Times New Roman"/>
+                <w:sz w:val="24"/>
+                <w:szCs w:val="24"/>
+              </w:rPr>
+            </w:pPr>
+            <w:r>
+              <w:rPr>
+                <w:rFonts w:ascii="Times New Roman" w:hAnsi="Times New Roman" w:cs="Times New Roman"/>
+                <w:sz w:val="24"/>
+                <w:szCs w:val="24"/>
+              </w:rPr>
               <w:t>Agricultural monitoring focus</w:t>
             </w:r>
           </w:p>
@@ -5669,7 +6527,6 @@
         </w:rPr>
       </w:pPr>
       <w:r>
-        <w:lastRenderedPageBreak/>
         <w:t>2.9 Research Gap</w:t>
       </w:r>
     </w:p>
@@ -5756,6 +6613,7 @@
           <w:sz w:val="24"/>
           <w:szCs w:val="24"/>
         </w:rPr>
+        <w:lastRenderedPageBreak/>
         <w:t>Chapter 3: Methodology</w:t>
       </w:r>
     </w:p>
@@ -6138,7 +6996,6 @@
                 <w:sz w:val="24"/>
                 <w:szCs w:val="24"/>
               </w:rPr>
-              <w:lastRenderedPageBreak/>
               <w:t>3. Data integration</w:t>
             </w:r>
           </w:p>
@@ -6619,6 +7476,7 @@
                 <w:sz w:val="24"/>
                 <w:szCs w:val="24"/>
               </w:rPr>
+              <w:lastRenderedPageBreak/>
               <w:t>8. Recommendation logging</w:t>
             </w:r>
           </w:p>
@@ -6874,7 +7732,6 @@
           <w:sz w:val="24"/>
           <w:szCs w:val="24"/>
         </w:rPr>
-        <w:lastRenderedPageBreak/>
         <w:t xml:space="preserve">The workflow is designed as a controlled analytics pipeline. Raw data is first extracted from Google Sheets, CSV/Excel exports, and Google Calendar. The Python ETL process validates the records, standardises field values, flags data quality issues, enriches services with weather and location features, and loads the output into BigQuery. BigQuery then stores three layers: raw staging tables, cleaned core tables, and dashboard-ready marts. Superset reads only the cleaned core or mart </w:t>
       </w:r>
       <w:proofErr w:type="gramStart"/>
@@ -7237,6 +8094,7 @@
                 <w:sz w:val="24"/>
                 <w:szCs w:val="24"/>
               </w:rPr>
+              <w:lastRenderedPageBreak/>
               <w:t>Cloud warehouse</w:t>
             </w:r>
           </w:p>
@@ -8076,6 +8934,7 @@
                 <w:sz w:val="24"/>
                 <w:szCs w:val="24"/>
               </w:rPr>
+              <w:lastRenderedPageBreak/>
               <w:t>Cleaned core</w:t>
             </w:r>
           </w:p>
@@ -8512,7 +9371,6 @@
                 <w:sz w:val="24"/>
                 <w:szCs w:val="24"/>
               </w:rPr>
-              <w:lastRenderedPageBreak/>
               <w:t>fact_service -&gt; fact_warranty</w:t>
             </w:r>
           </w:p>
@@ -8723,6 +9581,7 @@
                 <w:sz w:val="24"/>
                 <w:szCs w:val="24"/>
               </w:rPr>
+              <w:lastRenderedPageBreak/>
               <w:t>fact_service -&gt; fact_calendar_event</w:t>
             </w:r>
           </w:p>
@@ -9447,6 +10306,7 @@
                 <w:sz w:val="24"/>
                 <w:szCs w:val="24"/>
               </w:rPr>
+              <w:lastRenderedPageBreak/>
               <w:t>Services / sales</w:t>
             </w:r>
           </w:p>
@@ -10115,7 +10975,6 @@
           <w:sz w:val="24"/>
           <w:szCs w:val="24"/>
         </w:rPr>
-        <w:lastRenderedPageBreak/>
         <w:t>3.5 Data Cleaning, Inclusion, and Exclusion Rules</w:t>
       </w:r>
     </w:p>
@@ -10185,6 +11044,7 @@
                 <w:sz w:val="24"/>
                 <w:szCs w:val="24"/>
               </w:rPr>
+              <w:lastRenderedPageBreak/>
               <w:t>Data Element</w:t>
             </w:r>
           </w:p>
@@ -10689,7 +11549,6 @@
                 <w:sz w:val="24"/>
                 <w:szCs w:val="24"/>
               </w:rPr>
-              <w:lastRenderedPageBreak/>
               <w:t>Technician/team</w:t>
             </w:r>
           </w:p>
@@ -10882,6 +11741,7 @@
                 <w:sz w:val="24"/>
                 <w:szCs w:val="24"/>
               </w:rPr>
+              <w:lastRenderedPageBreak/>
               <w:t>Refund reason</w:t>
             </w:r>
           </w:p>
@@ -11194,16 +12054,7 @@
           <w:sz w:val="24"/>
           <w:szCs w:val="24"/>
         </w:rPr>
-        <w:t xml:space="preserve">The project will use a conservative exclusion policy. Records are not silently deleted. They are first preserved in staging tables, then marked with validation flags such as invalid_date, duplicate_candidate, unmatched_customer, unknown_area, missing_weather, or low_calendar_match_confidence. A record is excluded only from the analysis that cannot </w:t>
-      </w:r>
-      <w:r>
-        <w:rPr>
-          <w:rFonts w:ascii="Times New Roman" w:hAnsi="Times New Roman" w:cs="Times New Roman"/>
-          <w:sz w:val="24"/>
-          <w:szCs w:val="24"/>
-        </w:rPr>
-        <w:lastRenderedPageBreak/>
-        <w:t>safely use it. For example, a service with missing coordinates can still be used in revenue trends, but not in DBSCAN hotspot detection.</w:t>
+        <w:t>The project will use a conservative exclusion policy. Records are not silently deleted. They are first preserved in staging tables, then marked with validation flags such as invalid_date, duplicate_candidate, unmatched_customer, unknown_area, missing_weather, or low_calendar_match_confidence. A record is excluded only from the analysis that cannot safely use it. For example, a service with missing coordinates can still be used in revenue trends, but not in DBSCAN hotspot detection.</w:t>
       </w:r>
     </w:p>
     <w:tbl>
@@ -11529,6 +12380,7 @@
                 <w:sz w:val="24"/>
                 <w:szCs w:val="24"/>
               </w:rPr>
+              <w:lastRenderedPageBreak/>
               <w:t>Unmatched-customer count</w:t>
             </w:r>
           </w:p>
@@ -11808,7 +12660,15 @@
           <w:sz w:val="24"/>
           <w:szCs w:val="24"/>
         </w:rPr>
-        <w:t>Following the AI/ML methodology guide, the CP2 analytics workflow will follow a clear lifecycle: data acquisition from company Google Sheets, Google Calendar, and weather APIs; preprocessing through cleaning, standardisation, missing-value checks, duplicate detection, and matching; model selection based on data size and explainability; model or scoring implementation using transparent methods such as DBSCAN, KDE, time-lag analysis, recurrence buckets, and logistic regression where labels are sufficient; evaluation using data quality coverage, dashboard usability feedback, and interpretation accuracy; and dashboard deployment through BigQuery marts and Apache Superset.</w:t>
+        <w:t>Following the AI/ML methodology guide, the CP2 analytics workflow will follow a clear lifecycle: data acquisition from company Google Sheets, Google Calendar, and weather APIs; preprocessing through cleaning, standardisation, missing-value checks, duplicate detection, and matching; model selection based on data size and explainability; model or scoring implementation using transparent methods such as DBSCAN, KDE, time-lag analysis, recurrence buckets, and logistic regression where labels are sufficient; eva</w:t>
+      </w:r>
+      <w:r>
+        <w:rPr>
+          <w:rFonts w:ascii="Times New Roman" w:hAnsi="Times New Roman" w:cs="Times New Roman"/>
+          <w:sz w:val="24"/>
+          <w:szCs w:val="24"/>
+        </w:rPr>
+        <w:t>luation using data quality coverage, dashboard usability feedback, and interpretation accuracy; and dashboard deployment through BigQuery marts and Apache Superset.</w:t>
       </w:r>
     </w:p>
     <w:tbl>
@@ -11858,7 +12718,6 @@
                 <w:sz w:val="24"/>
                 <w:szCs w:val="24"/>
               </w:rPr>
-              <w:lastRenderedPageBreak/>
               <w:t>Question</w:t>
             </w:r>
           </w:p>
@@ -12267,6 +13126,7 @@
                 <w:sz w:val="24"/>
                 <w:szCs w:val="24"/>
               </w:rPr>
+              <w:lastRenderedPageBreak/>
               <w:t>Is weather associated with higher warranty/repeat risk?</w:t>
             </w:r>
           </w:p>
@@ -12741,7 +13601,6 @@
           <w:sz w:val="24"/>
           <w:szCs w:val="24"/>
         </w:rPr>
-        <w:lastRenderedPageBreak/>
         <w:t>For each service record, the ETL process will calculate rain_same_day_mm, rain_</w:t>
       </w:r>
       <w:proofErr w:type="gramStart"/>
@@ -12853,6 +13712,7 @@
           <w:sz w:val="24"/>
           <w:szCs w:val="24"/>
         </w:rPr>
+        <w:lastRenderedPageBreak/>
         <w:t>Recurrence buckets:</w:t>
       </w:r>
     </w:p>
@@ -12989,16 +13849,7 @@
           <w:sz w:val="24"/>
           <w:szCs w:val="24"/>
         </w:rPr>
-        <w:t xml:space="preserve">The visualization layer will be implemented in Apache Superset to reduce custom frontend development and align the project with a data analytics capstone. Superset will connect to </w:t>
-      </w:r>
-      <w:r>
-        <w:rPr>
-          <w:rFonts w:ascii="Times New Roman" w:hAnsi="Times New Roman" w:cs="Times New Roman"/>
-          <w:sz w:val="24"/>
-          <w:szCs w:val="24"/>
-        </w:rPr>
-        <w:lastRenderedPageBreak/>
-        <w:t>BigQuery tables/views and provide dashboards with filters for date range, grain, area, pest type, package type, team, technician, customer segment, and session type.</w:t>
+        <w:t>The visualization layer will be implemented in Apache Superset to reduce custom frontend development and align the project with a data analytics capstone. Superset will connect to BigQuery tables/views and provide dashboards with filters for date range, grain, area, pest type, package type, team, technician, customer segment, and session type.</w:t>
       </w:r>
     </w:p>
     <w:tbl>
@@ -13314,6 +14165,7 @@
                 <w:sz w:val="24"/>
                 <w:szCs w:val="24"/>
               </w:rPr>
+              <w:lastRenderedPageBreak/>
               <w:t>Treatment Difficulty</w:t>
             </w:r>
           </w:p>
@@ -13838,7 +14690,6 @@
           <w:sz w:val="24"/>
           <w:szCs w:val="24"/>
         </w:rPr>
-        <w:lastRenderedPageBreak/>
         <w:t>3.9 Data Governance and Privacy</w:t>
       </w:r>
     </w:p>
@@ -13888,7 +14739,16 @@
           <w:sz w:val="24"/>
           <w:szCs w:val="24"/>
         </w:rPr>
-        <w:t>The BigQuery model will support anonymised views for reporting. These views will remove or mask personally identifiable information while preserving the fields needed for analysis, such as service date, area, pest type, package type, claim status, refund category, and difficulty level. This supports privacy, ethics, and company confidence in using the system.</w:t>
+        <w:t xml:space="preserve">The BigQuery model will support anonymised views for reporting. These views will remove or mask personally identifiable information while preserving the fields needed for analysis, </w:t>
+      </w:r>
+      <w:r>
+        <w:rPr>
+          <w:rFonts w:ascii="Times New Roman" w:hAnsi="Times New Roman" w:cs="Times New Roman"/>
+          <w:sz w:val="24"/>
+          <w:szCs w:val="24"/>
+        </w:rPr>
+        <w:lastRenderedPageBreak/>
+        <w:t>such as service date, area, pest type, package type, claim status, refund category, and difficulty level. This supports privacy, ethics, and company confidence in using the system.</w:t>
       </w:r>
     </w:p>
     <w:p>
@@ -14223,7 +15083,6 @@
                 <w:sz w:val="24"/>
                 <w:szCs w:val="24"/>
               </w:rPr>
-              <w:lastRenderedPageBreak/>
               <w:t>Security and privacy</w:t>
             </w:r>
           </w:p>
@@ -14512,6 +15371,7 @@
                 <w:sz w:val="24"/>
                 <w:szCs w:val="24"/>
               </w:rPr>
+              <w:lastRenderedPageBreak/>
               <w:t>Data quality</w:t>
             </w:r>
           </w:p>
@@ -14952,7 +15812,6 @@
           <w:sz w:val="24"/>
           <w:szCs w:val="24"/>
         </w:rPr>
-        <w:lastRenderedPageBreak/>
         <w:t>Refresh testing: confirm scheduled ETL or BigQuery scheduled queries update marts and show last refresh status.</w:t>
       </w:r>
     </w:p>
@@ -15053,6 +15912,7 @@
           <w:sz w:val="24"/>
           <w:szCs w:val="24"/>
         </w:rPr>
+        <w:lastRenderedPageBreak/>
         <w:t>Insight usefulness: collect feedback on whether area risk, recurrence, treatment difficulty, and upsell outputs are actionable.</w:t>
       </w:r>
     </w:p>
@@ -15403,7 +16263,6 @@
                 <w:sz w:val="24"/>
                 <w:szCs w:val="24"/>
               </w:rPr>
-              <w:lastRenderedPageBreak/>
               <w:t>2</w:t>
             </w:r>
           </w:p>
@@ -15692,6 +16551,7 @@
                 <w:sz w:val="24"/>
                 <w:szCs w:val="24"/>
               </w:rPr>
+              <w:lastRenderedPageBreak/>
               <w:t>5</w:t>
             </w:r>
           </w:p>
@@ -16268,7 +17128,6 @@
                 <w:sz w:val="24"/>
                 <w:szCs w:val="24"/>
               </w:rPr>
-              <w:lastRenderedPageBreak/>
               <w:t>11</w:t>
             </w:r>
           </w:p>
@@ -16644,6 +17503,7 @@
         </w:rPr>
       </w:pPr>
       <w:r>
+        <w:lastRenderedPageBreak/>
         <w:t>4.2 Milestones</w:t>
       </w:r>
     </w:p>
@@ -17294,7 +18154,6 @@
                 <w:sz w:val="24"/>
                 <w:szCs w:val="24"/>
               </w:rPr>
-              <w:lastRenderedPageBreak/>
               <w:t>M6: Evaluation complete</w:t>
             </w:r>
           </w:p>
@@ -17822,6 +18681,7 @@
                 <w:sz w:val="24"/>
                 <w:szCs w:val="24"/>
               </w:rPr>
+              <w:lastRenderedPageBreak/>
               <w:t>Calendar event names are inconsistent</w:t>
             </w:r>
           </w:p>
@@ -18302,7 +19162,6 @@
                 <w:sz w:val="24"/>
                 <w:szCs w:val="24"/>
               </w:rPr>
-              <w:lastRenderedPageBreak/>
               <w:t>Company users need simpler explanations</w:t>
             </w:r>
           </w:p>
@@ -18399,223 +19258,189 @@
       </w:r>
     </w:p>
     <w:p>
-      <w:pPr/>
       <w:r>
         <w:t>Apache Superset. (2026). Google BigQuery database support. https://superset.apache.org/user-docs/databases/supported/google-bigquery</w:t>
       </w:r>
     </w:p>
     <w:p>
-      <w:pPr/>
       <w:r>
         <w:t>Apache Superset. (2026). Introduction to Apache Superset. https://superset.apache.org/user-docs/intro/</w:t>
       </w:r>
     </w:p>
     <w:p>
-      <w:pPr/>
       <w:r>
         <w:t>Biswas, S., Mohite, J., &amp; Pappula, S. (2022). Systems and methods for pest forecasting using historical pesticide usage information. U.S. Patent No. US11397837B2. https://patents.google.com/patent/US11397837B2</w:t>
       </w:r>
     </w:p>
     <w:p>
-      <w:pPr/>
       <w:r>
         <w:t>Blacketer, C., Defalco, F. J., Ryan, P. B., &amp; Rijnbeek, P. R. (2021). Increasing trust in real-world evidence through evaluation of observational data quality. Journal of the American Medical Informatics Association, 28(10), 2251-2257. https://doi.org/10.1093/jamia/ocab132</w:t>
       </w:r>
     </w:p>
     <w:p>
-      <w:pPr/>
       <w:r>
+        <w:lastRenderedPageBreak/>
         <w:t>Brimblecombe, P., Muller, G., Schmidt, M., Tischhauser, W., Landau, I., &amp; Querner, P. (2023). Urban pest abundance and public enquiries in Zurich 1991-2022. Insects, 14(10), 798. https://doi.org/10.3390/insects14100798</w:t>
       </w:r>
     </w:p>
     <w:p>
-      <w:pPr/>
       <w:r>
         <w:t>Calatayud, J., Jornet, M., Mateu, J., &amp; Pinto, C. M. A. (2023). A new population model for urban infestations. Chaos, Solitons &amp; Fractals, 175, 113939. https://doi.org/10.1016/j.chaos.2023.113939</w:t>
       </w:r>
     </w:p>
     <w:p>
-      <w:pPr/>
       <w:r>
         <w:t>Choi, C., &amp; Hong, S.-Y. (2021). MDST-DBSCAN: A density-based clustering method for multidimensional spatiotemporal data. ISPRS International Journal of Geo-Information, 10(6), 391. https://doi.org/10.3390/ijgi10060391</w:t>
       </w:r>
     </w:p>
     <w:p>
-      <w:pPr/>
       <w:r>
         <w:t>Cordon, J. A. (2026). Temporal evolution of predictive heat maps for Periplaneta americana infestation in urban sanitation networks (April 7 - June 23, 2022). Zenodo. https://doi.org/10.5281/zenodo.18186918</w:t>
       </w:r>
     </w:p>
     <w:p>
-      <w:pPr/>
       <w:r>
         <w:t>Dey, S., &amp; Roy, S. (2025). Digital Guardians: Revolutionizing pest management with AI and IoT for a greener future. In IoT and advanced intelligence computation for smart agriculture. CRC Press. https://doi.org/10.1201/9781003527664-5</w:t>
       </w:r>
     </w:p>
     <w:p>
-      <w:pPr/>
       <w:r>
         <w:t>Ejike, O., Ndzi, D., &amp; Shakir, M. Z. (2025). Comparative study of machine learning-based rainfall prediction in tropical and temperate climates. Climate, 13(8), 167. https://doi.org/10.3390/cli13080167</w:t>
       </w:r>
     </w:p>
     <w:p>
-      <w:pPr/>
       <w:r>
         <w:t>Erguler, K., et al. (2024). VEClim: An early warning decision support system for climate-sensitive vector activity and vector-borne disease risk assessment. Wellcome Open Research, 9, 697. https://doi.org/10.12688/wellcomeopenres.23122.1</w:t>
       </w:r>
     </w:p>
     <w:p>
-      <w:pPr/>
       <w:r>
         <w:t>Fiori, M., Fois, G., Gerardi, M. S., Maggio, F., Milesi, C., &amp; Pinna, A. (2024). SMARTerra, a high-resolution decision support system for monitoring plant pests and diseases. Applied Sciences, 14(18), 8275. https://doi.org/10.3390/app14188275</w:t>
       </w:r>
     </w:p>
     <w:p>
-      <w:pPr/>
       <w:r>
         <w:t>Fu, Q., Nicholson, G. L., &amp; Easton, J. M. (2024). Understanding data quality in a data-driven industry context: Insights from the fundamentals. Journal of Industrial Information Integration, 42, 100729. https://doi.org/10.1016/j.jii.2024.100729</w:t>
       </w:r>
     </w:p>
     <w:p>
-      <w:pPr/>
       <w:r>
         <w:t>Google Calendar. (2026). Google Calendar API overview. https://developers.google.com/workspace/calendar/api/guides/overview</w:t>
       </w:r>
     </w:p>
     <w:p>
-      <w:pPr/>
       <w:r>
         <w:t>Google Calendar. (2026). Events: list. https://developers.google.com/workspace/calendar/api/v3/reference/events/list</w:t>
       </w:r>
     </w:p>
     <w:p>
-      <w:pPr/>
       <w:r>
         <w:t>Google Cloud. (2026). BigQuery documentation. https://cloud.google.com/bigquery/docs</w:t>
       </w:r>
     </w:p>
     <w:p>
-      <w:pPr/>
       <w:r>
         <w:t>Google Cloud. (2026). Introduction to BigQuery. https://cloud.google.com/bigquery/docs/introduction</w:t>
       </w:r>
     </w:p>
     <w:p>
-      <w:pPr/>
       <w:r>
         <w:t>Gurcan, F., Ayaz, A., Menekse Dalveren, G. G., &amp; Derawi, M. (2023). Business intelligence strategies, best practices, and latest trends: Analysis of scientometric data from 2003 to 2023 using machine learning. Sustainability, 15(13), 9854. https://doi.org/10.3390/su15139854</w:t>
       </w:r>
     </w:p>
     <w:p>
-      <w:pPr/>
       <w:r>
         <w:t>Hiscox, A., Spencer, F., Dennehy, J., Dyall, W., Jenkins, A., Narendran, A., Das, A., Logan, J. G., &amp; Jones, R. T. (2025). The impact of adverse weather events on cockroaches and flies, and the possible effects on disease. Medical and Veterinary Entomology, 39(3), 500-514. https://doi.org/10.1111/mve.12797</w:t>
       </w:r>
     </w:p>
     <w:p>
-      <w:pPr/>
       <w:r>
+        <w:lastRenderedPageBreak/>
         <w:t>Kaloudis, E., Agrafioti, P., Sakka, M. K., &amp; Lampiri, E. (2026). A temperature-driven population dynamics model based on biweekly insect trap counts for stored-product pest management. Preprints. https://www.preprints.org/manuscript/202603.0573</w:t>
       </w:r>
     </w:p>
     <w:p>
-      <w:pPr/>
       <w:r>
         <w:t>Leybourne, D. J., Musa, N., &amp; Yang, P. (2025). Can artificial intelligence be integrated into pest monitoring schemes to help achieve sustainable agriculture? An entomological, management and computational perspective. Agricultural and Forest Entomology, 27(1), 8-17. https://doi.org/10.1111/afe.12630</w:t>
       </w:r>
     </w:p>
     <w:p>
-      <w:pPr/>
       <w:r>
         <w:t>Li, W., Dodwell, E., &amp; Cook, D. (2023). A clustering algorithm to organize satellite hotspot data for the purpose of tracking bushfires remotely. The R Journal, 15(1), 17-33. https://journal.r-project.org/articles/RJ-2023-022/</w:t>
       </w:r>
     </w:p>
     <w:p>
-      <w:pPr/>
       <w:r>
         <w:t>Lu, X., Wijayaratna, K., Huang, Y., &amp; Qiu, A. (2022). AI-enabled opportunities and transformation challenges for SMEs in the post-pandemic era: A review and research agenda. Frontiers in Public Health, 10, 885067. https://doi.org/10.3389/fpubh.2022.885067</w:t>
       </w:r>
     </w:p>
     <w:p>
-      <w:pPr/>
       <w:r>
         <w:t>Malaysia OpenAPI. (2026). Weather: Malaysia official Open API. https://developer.data.gov.my/realtime-api/weather</w:t>
       </w:r>
     </w:p>
     <w:p>
-      <w:pPr/>
       <w:r>
         <w:t>Malaysian Meteorological Department. (2026). Web Service API. https://api.met.gov.my/</w:t>
       </w:r>
     </w:p>
     <w:p>
-      <w:pPr/>
       <w:r>
         <w:t>Marinko, J., Blazica, B., Jorgensen, L. N., Matzen, N., Ramsden, M., &amp; Debeljak, M. (2024). Typology for decision support systems in integrated pest management and its implementation as a web application. Agronomy, 14(3), 485. https://doi.org/10.3390/agronomy14030485</w:t>
       </w:r>
     </w:p>
     <w:p>
-      <w:pPr/>
       <w:r>
         <w:t>Marinko, J., Kuzmanovski, V., Ramsden, M., &amp; Debeljak, M. (2025). Overcoming barriers to the adoption of decision support systems in integrated pest management in some European countries. Agronomy, 15(2), 426. https://doi.org/10.3390/agronomy15020426</w:t>
       </w:r>
     </w:p>
     <w:p>
-      <w:pPr/>
       <w:r>
         <w:t>Open-Meteo. (2026). Historical Weather API. https://open-meteo.com/en/docs/historical-weather-api</w:t>
       </w:r>
     </w:p>
     <w:p>
-      <w:pPr/>
       <w:r>
         <w:t>Open-Meteo. (2026). Licence and data sources. https://open-meteo.com/en/licence</w:t>
       </w:r>
     </w:p>
     <w:p>
-      <w:pPr/>
       <w:r>
         <w:t>Pinto, A. F., Olmstead, D., Calixto, A. A., &amp; Gomez, M. I. (2025). Network for Environment and Weather Applications: An overview of the digital pest management decision support tool. Applied Economics Teaching Resources. https://www.aetrjournal.org/UserFiles/file/AETR_2025_0218%20Final.pdf</w:t>
       </w:r>
     </w:p>
     <w:p>
-      <w:pPr/>
       <w:r>
         <w:t>Ragazou, K., Passas, I., Garefalakis, A., &amp; Zopounidis, C. (2023). Business intelligence model empowering SMEs to make better decisions and enhance their competitive advantage. Discover Analytics, 1, 2. https://doi.org/10.1007/s44257-022-00002-3</w:t>
       </w:r>
     </w:p>
     <w:p>
-      <w:pPr/>
       <w:r>
         <w:t>Richardson, J. L., McCoy, E. P., Parlavecchio, N., et al. (2025). Increasing rat numbers in cities are linked to climate warming, urbanization, and human population. Science Advances, 11(5), eads6782. https://doi.org/10.1126/sciadv.ads6782</w:t>
       </w:r>
     </w:p>
     <w:p>
-      <w:pPr/>
       <w:r>
         <w:t>Schulze, A., Brand, F., Geppert, J., &amp; Bol, G.-F. (2023). Digital dashboards visualizing public health data: A systematic review. Frontiers in Public Health, 11, 999958. https://doi.org/10.3389/fpubh.2023.999958</w:t>
       </w:r>
     </w:p>
     <w:p>
-      <w:pPr/>
       <w:r>
         <w:t>Sumido, E. C., Feliscuzo, L. S., &amp; Aliac, C. J. G. (2023). Pest classification and prediction: Analyzing the impact of weather to pest occurrence through machine learning. Journal of Engineering Science and Technology, 18, 124-138.</w:t>
       </w:r>
     </w:p>
     <w:p>
-      <w:pPr/>
       <w:r>
+        <w:lastRenderedPageBreak/>
         <w:t>Tonle, F. B. N., Niassy, S., Ndadji, M. M. Z., Tchendji, M. T., Nzeukou, A., Mudereri, B. T., Senagi, K., &amp; Tonnang, H. E. Z. (2024). A road map for developing novel decision support system (DSS) for disseminating integrated pest management (IPM) technologies. Computers and Electronics in Agriculture, 217, 108526. https://doi.org/10.1016/j.compag.2023.108526</w:t>
       </w:r>
     </w:p>
     <w:p>
-      <w:pPr/>
       <w:r>
         <w:t>Yao, J., Zhou, Z., Liu, H., Yao, S., &amp; Wu, J. (2026). Analyzing the influence of environment, demographic and socio-economic factors on Aedes albopictus (Diptera: Culicidae) mosquito density at the micro-level using XGBoost and SHAP. Parasites &amp; Vectors, 19, 71. https://doi.org/10.1186/s13071-025-07220-0</w:t>
       </w:r>
     </w:p>
     <w:p>
-      <w:pPr/>
       <w:r>
         <w:t>Zippenfenig, P. (2023). Open-Meteo.com Weather API [Computer software]. Zenodo. https://doi.org/10.5281/zenodo.7970649</w:t>
       </w:r>
@@ -18741,7 +19566,6 @@
           <w:rFonts w:ascii="Times New Roman" w:hAnsi="Times New Roman" w:cs="Times New Roman"/>
           <w:szCs w:val="24"/>
         </w:rPr>
-        <w:lastRenderedPageBreak/>
         <w:t>Area and Weather Risk</w:t>
       </w:r>
     </w:p>
@@ -18882,6 +19706,7 @@
           <w:rFonts w:ascii="Times New Roman" w:hAnsi="Times New Roman" w:cs="Times New Roman"/>
           <w:szCs w:val="24"/>
         </w:rPr>
+        <w:lastRenderedPageBreak/>
         <w:t>Upsell Intelligence</w:t>
       </w:r>
     </w:p>
@@ -19059,7 +19884,6 @@
           <w:sz w:val="24"/>
           <w:szCs w:val="24"/>
         </w:rPr>
-        <w:lastRenderedPageBreak/>
         <w:t>Appendix B: Proposed Data Warehouse Tables</w:t>
       </w:r>
     </w:p>
@@ -19596,6 +20420,7 @@
                 <w:sz w:val="24"/>
                 <w:szCs w:val="24"/>
               </w:rPr>
+              <w:lastRenderedPageBreak/>
               <w:t>fact_service</w:t>
             </w:r>
           </w:p>
@@ -20172,7 +20997,6 @@
                 <w:sz w:val="24"/>
                 <w:szCs w:val="24"/>
               </w:rPr>
-              <w:lastRenderedPageBreak/>
               <w:t>fact_recommendation_log</w:t>
             </w:r>
           </w:p>
@@ -20461,6 +21285,7 @@
                 <w:sz w:val="24"/>
                 <w:szCs w:val="24"/>
               </w:rPr>
+              <w:lastRenderedPageBreak/>
               <w:t>privacy_reporting_views</w:t>
             </w:r>
           </w:p>
@@ -21037,7 +21862,6 @@
                 <w:sz w:val="24"/>
                 <w:szCs w:val="24"/>
               </w:rPr>
-              <w:lastRenderedPageBreak/>
               <w:t>mart_recommendations</w:t>
             </w:r>
           </w:p>

</xml_diff>

<commit_message>
Add Airflow dbt data engineering scope
</commit_message>
<xml_diff>
--- a/docs/Nomobug_Capstone_Proposal_CP1_Updated.docx
+++ b/docs/Nomobug_Capstone_Proposal_CP1_Updated.docx
@@ -711,12 +711,7 @@
         </w:rPr>
       </w:pPr>
       <w:r>
-        <w:rPr>
-          <w:rFonts w:ascii="Times New Roman" w:hAnsi="Times New Roman" w:cs="Times New Roman"/>
-          <w:sz w:val="24"/>
-          <w:szCs w:val="24"/>
-        </w:rPr>
-        <w:t>This project proposes a web-based decision-support dashboard that integrates Nomobug's operational data with weather and location features to support descriptive, predictive, and prescriptive analytics. The system will use Python for extraction, validation, cleaning, transformation, weather enrichment, recurrence analysis, hotspot detection, and scoring; BigQuery as the cloud analytics warehouse; and Apache Superset as the dashboard visualization layer. The proposed analytics methods include day/week/month trend analysis, treatment difficulty scoring, warranty factor categorisation, recurrence window analysis, DBSCAN-based hotspot detection, KDE heatmap visualization, data quality monitoring, scheduled refresh, and lightweight explainable prediction where the dataset size supports it.</w:t>
+        <w:t>This project proposes a web-based decision-support dashboard supported by a data engineering pipeline. The planned CP2 system will extract data from Google Sheets, Google Calendar, CSV/Excel files, and weather APIs; load raw records into BigQuery; transform and test the data using dbt Core; orchestrate scheduled runs through Apache Airflow; and visualise dashboard-ready marts through Apache Superset. This shifts the project from a simple dashboard into an end-to-end analytics engineering workflow.</w:t>
       </w:r>
     </w:p>
     <w:p>
@@ -1117,12 +1112,7 @@
         </w:rPr>
       </w:pPr>
       <w:r>
-        <w:rPr>
-          <w:rFonts w:ascii="Times New Roman" w:hAnsi="Times New Roman" w:cs="Times New Roman"/>
-          <w:sz w:val="24"/>
-          <w:szCs w:val="24"/>
-        </w:rPr>
-        <w:t>The proposed system is therefore a web-based analytics and decision-support dashboard. During CP2, it will process operational data from Google Sheets and Google Calendar, enrich service records with weather and location features, store analytics-ready outputs in BigQuery, and present insights through Apache Superset dashboards. The system is intended to support management decision-making, not replace the company's existing workflow.</w:t>
+        <w:t>The proposed system is therefore a web-based analytics and decision-support dashboard built on a governed data engineering pipeline. During CP2, the system will process operational data from Google Sheets and Google Calendar, enrich service records with weather and location features, store raw and transformed outputs in BigQuery, use dbt Core for warehouse transformations and data tests, use Apache Airflow for orchestration, and present insights through Apache Superset dashboards. The system is intended to support management decision-making, not replace the company's existing workflow.</w:t>
       </w:r>
     </w:p>
     <w:p>
@@ -1341,6 +1331,14 @@
     </w:p>
     <w:p>
       <w:pPr>
+        <w:pStyle w:val="ListBullet"/>
+      </w:pPr>
+      <w:r>
+        <w:t>There is no automated and monitored data pipeline that can extract, validate, transform, test, and refresh these records into trusted dashboard-ready tables.</w:t>
+      </w:r>
+    </w:p>
+    <w:p>
+      <w:pPr>
         <w:pStyle w:val="Heading2"/>
         <w:spacing w:line="360" w:lineRule="auto"/>
         <w:rPr>
@@ -1383,43 +1381,23 @@
           <w:szCs w:val="24"/>
         </w:rPr>
         <w:lastRenderedPageBreak/>
-        <w:t xml:space="preserve">Google Sheets, Google Calendar, service, warranty, refund, payment, and </w:t>
+        <w:t xml:space="preserve">Google Sheets, Google Calendar, service, warranty, refund, payment, and upsell records into actionable business intelligence for service quality, treatment difficulty, recurrence monitoring, </w:t>
       </w:r>
-      <w:proofErr w:type="gramStart"/>
       <w:r>
         <w:rPr>
           <w:rFonts w:ascii="Times New Roman" w:hAnsi="Times New Roman" w:cs="Times New Roman"/>
           <w:sz w:val="24"/>
           <w:szCs w:val="24"/>
         </w:rPr>
-        <w:t>upsell</w:t>
+        <w:tab/>
       </w:r>
-      <w:proofErr w:type="gramEnd"/>
       <w:r>
         <w:rPr>
           <w:rFonts w:ascii="Times New Roman" w:hAnsi="Times New Roman" w:cs="Times New Roman"/>
           <w:sz w:val="24"/>
           <w:szCs w:val="24"/>
         </w:rPr>
-        <w:t xml:space="preserve"> records into actionable business intelligence for service quality, treatment difficulty, recurrence monitoring, area planning, and </w:t>
-      </w:r>
-      <w:proofErr w:type="gramStart"/>
-      <w:r>
-        <w:rPr>
-          <w:rFonts w:ascii="Times New Roman" w:hAnsi="Times New Roman" w:cs="Times New Roman"/>
-          <w:sz w:val="24"/>
-          <w:szCs w:val="24"/>
-        </w:rPr>
-        <w:t>upsell</w:t>
-      </w:r>
-      <w:proofErr w:type="gramEnd"/>
-      <w:r>
-        <w:rPr>
-          <w:rFonts w:ascii="Times New Roman" w:hAnsi="Times New Roman" w:cs="Times New Roman"/>
-          <w:sz w:val="24"/>
-          <w:szCs w:val="24"/>
-        </w:rPr>
-        <w:t xml:space="preserve"> strategy.</w:t>
+        <w:t xml:space="preserve"> planning, and upsell strategy.</w:t>
       </w:r>
     </w:p>
     <w:p>
@@ -1493,12 +1471,7 @@
         </w:rPr>
       </w:pPr>
       <w:r>
-        <w:rPr>
-          <w:rFonts w:ascii="Times New Roman" w:hAnsi="Times New Roman" w:cs="Times New Roman"/>
-          <w:sz w:val="24"/>
-          <w:szCs w:val="24"/>
-        </w:rPr>
-        <w:t>To develop, in CP2, a Python ETL and BigQuery warehouse workflow that cleans, validates, enriches, and stores operational data for Apache Superset dashboards.</w:t>
+        <w:t>To develop, in CP2, an Airflow-orchestrated ELT workflow using Python, BigQuery, dbt Core, flexible data contracts, and data quality checks to produce trusted analytics tables for Apache Superset dashboards.</w:t>
       </w:r>
     </w:p>
     <w:p>
@@ -1518,7 +1491,25 @@
           <w:sz w:val="24"/>
           <w:szCs w:val="24"/>
         </w:rPr>
-        <w:t>To implement descriptive, predictive, and prescriptive analytics modules for customer segmentation, treatment difficulty, warranty and repeat analysis, recurrence windows, hotspot detection, scheduling capacity, and upsell intelligence.</w:t>
+        <w:t xml:space="preserve">To implement descriptive, predictive, and prescriptive analytics modules for customer segmentation, treatment difficulty, warranty and repeat analysis, recurrence windows, hotspot detection, scheduling capacity, and </w:t>
+      </w:r>
+      <w:proofErr w:type="gramStart"/>
+      <w:r>
+        <w:rPr>
+          <w:rFonts w:ascii="Times New Roman" w:hAnsi="Times New Roman" w:cs="Times New Roman"/>
+          <w:sz w:val="24"/>
+          <w:szCs w:val="24"/>
+        </w:rPr>
+        <w:t>upsell</w:t>
+      </w:r>
+      <w:proofErr w:type="gramEnd"/>
+      <w:r>
+        <w:rPr>
+          <w:rFonts w:ascii="Times New Roman" w:hAnsi="Times New Roman" w:cs="Times New Roman"/>
+          <w:sz w:val="24"/>
+          <w:szCs w:val="24"/>
+        </w:rPr>
+        <w:t xml:space="preserve"> intelligence.</w:t>
       </w:r>
     </w:p>
     <w:p>
@@ -2010,21 +2001,8 @@
             <w:vAlign w:val="center"/>
           </w:tcPr>
           <w:p>
-            <w:pPr>
-              <w:spacing w:after="0" w:line="360" w:lineRule="auto"/>
-              <w:rPr>
-                <w:rFonts w:ascii="Times New Roman" w:hAnsi="Times New Roman" w:cs="Times New Roman"/>
-                <w:sz w:val="24"/>
-                <w:szCs w:val="24"/>
-              </w:rPr>
-            </w:pPr>
-            <w:r>
-              <w:rPr>
-                <w:rFonts w:ascii="Times New Roman" w:hAnsi="Times New Roman" w:cs="Times New Roman"/>
-                <w:sz w:val="24"/>
-                <w:szCs w:val="24"/>
-              </w:rPr>
-              <w:t>Data quality reporting, scheduled refresh, anonymised reporting views, and recommendation logging</w:t>
+            <w:r>
+              <w:t>Data quality reporting, flexible data contracts, Airflow scheduled refresh, dbt transformations/tests, anonymised reporting views, and recommendation logging</w:t>
             </w:r>
           </w:p>
         </w:tc>
@@ -2040,21 +2018,8 @@
             <w:vAlign w:val="center"/>
           </w:tcPr>
           <w:p>
-            <w:pPr>
-              <w:spacing w:after="0" w:line="360" w:lineRule="auto"/>
-              <w:rPr>
-                <w:rFonts w:ascii="Times New Roman" w:hAnsi="Times New Roman" w:cs="Times New Roman"/>
-                <w:sz w:val="24"/>
-                <w:szCs w:val="24"/>
-              </w:rPr>
-            </w:pPr>
-            <w:r>
-              <w:rPr>
-                <w:rFonts w:ascii="Times New Roman" w:hAnsi="Times New Roman" w:cs="Times New Roman"/>
-                <w:sz w:val="24"/>
-                <w:szCs w:val="24"/>
-              </w:rPr>
-              <w:t>Near-real-time refresh is not streaming real-time and depends on Google Sheets/API access</w:t>
+            <w:r>
+              <w:t>Near-real-time refresh is scheduled batch processing, not streaming real-time, and depends on Google Sheets/API access</w:t>
             </w:r>
           </w:p>
         </w:tc>
@@ -2121,6 +2086,28 @@
                 <w:szCs w:val="24"/>
               </w:rPr>
               <w:t>The AI layer will not make final decisions; it will explain analytics-backed recommendations</w:t>
+            </w:r>
+          </w:p>
+        </w:tc>
+      </w:tr>
+      <w:tr>
+        <w:tc>
+          <w:tcPr>
+            <w:tcW w:type="dxa" w:w="4710"/>
+          </w:tcPr>
+          <w:p>
+            <w:r>
+              <w:t>Bronze/Silver/Gold BigQuery warehouse layers, pipeline logs, lineage documentation, and dashboard-ready marts</w:t>
+            </w:r>
+          </w:p>
+        </w:tc>
+        <w:tc>
+          <w:tcPr>
+            <w:tcW w:type="dxa" w:w="4306"/>
+          </w:tcPr>
+          <w:p>
+            <w:r>
+              <w:t>The project will not attempt enterprise-scale streaming, complex MLOps, or production-grade multi-user access control</w:t>
             </w:r>
           </w:p>
         </w:tc>
@@ -2361,15 +2348,43 @@
           <w:sz w:val="24"/>
           <w:szCs w:val="24"/>
         </w:rPr>
-        <w:t>Schulze et al. (2023) provide a systematic review of digital dashboards and show that dashboards are most useful when they combine clear visual design, reliable data, and action-oriented communication. This supports the proposed use of Apache Superset dashboards for management users who need to scan key service, warranty, payment, and scheduling indicators quickly. Blacketer et al. (2021) further demonstrate the value of a dedicated data quality dashboard, showing that decision-makers need visibility into c</w:t>
+        <w:t xml:space="preserve">Schulze et al. (2023) </w:t>
       </w:r>
+      <w:proofErr w:type="gramStart"/>
       <w:r>
         <w:rPr>
           <w:rFonts w:ascii="Times New Roman" w:hAnsi="Times New Roman" w:cs="Times New Roman"/>
           <w:sz w:val="24"/>
           <w:szCs w:val="24"/>
         </w:rPr>
-        <w:t xml:space="preserve">ompleteness, conformance, and data reliability before trusting analytical outputs. For Nomobug, this </w:t>
+        <w:t>provide</w:t>
+      </w:r>
+      <w:proofErr w:type="gramEnd"/>
+      <w:r>
+        <w:rPr>
+          <w:rFonts w:ascii="Times New Roman" w:hAnsi="Times New Roman" w:cs="Times New Roman"/>
+          <w:sz w:val="24"/>
+          <w:szCs w:val="24"/>
+        </w:rPr>
+        <w:t xml:space="preserve"> a systematic review of digital dashboards and </w:t>
+      </w:r>
+      <w:proofErr w:type="gramStart"/>
+      <w:r>
+        <w:rPr>
+          <w:rFonts w:ascii="Times New Roman" w:hAnsi="Times New Roman" w:cs="Times New Roman"/>
+          <w:sz w:val="24"/>
+          <w:szCs w:val="24"/>
+        </w:rPr>
+        <w:t>show</w:t>
+      </w:r>
+      <w:proofErr w:type="gramEnd"/>
+      <w:r>
+        <w:rPr>
+          <w:rFonts w:ascii="Times New Roman" w:hAnsi="Times New Roman" w:cs="Times New Roman"/>
+          <w:sz w:val="24"/>
+          <w:szCs w:val="24"/>
+        </w:rPr>
+        <w:t xml:space="preserve"> that dashboards are most useful when they combine clear visual design, reliable data, and action-oriented communication. This supports the proposed use of Apache Superset dashboards for management users who need to scan key service, warranty, payment, and scheduling indicators quickly. Blacketer et al. (2021) further demonstrate the value of a dedicated data quality dashboard, showing that decision-makers need visibility into completeness, conformance, and data reliability before trusting analytical outputs. For Nomobug, this </w:t>
       </w:r>
       <w:proofErr w:type="gramStart"/>
       <w:r>
@@ -2698,15 +2713,7 @@
           <w:sz w:val="24"/>
           <w:szCs w:val="24"/>
         </w:rPr>
-        <w:t xml:space="preserve"> the need for practical architectures that connect data sources, models, and user-facing decision outputs. Although their focus is agricultural IPM, the architecture principle is highly relevant to this project because the Nomobug system will connect operational data, weather enrichment, analytics marts, and dashboard recommendations. Marinko et al. (2024) also develop a typology for IPM decision support sy</w:t>
-      </w:r>
-      <w:r>
-        <w:rPr>
-          <w:rFonts w:ascii="Times New Roman" w:hAnsi="Times New Roman" w:cs="Times New Roman"/>
-          <w:sz w:val="24"/>
-          <w:szCs w:val="24"/>
-        </w:rPr>
-        <w:t>stems and implement it as a web application, showing that DSS features must be classified clearly so users understand whether the system provides monitoring, prediction, recommendation, or advisory support.</w:t>
+        <w:t xml:space="preserve"> the need for practical architectures that connect data sources, models, and user-facing decision outputs. Although their focus is agricultural IPM, the architecture principle is highly relevant to this project because the Nomobug system will connect operational data, weather enrichment, analytics marts, and dashboard recommendations. Marinko et al. (2024) also develop a typology for IPM decision support systems and implement it as a web application, showing that DSS features must be classified clearly so users understand whether the system provides monitoring, prediction, recommendation, or advisory support.</w:t>
       </w:r>
     </w:p>
     <w:p>
@@ -2735,15 +2742,7 @@
           <w:sz w:val="24"/>
           <w:szCs w:val="24"/>
         </w:rPr>
-        <w:t>Fiori et al. (2024) present SMARTerra, a high-resolution DSS for monitoring plant pests and diseases through risk maps and timely intervention support. This strengthens the justification for using weather-associated risk maps and area-level planning views in Nomobug. Marinko et al. (2025) examine barriers to DSS adoption in integrated pest management and show that practical uptake depends on trust, usability, data availability, and perceived usefulness. This is important for the capstone because the dashboa</w:t>
-      </w:r>
-      <w:r>
-        <w:rPr>
-          <w:rFonts w:ascii="Times New Roman" w:hAnsi="Times New Roman" w:cs="Times New Roman"/>
-          <w:sz w:val="24"/>
-          <w:szCs w:val="24"/>
-        </w:rPr>
-        <w:t xml:space="preserve">rd must be understandable to company users, </w:t>
+        <w:t xml:space="preserve">Fiori et al. (2024) present SMARTerra, a high-resolution DSS for monitoring plant pests and diseases through risk maps and timely intervention support. This strengthens the justification for using weather-associated risk maps and area-level planning views in Nomobug. Marinko et al. (2025) examine barriers to DSS adoption in integrated pest management and show that practical uptake depends on trust, usability, data availability, and perceived usefulness. This is important for the capstone because the dashboard must be understandable to company users, </w:t>
       </w:r>
       <w:proofErr w:type="gramStart"/>
       <w:r>
@@ -2868,15 +2867,7 @@
           <w:sz w:val="24"/>
           <w:szCs w:val="24"/>
         </w:rPr>
-        <w:t>Choi and Hong (2021) propose MDST-DBSCAN for multidimensional spatiotemporal data and show that density-based methods can identify clusters while supporting irregular cluster shapes and noise separation. This supports the choice of DBSCAN-style hotspot detection for repeat-problem and warranty records, because pest service outcomes may cluster around small local areas rather than fixed administrative boundaries. The proposed project will keep the method simpler than MDST-DBSCAN for implementation, but the s</w:t>
-      </w:r>
-      <w:r>
-        <w:rPr>
-          <w:rFonts w:ascii="Times New Roman" w:hAnsi="Times New Roman" w:cs="Times New Roman"/>
-          <w:sz w:val="24"/>
-          <w:szCs w:val="24"/>
-        </w:rPr>
-        <w:t>tudy supports the suitability of density-based clustering for spatiotemporal analysis.</w:t>
+        <w:t>Choi and Hong (2021) propose MDST-DBSCAN for multidimensional spatiotemporal data and show that density-based methods can identify clusters while supporting irregular cluster shapes and noise separation. This supports the choice of DBSCAN-style hotspot detection for repeat-problem and warranty records, because pest service outcomes may cluster around small local areas rather than fixed administrative boundaries. The proposed project will keep the method simpler than MDST-DBSCAN for implementation, but the study supports the suitability of density-based clustering for spatiotemporal analysis.</w:t>
       </w:r>
     </w:p>
     <w:p>
@@ -3002,15 +2993,7 @@
           <w:sz w:val="24"/>
           <w:szCs w:val="24"/>
         </w:rPr>
-        <w:t>Yao et al. (2026) use XGBoost and SHAP to analyse environmental, demographic, and socio-economic factors associated with mosquito density. This demonstrates the value of explainability when environmental factors are used in pest-related modelling. However, the proposed Nomobug system will treat SHAP-style explanations as future work or optional model interpretation, because the first implementation should prioritise robust descriptive, spatial, and recurrence analytics over complex models that may overfit l</w:t>
-      </w:r>
-      <w:r>
-        <w:rPr>
-          <w:rFonts w:ascii="Times New Roman" w:hAnsi="Times New Roman" w:cs="Times New Roman"/>
-          <w:sz w:val="24"/>
-          <w:szCs w:val="24"/>
-        </w:rPr>
-        <w:t>imited warranty data.</w:t>
+        <w:t>Yao et al. (2026) use XGBoost and SHAP to analyse environmental, demographic, and socio-economic factors associated with mosquito density. This demonstrates the value of explainability when environmental factors are used in pest-related modelling. However, the proposed Nomobug system will treat SHAP-style explanations as future work or optional model interpretation, because the first implementation should prioritise robust descriptive, spatial, and recurrence analytics over complex models that may overfit limited warranty data.</w:t>
       </w:r>
     </w:p>
     <w:p>
@@ -3126,15 +3109,7 @@
           <w:sz w:val="24"/>
           <w:szCs w:val="24"/>
         </w:rPr>
-        <w:t>Leybourne et al. (2025) discuss whether AI can be integrated into pest monitoring schemes and emphasise that successful AI use requires both computational capability and practical acceptance by domain users. This supports the project's decision to keep Ollama as a future local explanation layer rather than making generative AI the main decision engine. Recommendations should first be produced by transparent analytics rules and stored in a recommendation log; local AI can later translate those results into c</w:t>
-      </w:r>
-      <w:r>
-        <w:rPr>
-          <w:rFonts w:ascii="Times New Roman" w:hAnsi="Times New Roman" w:cs="Times New Roman"/>
-          <w:sz w:val="24"/>
-          <w:szCs w:val="24"/>
-        </w:rPr>
-        <w:t>learer management-facing explanations.</w:t>
+        <w:t>Leybourne et al. (2025) discuss whether AI can be integrated into pest monitoring schemes and emphasise that successful AI use requires both computational capability and practical acceptance by domain users. This supports the project's decision to keep Ollama as a future local explanation layer rather than making generative AI the main decision engine. Recommendations should first be produced by transparent analytics rules and stored in a recommendation log; local AI can later translate those results into clearer management-facing explanations.</w:t>
       </w:r>
     </w:p>
     <w:p>
@@ -6647,12 +6622,7 @@
         </w:rPr>
       </w:pPr>
       <w:r>
-        <w:rPr>
-          <w:rFonts w:ascii="Times New Roman" w:hAnsi="Times New Roman" w:cs="Times New Roman"/>
-          <w:sz w:val="24"/>
-          <w:szCs w:val="24"/>
-        </w:rPr>
-        <w:t>The project will follow an applied data analytics development methodology. The process begins with data understanding and cleaning, then moves into data integration, feature engineering, analytics modelling, dashboard development, and evaluation with company users. The methodology is designed to suit messy SME data and a limited warranty dataset, so explainability and actionability are prioritised over complex black-box machine learning.</w:t>
+        <w:t>The project will follow an applied data engineering and analytics development methodology. The process begins with data understanding and source profiling, then moves into flexible data contracts, extraction, raw loading, warehouse transformation, data quality testing, weather enrichment, analytics modelling, dashboard development, and evaluation with company users. The methodology is designed to suit messy SME data and a limited warranty dataset, so explainability and data reliability are prioritised over complex black-box machine learning.</w:t>
       </w:r>
     </w:p>
     <w:tbl>
@@ -7679,30 +7649,7 @@
         </w:rPr>
       </w:pPr>
       <w:r>
-        <w:rPr>
-          <w:rFonts w:ascii="Times New Roman" w:hAnsi="Times New Roman" w:cs="Times New Roman"/>
-          <w:sz w:val="24"/>
-          <w:szCs w:val="24"/>
-        </w:rPr>
-        <w:t xml:space="preserve">The selected architecture is Google Sheets or CSV/Excel as the raw data source, Python as the ETL and analytics engine, BigQuery as the cloud analytics warehouse, Apache Superset as the visualization layer, and optional local Ollama as a future AI recommendation layer. Docker will be used for local reproducibility where suitable, especially for Superset, the Python worker, and future </w:t>
-      </w:r>
-      <w:proofErr w:type="spellStart"/>
-      <w:r>
-        <w:rPr>
-          <w:rFonts w:ascii="Times New Roman" w:hAnsi="Times New Roman" w:cs="Times New Roman"/>
-          <w:sz w:val="24"/>
-          <w:szCs w:val="24"/>
-        </w:rPr>
-        <w:t>Ollama</w:t>
-      </w:r>
-      <w:proofErr w:type="spellEnd"/>
-      <w:r>
-        <w:rPr>
-          <w:rFonts w:ascii="Times New Roman" w:hAnsi="Times New Roman" w:cs="Times New Roman"/>
-          <w:sz w:val="24"/>
-          <w:szCs w:val="24"/>
-        </w:rPr>
-        <w:t xml:space="preserve"> testing.</w:t>
+        <w:t>The selected architecture is Google Sheets or CSV/Excel as the raw data source, Google Calendar as a scheduling source, Python as the extraction/loading layer, Apache Airflow as the pipeline orchestrator, BigQuery as the cloud analytics warehouse, dbt Core as the warehouse transformation and testing layer, Apache Superset as the visualization layer, and optional local Ollama as a future AI recommendation layer. Docker will be used to package local services such as Airflow, Superset, and future Ollama where practical.</w:t>
       </w:r>
     </w:p>
     <w:p>
@@ -7727,30 +7674,7 @@
         </w:rPr>
       </w:pPr>
       <w:r>
-        <w:rPr>
-          <w:rFonts w:ascii="Times New Roman" w:hAnsi="Times New Roman" w:cs="Times New Roman"/>
-          <w:sz w:val="24"/>
-          <w:szCs w:val="24"/>
-        </w:rPr>
-        <w:t xml:space="preserve">The workflow is designed as a controlled analytics pipeline. Raw data is first extracted from Google Sheets, CSV/Excel exports, and Google Calendar. The Python ETL process validates the records, standardises field values, flags data quality issues, enriches services with weather and location features, and loads the output into BigQuery. BigQuery then stores three layers: raw staging tables, cleaned core tables, and dashboard-ready marts. Superset reads only the cleaned core or mart </w:t>
-      </w:r>
-      <w:proofErr w:type="gramStart"/>
-      <w:r>
-        <w:rPr>
-          <w:rFonts w:ascii="Times New Roman" w:hAnsi="Times New Roman" w:cs="Times New Roman"/>
-          <w:sz w:val="24"/>
-          <w:szCs w:val="24"/>
-        </w:rPr>
-        <w:t>tables</w:t>
-      </w:r>
-      <w:proofErr w:type="gramEnd"/>
-      <w:r>
-        <w:rPr>
-          <w:rFonts w:ascii="Times New Roman" w:hAnsi="Times New Roman" w:cs="Times New Roman"/>
-          <w:sz w:val="24"/>
-          <w:szCs w:val="24"/>
-        </w:rPr>
-        <w:t xml:space="preserve"> so users do not need to interact with raw inconsistent records.</w:t>
+        <w:t>The workflow is designed as a controlled ELT pipeline. Raw data is first extracted from Google Sheets, CSV/Excel exports, Google Calendar, and weather APIs. Python loaders write the raw source records into BigQuery Bronze tables with source metadata. dbt Core then transforms these records into Silver cleaned tables and Gold dashboard marts, while dbt tests and validation tables record data quality issues. Apache Airflow orchestrates the extraction, loading, dbt transformation, testing, weather enrichment, and refresh-log tasks so that the dashboard can show whether the latest data is fresh and reliable.</w:t>
       </w:r>
     </w:p>
     <w:tbl>
@@ -7984,21 +7908,8 @@
             <w:vAlign w:val="center"/>
           </w:tcPr>
           <w:p>
-            <w:pPr>
-              <w:spacing w:after="0" w:line="360" w:lineRule="auto"/>
-              <w:rPr>
-                <w:rFonts w:ascii="Times New Roman" w:hAnsi="Times New Roman" w:cs="Times New Roman"/>
-                <w:sz w:val="24"/>
-                <w:szCs w:val="24"/>
-              </w:rPr>
-            </w:pPr>
-            <w:r>
-              <w:rPr>
-                <w:rFonts w:ascii="Times New Roman" w:hAnsi="Times New Roman" w:cs="Times New Roman"/>
-                <w:sz w:val="24"/>
-                <w:szCs w:val="24"/>
-              </w:rPr>
-              <w:t>ETL and analytics</w:t>
+            <w:r>
+              <w:t>Extract/load and analytics</w:t>
             </w:r>
           </w:p>
         </w:tc>
@@ -8014,21 +7925,8 @@
             <w:vAlign w:val="center"/>
           </w:tcPr>
           <w:p>
-            <w:pPr>
-              <w:spacing w:after="0" w:line="360" w:lineRule="auto"/>
-              <w:rPr>
-                <w:rFonts w:ascii="Times New Roman" w:hAnsi="Times New Roman" w:cs="Times New Roman"/>
-                <w:sz w:val="24"/>
-                <w:szCs w:val="24"/>
-              </w:rPr>
-            </w:pPr>
-            <w:r>
-              <w:rPr>
-                <w:rFonts w:ascii="Times New Roman" w:hAnsi="Times New Roman" w:cs="Times New Roman"/>
-                <w:sz w:val="24"/>
-                <w:szCs w:val="24"/>
-              </w:rPr>
-              <w:t>Python, Pandas, scikit-learn, BigQuery client</w:t>
+            <w:r>
+              <w:t>Python, Pandas, BigQuery client, scikit-learn where appropriate</w:t>
             </w:r>
           </w:p>
         </w:tc>
@@ -8044,21 +7942,8 @@
             <w:vAlign w:val="center"/>
           </w:tcPr>
           <w:p>
-            <w:pPr>
-              <w:spacing w:after="0" w:line="360" w:lineRule="auto"/>
-              <w:rPr>
-                <w:rFonts w:ascii="Times New Roman" w:hAnsi="Times New Roman" w:cs="Times New Roman"/>
-                <w:sz w:val="24"/>
-                <w:szCs w:val="24"/>
-              </w:rPr>
-            </w:pPr>
-            <w:r>
-              <w:rPr>
-                <w:rFonts w:ascii="Times New Roman" w:hAnsi="Times New Roman" w:cs="Times New Roman"/>
-                <w:sz w:val="24"/>
-                <w:szCs w:val="24"/>
-              </w:rPr>
-              <w:t>Cleaning, enrichment, feature engineering, clustering, scoring</w:t>
+            <w:r>
+              <w:t>Extract source data, load Bronze tables, run weather enrichment, and compute selected analytics outputs</w:t>
             </w:r>
           </w:p>
         </w:tc>
@@ -8080,21 +7965,7 @@
             <w:vAlign w:val="center"/>
           </w:tcPr>
           <w:p>
-            <w:pPr>
-              <w:spacing w:after="0" w:line="360" w:lineRule="auto"/>
-              <w:rPr>
-                <w:rFonts w:ascii="Times New Roman" w:hAnsi="Times New Roman" w:cs="Times New Roman"/>
-                <w:sz w:val="24"/>
-                <w:szCs w:val="24"/>
-              </w:rPr>
-            </w:pPr>
-            <w:r>
-              <w:rPr>
-                <w:rFonts w:ascii="Times New Roman" w:hAnsi="Times New Roman" w:cs="Times New Roman"/>
-                <w:sz w:val="24"/>
-                <w:szCs w:val="24"/>
-              </w:rPr>
-              <w:lastRenderedPageBreak/>
+            <w:r>
               <w:t>Cloud warehouse</w:t>
             </w:r>
           </w:p>
@@ -8111,20 +7982,7 @@
             <w:vAlign w:val="center"/>
           </w:tcPr>
           <w:p>
-            <w:pPr>
-              <w:spacing w:after="0" w:line="360" w:lineRule="auto"/>
-              <w:rPr>
-                <w:rFonts w:ascii="Times New Roman" w:hAnsi="Times New Roman" w:cs="Times New Roman"/>
-                <w:sz w:val="24"/>
-                <w:szCs w:val="24"/>
-              </w:rPr>
-            </w:pPr>
-            <w:r>
-              <w:rPr>
-                <w:rFonts w:ascii="Times New Roman" w:hAnsi="Times New Roman" w:cs="Times New Roman"/>
-                <w:sz w:val="24"/>
-                <w:szCs w:val="24"/>
-              </w:rPr>
+            <w:r>
               <w:t>Google BigQuery</w:t>
             </w:r>
           </w:p>
@@ -8141,21 +7999,8 @@
             <w:vAlign w:val="center"/>
           </w:tcPr>
           <w:p>
-            <w:pPr>
-              <w:spacing w:after="0" w:line="360" w:lineRule="auto"/>
-              <w:rPr>
-                <w:rFonts w:ascii="Times New Roman" w:hAnsi="Times New Roman" w:cs="Times New Roman"/>
-                <w:sz w:val="24"/>
-                <w:szCs w:val="24"/>
-              </w:rPr>
-            </w:pPr>
-            <w:r>
-              <w:rPr>
-                <w:rFonts w:ascii="Times New Roman" w:hAnsi="Times New Roman" w:cs="Times New Roman"/>
-                <w:sz w:val="24"/>
-                <w:szCs w:val="24"/>
-              </w:rPr>
-              <w:t>Store raw, cleaned, and dashboard-ready analytics tables</w:t>
+            <w:r>
+              <w:t>Store Bronze raw, Silver cleaned, and Gold dashboard-ready analytics tables</w:t>
             </w:r>
           </w:p>
         </w:tc>
@@ -8273,21 +8118,8 @@
             <w:vAlign w:val="center"/>
           </w:tcPr>
           <w:p>
-            <w:pPr>
-              <w:spacing w:after="0" w:line="360" w:lineRule="auto"/>
-              <w:rPr>
-                <w:rFonts w:ascii="Times New Roman" w:hAnsi="Times New Roman" w:cs="Times New Roman"/>
-                <w:sz w:val="24"/>
-                <w:szCs w:val="24"/>
-              </w:rPr>
-            </w:pPr>
-            <w:r>
-              <w:rPr>
-                <w:rFonts w:ascii="Times New Roman" w:hAnsi="Times New Roman" w:cs="Times New Roman"/>
-                <w:sz w:val="24"/>
-                <w:szCs w:val="24"/>
-              </w:rPr>
-              <w:t>Refresh pipeline</w:t>
+            <w:r>
+              <w:t>Orchestration</w:t>
             </w:r>
           </w:p>
         </w:tc>
@@ -8303,21 +8135,8 @@
             <w:vAlign w:val="center"/>
           </w:tcPr>
           <w:p>
-            <w:pPr>
-              <w:spacing w:after="0" w:line="360" w:lineRule="auto"/>
-              <w:rPr>
-                <w:rFonts w:ascii="Times New Roman" w:hAnsi="Times New Roman" w:cs="Times New Roman"/>
-                <w:sz w:val="24"/>
-                <w:szCs w:val="24"/>
-              </w:rPr>
-            </w:pPr>
-            <w:r>
-              <w:rPr>
-                <w:rFonts w:ascii="Times New Roman" w:hAnsi="Times New Roman" w:cs="Times New Roman"/>
-                <w:sz w:val="24"/>
-                <w:szCs w:val="24"/>
-              </w:rPr>
-              <w:t>Scheduled Python ETL or BigQuery scheduled queries</w:t>
+            <w:r>
+              <w:t>Apache Airflow</w:t>
             </w:r>
           </w:p>
         </w:tc>
@@ -8333,21 +8152,8 @@
             <w:vAlign w:val="center"/>
           </w:tcPr>
           <w:p>
-            <w:pPr>
-              <w:spacing w:after="0" w:line="360" w:lineRule="auto"/>
-              <w:rPr>
-                <w:rFonts w:ascii="Times New Roman" w:hAnsi="Times New Roman" w:cs="Times New Roman"/>
-                <w:sz w:val="24"/>
-                <w:szCs w:val="24"/>
-              </w:rPr>
-            </w:pPr>
-            <w:r>
-              <w:rPr>
-                <w:rFonts w:ascii="Times New Roman" w:hAnsi="Times New Roman" w:cs="Times New Roman"/>
-                <w:sz w:val="24"/>
-                <w:szCs w:val="24"/>
-              </w:rPr>
-              <w:t>Daily or weekly near-real-time refresh of analytics tables</w:t>
+            <w:r>
+              <w:t>Schedule, monitor, retry, and log ELT pipeline tasks</w:t>
             </w:r>
           </w:p>
         </w:tc>
@@ -8369,21 +8175,8 @@
             <w:vAlign w:val="center"/>
           </w:tcPr>
           <w:p>
-            <w:pPr>
-              <w:spacing w:after="0" w:line="360" w:lineRule="auto"/>
-              <w:rPr>
-                <w:rFonts w:ascii="Times New Roman" w:hAnsi="Times New Roman" w:cs="Times New Roman"/>
-                <w:sz w:val="24"/>
-                <w:szCs w:val="24"/>
-              </w:rPr>
-            </w:pPr>
-            <w:r>
-              <w:rPr>
-                <w:rFonts w:ascii="Times New Roman" w:hAnsi="Times New Roman" w:cs="Times New Roman"/>
-                <w:sz w:val="24"/>
-                <w:szCs w:val="24"/>
-              </w:rPr>
-              <w:t>Governance</w:t>
+            <w:r>
+              <w:t>Transformation and testing</w:t>
             </w:r>
           </w:p>
         </w:tc>
@@ -8399,21 +8192,8 @@
             <w:vAlign w:val="center"/>
           </w:tcPr>
           <w:p>
-            <w:pPr>
-              <w:spacing w:after="0" w:line="360" w:lineRule="auto"/>
-              <w:rPr>
-                <w:rFonts w:ascii="Times New Roman" w:hAnsi="Times New Roman" w:cs="Times New Roman"/>
-                <w:sz w:val="24"/>
-                <w:szCs w:val="24"/>
-              </w:rPr>
-            </w:pPr>
-            <w:r>
-              <w:rPr>
-                <w:rFonts w:ascii="Times New Roman" w:hAnsi="Times New Roman" w:cs="Times New Roman"/>
-                <w:sz w:val="24"/>
-                <w:szCs w:val="24"/>
-              </w:rPr>
-              <w:t>Anonymised views and validation logs</w:t>
+            <w:r>
+              <w:t>dbt Core</w:t>
             </w:r>
           </w:p>
         </w:tc>
@@ -8429,21 +8209,8 @@
             <w:vAlign w:val="center"/>
           </w:tcPr>
           <w:p>
-            <w:pPr>
-              <w:spacing w:after="0" w:line="360" w:lineRule="auto"/>
-              <w:rPr>
-                <w:rFonts w:ascii="Times New Roman" w:hAnsi="Times New Roman" w:cs="Times New Roman"/>
-                <w:sz w:val="24"/>
-                <w:szCs w:val="24"/>
-              </w:rPr>
-            </w:pPr>
-            <w:r>
-              <w:rPr>
-                <w:rFonts w:ascii="Times New Roman" w:hAnsi="Times New Roman" w:cs="Times New Roman"/>
-                <w:sz w:val="24"/>
-                <w:szCs w:val="24"/>
-              </w:rPr>
-              <w:t>Protect customer data and show data quality status</w:t>
+            <w:r>
+              <w:t>Build SQL models, data tests, documentation, and lineage for BigQuery tables</w:t>
             </w:r>
           </w:p>
         </w:tc>
@@ -8636,6 +8403,38 @@
                 <w:szCs w:val="24"/>
               </w:rPr>
               <w:t>Reproducible setup for demo and company handover</w:t>
+            </w:r>
+          </w:p>
+        </w:tc>
+      </w:tr>
+      <w:tr>
+        <w:tc>
+          <w:tcPr>
+            <w:tcW w:type="dxa" w:w="3038"/>
+          </w:tcPr>
+          <w:p>
+            <w:r>
+              <w:t>Governance and quality</w:t>
+            </w:r>
+          </w:p>
+        </w:tc>
+        <w:tc>
+          <w:tcPr>
+            <w:tcW w:type="dxa" w:w="2862"/>
+          </w:tcPr>
+          <w:p>
+            <w:r>
+              <w:t>dbt tests, validation logs, anonymised views</w:t>
+            </w:r>
+          </w:p>
+        </w:tc>
+        <w:tc>
+          <w:tcPr>
+            <w:tcW w:type="dxa" w:w="3116"/>
+          </w:tcPr>
+          <w:p>
+            <w:r>
+              <w:t>Protect customer data and show data quality, contract, and refresh status</w:t>
             </w:r>
           </w:p>
         </w:tc>
@@ -8681,12 +8480,7 @@
         </w:rPr>
       </w:pPr>
       <w:r>
-        <w:rPr>
-          <w:rFonts w:ascii="Times New Roman" w:hAnsi="Times New Roman" w:cs="Times New Roman"/>
-          <w:sz w:val="24"/>
-          <w:szCs w:val="24"/>
-        </w:rPr>
-        <w:t>BigQuery is selected because the project is analytics-oriented and the company data is already connected to the Google ecosystem. BigQuery removes the need to maintain a database server while still allowing SQL-based modelling, scheduled queries, partitioned tables, and dashboard connections. The warehouse will be organised into three logical layers.</w:t>
+        <w:t>BigQuery is selected because the project is analytics-oriented and the company data is connected to the Google ecosystem. BigQuery removes the need to maintain a database server while still allowing SQL-based modelling, scheduled queries, partitioned tables, and dashboard connections. The warehouse will follow a Bronze, Silver, and Gold design: Bronze tables preserve raw source records, Silver tables standardise entities and facts, and Gold marts serve dashboard-ready analytics to Superset.</w:t>
       </w:r>
     </w:p>
     <w:tbl>
@@ -8720,22 +8514,7 @@
             <w:vAlign w:val="center"/>
           </w:tcPr>
           <w:p>
-            <w:pPr>
-              <w:spacing w:after="0" w:line="360" w:lineRule="auto"/>
-              <w:rPr>
-                <w:rFonts w:ascii="Times New Roman" w:hAnsi="Times New Roman" w:cs="Times New Roman"/>
-                <w:sz w:val="24"/>
-                <w:szCs w:val="24"/>
-              </w:rPr>
-            </w:pPr>
-            <w:r>
-              <w:rPr>
-                <w:rFonts w:ascii="Times New Roman" w:hAnsi="Times New Roman" w:cs="Times New Roman"/>
-                <w:b/>
-                <w:color w:val="142332"/>
-                <w:sz w:val="24"/>
-                <w:szCs w:val="24"/>
-              </w:rPr>
+            <w:r>
               <w:t>Layer</w:t>
             </w:r>
           </w:p>
@@ -8753,22 +8532,7 @@
             <w:vAlign w:val="center"/>
           </w:tcPr>
           <w:p>
-            <w:pPr>
-              <w:spacing w:after="0" w:line="360" w:lineRule="auto"/>
-              <w:rPr>
-                <w:rFonts w:ascii="Times New Roman" w:hAnsi="Times New Roman" w:cs="Times New Roman"/>
-                <w:sz w:val="24"/>
-                <w:szCs w:val="24"/>
-              </w:rPr>
-            </w:pPr>
-            <w:r>
-              <w:rPr>
-                <w:rFonts w:ascii="Times New Roman" w:hAnsi="Times New Roman" w:cs="Times New Roman"/>
-                <w:b/>
-                <w:color w:val="142332"/>
-                <w:sz w:val="24"/>
-                <w:szCs w:val="24"/>
-              </w:rPr>
+            <w:r>
               <w:t>Purpose</w:t>
             </w:r>
           </w:p>
@@ -8786,22 +8550,7 @@
             <w:vAlign w:val="center"/>
           </w:tcPr>
           <w:p>
-            <w:pPr>
-              <w:spacing w:after="0" w:line="360" w:lineRule="auto"/>
-              <w:rPr>
-                <w:rFonts w:ascii="Times New Roman" w:hAnsi="Times New Roman" w:cs="Times New Roman"/>
-                <w:sz w:val="24"/>
-                <w:szCs w:val="24"/>
-              </w:rPr>
-            </w:pPr>
-            <w:r>
-              <w:rPr>
-                <w:rFonts w:ascii="Times New Roman" w:hAnsi="Times New Roman" w:cs="Times New Roman"/>
-                <w:b/>
-                <w:color w:val="142332"/>
-                <w:sz w:val="24"/>
-                <w:szCs w:val="24"/>
-              </w:rPr>
+            <w:r>
               <w:t>Example Tables</w:t>
             </w:r>
           </w:p>
@@ -8824,21 +8573,8 @@
             <w:vAlign w:val="center"/>
           </w:tcPr>
           <w:p>
-            <w:pPr>
-              <w:spacing w:after="0" w:line="360" w:lineRule="auto"/>
-              <w:rPr>
-                <w:rFonts w:ascii="Times New Roman" w:hAnsi="Times New Roman" w:cs="Times New Roman"/>
-                <w:sz w:val="24"/>
-                <w:szCs w:val="24"/>
-              </w:rPr>
-            </w:pPr>
-            <w:r>
-              <w:rPr>
-                <w:rFonts w:ascii="Times New Roman" w:hAnsi="Times New Roman" w:cs="Times New Roman"/>
-                <w:sz w:val="24"/>
-                <w:szCs w:val="24"/>
-              </w:rPr>
-              <w:t>Staging</w:t>
+            <w:r>
+              <w:t>Bronze raw</w:t>
             </w:r>
           </w:p>
         </w:tc>
@@ -8854,21 +8590,8 @@
             <w:vAlign w:val="center"/>
           </w:tcPr>
           <w:p>
-            <w:pPr>
-              <w:spacing w:after="0" w:line="360" w:lineRule="auto"/>
-              <w:rPr>
-                <w:rFonts w:ascii="Times New Roman" w:hAnsi="Times New Roman" w:cs="Times New Roman"/>
-                <w:sz w:val="24"/>
-                <w:szCs w:val="24"/>
-              </w:rPr>
-            </w:pPr>
-            <w:r>
-              <w:rPr>
-                <w:rFonts w:ascii="Times New Roman" w:hAnsi="Times New Roman" w:cs="Times New Roman"/>
-                <w:sz w:val="24"/>
-                <w:szCs w:val="24"/>
-              </w:rPr>
-              <w:t>Store raw imported data with minimal transformation</w:t>
+            <w:r>
+              <w:t>Store raw imported data with minimal transformation and source metadata</w:t>
             </w:r>
           </w:p>
         </w:tc>
@@ -8884,21 +8607,8 @@
             <w:vAlign w:val="center"/>
           </w:tcPr>
           <w:p>
-            <w:pPr>
-              <w:spacing w:after="0" w:line="360" w:lineRule="auto"/>
-              <w:rPr>
-                <w:rFonts w:ascii="Times New Roman" w:hAnsi="Times New Roman" w:cs="Times New Roman"/>
-                <w:sz w:val="24"/>
-                <w:szCs w:val="24"/>
-              </w:rPr>
-            </w:pPr>
-            <w:r>
-              <w:rPr>
-                <w:rFonts w:ascii="Times New Roman" w:hAnsi="Times New Roman" w:cs="Times New Roman"/>
-                <w:sz w:val="24"/>
-                <w:szCs w:val="24"/>
-              </w:rPr>
-              <w:t>stg_customers, stg_services, stg_warranty_claims, stg_refunds, stg_calendar_events</w:t>
+            <w:r>
+              <w:t>bronze_google_sheets_services, bronze_calendar_events, bronze_open_meteo_weather</w:t>
             </w:r>
           </w:p>
         </w:tc>
@@ -8920,22 +8630,8 @@
             <w:vAlign w:val="center"/>
           </w:tcPr>
           <w:p>
-            <w:pPr>
-              <w:spacing w:after="0" w:line="360" w:lineRule="auto"/>
-              <w:rPr>
-                <w:rFonts w:ascii="Times New Roman" w:hAnsi="Times New Roman" w:cs="Times New Roman"/>
-                <w:sz w:val="24"/>
-                <w:szCs w:val="24"/>
-              </w:rPr>
-            </w:pPr>
-            <w:r>
-              <w:rPr>
-                <w:rFonts w:ascii="Times New Roman" w:hAnsi="Times New Roman" w:cs="Times New Roman"/>
-                <w:sz w:val="24"/>
-                <w:szCs w:val="24"/>
-              </w:rPr>
-              <w:lastRenderedPageBreak/>
-              <w:t>Cleaned core</w:t>
+            <w:r>
+              <w:t>Silver cleaned</w:t>
             </w:r>
           </w:p>
         </w:tc>
@@ -8951,21 +8647,8 @@
             <w:vAlign w:val="center"/>
           </w:tcPr>
           <w:p>
-            <w:pPr>
-              <w:spacing w:after="0" w:line="360" w:lineRule="auto"/>
-              <w:rPr>
-                <w:rFonts w:ascii="Times New Roman" w:hAnsi="Times New Roman" w:cs="Times New Roman"/>
-                <w:sz w:val="24"/>
-                <w:szCs w:val="24"/>
-              </w:rPr>
-            </w:pPr>
-            <w:r>
-              <w:rPr>
-                <w:rFonts w:ascii="Times New Roman" w:hAnsi="Times New Roman" w:cs="Times New Roman"/>
-                <w:sz w:val="24"/>
-                <w:szCs w:val="24"/>
-              </w:rPr>
-              <w:t>Standardised entities and facts with consistent keys</w:t>
+            <w:r>
+              <w:t>Standardised dimensions and facts built through dbt models</w:t>
             </w:r>
           </w:p>
         </w:tc>
@@ -8981,20 +8664,7 @@
             <w:vAlign w:val="center"/>
           </w:tcPr>
           <w:p>
-            <w:pPr>
-              <w:spacing w:after="0" w:line="360" w:lineRule="auto"/>
-              <w:rPr>
-                <w:rFonts w:ascii="Times New Roman" w:hAnsi="Times New Roman" w:cs="Times New Roman"/>
-                <w:sz w:val="24"/>
-                <w:szCs w:val="24"/>
-              </w:rPr>
-            </w:pPr>
-            <w:r>
-              <w:rPr>
-                <w:rFonts w:ascii="Times New Roman" w:hAnsi="Times New Roman" w:cs="Times New Roman"/>
-                <w:sz w:val="24"/>
-                <w:szCs w:val="24"/>
-              </w:rPr>
+            <w:r>
               <w:t>dim_customer, dim_area, dim_pest, fact_service, fact_payment, fact_warranty, fact_refund</w:t>
             </w:r>
           </w:p>
@@ -9017,21 +8687,8 @@
             <w:vAlign w:val="center"/>
           </w:tcPr>
           <w:p>
-            <w:pPr>
-              <w:spacing w:after="0" w:line="360" w:lineRule="auto"/>
-              <w:rPr>
-                <w:rFonts w:ascii="Times New Roman" w:hAnsi="Times New Roman" w:cs="Times New Roman"/>
-                <w:sz w:val="24"/>
-                <w:szCs w:val="24"/>
-              </w:rPr>
-            </w:pPr>
-            <w:r>
-              <w:rPr>
-                <w:rFonts w:ascii="Times New Roman" w:hAnsi="Times New Roman" w:cs="Times New Roman"/>
-                <w:sz w:val="24"/>
-                <w:szCs w:val="24"/>
-              </w:rPr>
-              <w:t>Analytics marts</w:t>
+            <w:r>
+              <w:t>Gold marts</w:t>
             </w:r>
           </w:p>
         </w:tc>
@@ -9047,21 +8704,8 @@
             <w:vAlign w:val="center"/>
           </w:tcPr>
           <w:p>
-            <w:pPr>
-              <w:spacing w:after="0" w:line="360" w:lineRule="auto"/>
-              <w:rPr>
-                <w:rFonts w:ascii="Times New Roman" w:hAnsi="Times New Roman" w:cs="Times New Roman"/>
-                <w:sz w:val="24"/>
-                <w:szCs w:val="24"/>
-              </w:rPr>
-            </w:pPr>
-            <w:r>
-              <w:rPr>
-                <w:rFonts w:ascii="Times New Roman" w:hAnsi="Times New Roman" w:cs="Times New Roman"/>
-                <w:sz w:val="24"/>
-                <w:szCs w:val="24"/>
-              </w:rPr>
-              <w:t>Dashboard-ready tables and views</w:t>
+            <w:r>
+              <w:t>Dashboard-ready tables and views consumed by Superset</w:t>
             </w:r>
           </w:p>
         </w:tc>
@@ -9077,21 +8721,40 @@
             <w:vAlign w:val="center"/>
           </w:tcPr>
           <w:p>
-            <w:pPr>
-              <w:spacing w:after="0" w:line="360" w:lineRule="auto"/>
-              <w:rPr>
-                <w:rFonts w:ascii="Times New Roman" w:hAnsi="Times New Roman" w:cs="Times New Roman"/>
-                <w:sz w:val="24"/>
-                <w:szCs w:val="24"/>
-              </w:rPr>
-            </w:pPr>
-            <w:r>
-              <w:rPr>
-                <w:rFonts w:ascii="Times New Roman" w:hAnsi="Times New Roman" w:cs="Times New Roman"/>
-                <w:sz w:val="24"/>
-                <w:szCs w:val="24"/>
-              </w:rPr>
-              <w:t>mart_area_risk, mart_treatment_difficulty, mart_recurrence_windows, mart_upsell_fit, mart_marketing_funnel</w:t>
+            <w:r>
+              <w:t>mart_area_risk, mart_treatment_difficulty, mart_recurrence_windows, mart_data_quality, mart_pipeline_status</w:t>
+            </w:r>
+          </w:p>
+        </w:tc>
+      </w:tr>
+      <w:tr>
+        <w:tc>
+          <w:tcPr>
+            <w:tcW w:type="dxa" w:w="1740"/>
+          </w:tcPr>
+          <w:p>
+            <w:r>
+              <w:t>Audit and lineage</w:t>
+            </w:r>
+          </w:p>
+        </w:tc>
+        <w:tc>
+          <w:tcPr>
+            <w:tcW w:type="dxa" w:w="2680"/>
+          </w:tcPr>
+          <w:p>
+            <w:r>
+              <w:t>Store pipeline runs, quality checks, source freshness, and matching confidence</w:t>
+            </w:r>
+          </w:p>
+        </w:tc>
+        <w:tc>
+          <w:tcPr>
+            <w:tcW w:type="dxa" w:w="4596"/>
+          </w:tcPr>
+          <w:p>
+            <w:r>
+              <w:t>etl_run_log, data_quality_log, source_refresh_status, record_match_log, weather_enrichment_log</w:t>
             </w:r>
           </w:p>
         </w:tc>
@@ -9118,12 +8781,7 @@
         </w:rPr>
       </w:pPr>
       <w:r>
-        <w:rPr>
-          <w:rFonts w:ascii="Times New Roman" w:hAnsi="Times New Roman" w:cs="Times New Roman"/>
-          <w:sz w:val="24"/>
-          <w:szCs w:val="24"/>
-        </w:rPr>
-        <w:t>The design will use stable identifiers such as customer_id, service_id, date, area, postcode, pest_type, package_type, technician, and team. BigQuery is used as an analytics warehouse rather than a transaction-processing database, so relationships will be managed through consistent keys, SQL joins, views, and mart-building queries rather than application-level transactional foreign-key enforcement. Where direct keys are missing, matching will use a controlled fallback sequence: customer ID, normalised phone number, and then customer name plus service/calendar date as a lower-confidence match.</w:t>
+        <w:t>The design will use stable identifiers such as customer_id, service_id, date, area, postcode, pest_type, package_type, technician, and team. BigQuery is used as an analytics warehouse rather than a transaction-processing database, so relationships will be managed through consistent keys, SQL joins, dbt models, data tests, lineage documentation, and validation logs rather than transactional foreign-key enforcement.</w:t>
       </w:r>
     </w:p>
     <w:tbl>
@@ -10989,12 +10647,7 @@
         </w:rPr>
       </w:pPr>
       <w:r>
-        <w:rPr>
-          <w:rFonts w:ascii="Times New Roman" w:hAnsi="Times New Roman" w:cs="Times New Roman"/>
-          <w:sz w:val="24"/>
-          <w:szCs w:val="24"/>
-        </w:rPr>
-        <w:t>The ETL process will not simply load the company files directly into dashboards. Each source will pass through validation and standardisation rules before it is used for analysis. Raw data will be preserved in staging tables, while cleaned values and quality flags will be stored in the cleaned core layer. This allows the project to explain which records were included, corrected, flagged for review, or excluded from a specific analysis.</w:t>
+        <w:t>The pipeline will not simply load the company files directly into dashboards. Each source will pass through a flexible data contract layer before it is used for analysis. Because company data may contain inconsistent column names and formats, the contract will define required business fields, accepted column aliases, expected data types, and validation rules. Missing or low-confidence mappings will be flagged in the Data Quality Report instead of being silently deleted.</w:t>
       </w:r>
     </w:p>
     <w:tbl>
@@ -12027,6 +11680,38 @@
           </w:p>
         </w:tc>
       </w:tr>
+      <w:tr>
+        <w:tc>
+          <w:tcPr>
+            <w:tcW w:type="dxa" w:w="2820"/>
+          </w:tcPr>
+          <w:p>
+            <w:r>
+              <w:t>Source columns</w:t>
+            </w:r>
+          </w:p>
+        </w:tc>
+        <w:tc>
+          <w:tcPr>
+            <w:tcW w:type="dxa" w:w="2725"/>
+          </w:tcPr>
+          <w:p>
+            <w:r>
+              <w:t>Map messy source column names to standard fields using flexible data contracts and alias dictionaries</w:t>
+            </w:r>
+          </w:p>
+        </w:tc>
+        <w:tc>
+          <w:tcPr>
+            <w:tcW w:type="dxa" w:w="3471"/>
+          </w:tcPr>
+          <w:p>
+            <w:r>
+              <w:t>Missing critical fields are flagged as failed_data_contract; important/optional fields are warned but do not always block loading</w:t>
+            </w:r>
+          </w:p>
+        </w:tc>
+      </w:tr>
     </w:tbl>
     <w:p>
       <w:pPr>
@@ -12049,12 +11734,7 @@
         </w:rPr>
       </w:pPr>
       <w:r>
-        <w:rPr>
-          <w:rFonts w:ascii="Times New Roman" w:hAnsi="Times New Roman" w:cs="Times New Roman"/>
-          <w:sz w:val="24"/>
-          <w:szCs w:val="24"/>
-        </w:rPr>
-        <w:t>The project will use a conservative exclusion policy. Records are not silently deleted. They are first preserved in staging tables, then marked with validation flags such as invalid_date, duplicate_candidate, unmatched_customer, unknown_area, missing_weather, or low_calendar_match_confidence. A record is excluded only from the analysis that cannot safely use it. For example, a service with missing coordinates can still be used in revenue trends, but not in DBSCAN hotspot detection.</w:t>
+        <w:t>The project will use a conservative exclusion policy. Records are not silently deleted. They are first preserved in Bronze raw tables, then marked with validation flags such as invalid_date, duplicate_candidate, unmatched_customer, unknown_area, missing_weather, missing_required_field, failed_data_contract, or low_calendar_match_confidence. A record may be excluded from one analysis but still used in another if the required fields for that analysis are available.</w:t>
       </w:r>
     </w:p>
     <w:tbl>
@@ -12614,6 +12294,94 @@
           </w:p>
         </w:tc>
       </w:tr>
+      <w:tr>
+        <w:tc>
+          <w:tcPr>
+            <w:tcW w:type="dxa" w:w="2973"/>
+          </w:tcPr>
+          <w:p>
+            <w:r>
+              <w:t>Flexible data contract status</w:t>
+            </w:r>
+          </w:p>
+        </w:tc>
+        <w:tc>
+          <w:tcPr>
+            <w:tcW w:type="dxa" w:w="6043"/>
+          </w:tcPr>
+          <w:p>
+            <w:r>
+              <w:t>Shows whether required business fields were mapped successfully for each source</w:t>
+            </w:r>
+          </w:p>
+        </w:tc>
+      </w:tr>
+      <w:tr>
+        <w:tc>
+          <w:tcPr>
+            <w:tcW w:type="dxa" w:w="2973"/>
+          </w:tcPr>
+          <w:p>
+            <w:r>
+              <w:t>dbt test result summary</w:t>
+            </w:r>
+          </w:p>
+        </w:tc>
+        <w:tc>
+          <w:tcPr>
+            <w:tcW w:type="dxa" w:w="6043"/>
+          </w:tcPr>
+          <w:p>
+            <w:r>
+              <w:t>Shows failed not-null, unique, accepted-value, or relationship tests</w:t>
+            </w:r>
+          </w:p>
+        </w:tc>
+      </w:tr>
+      <w:tr>
+        <w:tc>
+          <w:tcPr>
+            <w:tcW w:type="dxa" w:w="2973"/>
+          </w:tcPr>
+          <w:p>
+            <w:r>
+              <w:t>Pipeline run status</w:t>
+            </w:r>
+          </w:p>
+        </w:tc>
+        <w:tc>
+          <w:tcPr>
+            <w:tcW w:type="dxa" w:w="6043"/>
+          </w:tcPr>
+          <w:p>
+            <w:r>
+              <w:t>Shows Airflow run time, success/failure state, rows loaded, rows failed, and latest refresh time</w:t>
+            </w:r>
+          </w:p>
+        </w:tc>
+      </w:tr>
+      <w:tr>
+        <w:tc>
+          <w:tcPr>
+            <w:tcW w:type="dxa" w:w="2973"/>
+          </w:tcPr>
+          <w:p>
+            <w:r>
+              <w:t>Lineage coverage</w:t>
+            </w:r>
+          </w:p>
+        </w:tc>
+        <w:tc>
+          <w:tcPr>
+            <w:tcW w:type="dxa" w:w="6043"/>
+          </w:tcPr>
+          <w:p>
+            <w:r>
+              <w:t>Shows whether dashboard marts can be traced back to source and transformation models</w:t>
+            </w:r>
+          </w:p>
+        </w:tc>
+      </w:tr>
     </w:tbl>
     <w:p>
       <w:pPr>
@@ -12655,20 +12423,7 @@
         </w:rPr>
       </w:pPr>
       <w:r>
-        <w:rPr>
-          <w:rFonts w:ascii="Times New Roman" w:hAnsi="Times New Roman" w:cs="Times New Roman"/>
-          <w:sz w:val="24"/>
-          <w:szCs w:val="24"/>
-        </w:rPr>
-        <w:t>Following the AI/ML methodology guide, the CP2 analytics workflow will follow a clear lifecycle: data acquisition from company Google Sheets, Google Calendar, and weather APIs; preprocessing through cleaning, standardisation, missing-value checks, duplicate detection, and matching; model selection based on data size and explainability; model or scoring implementation using transparent methods such as DBSCAN, KDE, time-lag analysis, recurrence buckets, and logistic regression where labels are sufficient; eva</w:t>
-      </w:r>
-      <w:r>
-        <w:rPr>
-          <w:rFonts w:ascii="Times New Roman" w:hAnsi="Times New Roman" w:cs="Times New Roman"/>
-          <w:sz w:val="24"/>
-          <w:szCs w:val="24"/>
-        </w:rPr>
-        <w:t>luation using data quality coverage, dashboard usability feedback, and interpretation accuracy; and dashboard deployment through BigQuery marts and Apache Superset.</w:t>
+        <w:t>Following the AI/ML methodology guide, the CP2 workflow will combine data engineering and analytics. The data engineering lifecycle covers source profiling, extraction, Bronze loading, dbt transformation, data testing, lineage documentation, pipeline logging, and scheduled orchestration. The analytics lifecycle then uses the trusted Gold marts for customer, area, warranty, recurrence, weather, hotspot, upsell, and recommendation outputs.</w:t>
       </w:r>
     </w:p>
     <w:tbl>
@@ -13814,6 +13569,54 @@
       </w:r>
     </w:p>
     <w:p>
+      <w:pPr/>
+      <w:r>
+        <w:t>Pipeline orchestration:</w:t>
+      </w:r>
+    </w:p>
+    <w:p>
+      <w:pPr/>
+      <w:r>
+        <w:t>Apache Airflow will coordinate the CP2 pipeline as a directed workflow. A planned DAG will run tasks such as extract_google_sheets, extract_google_calendar, extract_weather_data, load_bronze_bigquery, run_dbt_models, run_dbt_tests, update_data_quality_log, and update_refresh_status. This demonstrates workflow scheduling, dependency management, retry handling, and failure monitoring.</w:t>
+      </w:r>
+    </w:p>
+    <w:p>
+      <w:pPr/>
+      <w:r>
+        <w:t>dbt transformations and lineage:</w:t>
+      </w:r>
+    </w:p>
+    <w:p>
+      <w:pPr/>
+      <w:r>
+        <w:t>dbt Core will transform BigQuery Bronze tables into Silver cleaned tables and Gold marts using modular SQL models. dbt tests will check fields such as uniqueness, not-null requirements, accepted values, and relationship consistency where practical. dbt documentation and lineage will show how raw data flows into dashboard outputs.</w:t>
+      </w:r>
+    </w:p>
+    <w:p>
+      <w:pPr/>
+      <w:r>
+        <w:t>Flexible data contracts:</w:t>
+      </w:r>
+    </w:p>
+    <w:p>
+      <w:pPr/>
+      <w:r>
+        <w:t>Each source will have a flexible contract defining standard fields, accepted aliases, required/important/optional levels, and validation rules. For example, Nama, Name, and Customer Name may map to customer_name, while Phone No, Contact, and Tel may map to phone_number. If a critical field cannot be mapped, the source or row is flagged for review.</w:t>
+      </w:r>
+    </w:p>
+    <w:p>
+      <w:pPr/>
+      <w:r>
+        <w:t>Incremental loading:</w:t>
+      </w:r>
+    </w:p>
+    <w:p>
+      <w:pPr/>
+      <w:r>
+        <w:t>Where a source provides updated timestamps or stable row identifiers, the pipeline will load only new or changed rows. If such metadata is unavailable, the prototype will use row hashes and loaded_at timestamps to detect changes. Full refresh remains available as a fallback during prototype testing.</w:t>
+      </w:r>
+    </w:p>
+    <w:p>
       <w:pPr>
         <w:pStyle w:val="Heading2"/>
         <w:spacing w:line="360" w:lineRule="auto"/>
@@ -13844,12 +13647,7 @@
         </w:rPr>
       </w:pPr>
       <w:r>
-        <w:rPr>
-          <w:rFonts w:ascii="Times New Roman" w:hAnsi="Times New Roman" w:cs="Times New Roman"/>
-          <w:sz w:val="24"/>
-          <w:szCs w:val="24"/>
-        </w:rPr>
-        <w:t>The visualization layer will be implemented in Apache Superset to reduce custom frontend development and align the project with a data analytics capstone. Superset will connect to BigQuery tables/views and provide dashboards with filters for date range, grain, area, pest type, package type, team, technician, customer segment, and session type.</w:t>
+        <w:t>The visualization layer will be implemented in Apache Superset to reduce custom frontend development and align the project with a data analytics capstone. Superset will connect only to curated Gold marts and anonymised reporting views in BigQuery rather than raw source tables. This ensures the dashboards are based on tested, documented, and refresh-controlled data outputs.</w:t>
       </w:r>
     </w:p>
     <w:tbl>
@@ -15725,6 +15523,70 @@
           </w:p>
         </w:tc>
       </w:tr>
+      <w:tr>
+        <w:tc>
+          <w:tcPr>
+            <w:tcW w:type="dxa" w:w="2396"/>
+          </w:tcPr>
+          <w:p>
+            <w:r>
+              <w:t>Pipeline complexity</w:t>
+            </w:r>
+          </w:p>
+        </w:tc>
+        <w:tc>
+          <w:tcPr>
+            <w:tcW w:type="dxa" w:w="2916"/>
+          </w:tcPr>
+          <w:p>
+            <w:r>
+              <w:t>Airflow and dbt add setup effort compared with a simple script</w:t>
+            </w:r>
+          </w:p>
+        </w:tc>
+        <w:tc>
+          <w:tcPr>
+            <w:tcW w:type="dxa" w:w="3704"/>
+          </w:tcPr>
+          <w:p>
+            <w:r>
+              <w:t>Keep the DAG small, use batch refresh, document fallback manual runs, and prioritise core tables first</w:t>
+            </w:r>
+          </w:p>
+        </w:tc>
+      </w:tr>
+      <w:tr>
+        <w:tc>
+          <w:tcPr>
+            <w:tcW w:type="dxa" w:w="2396"/>
+          </w:tcPr>
+          <w:p>
+            <w:r>
+              <w:t>Schema flexibility</w:t>
+            </w:r>
+          </w:p>
+        </w:tc>
+        <w:tc>
+          <w:tcPr>
+            <w:tcW w:type="dxa" w:w="2916"/>
+          </w:tcPr>
+          <w:p>
+            <w:r>
+              <w:t>Company sheets may change column names or contain messy formats</w:t>
+            </w:r>
+          </w:p>
+        </w:tc>
+        <w:tc>
+          <w:tcPr>
+            <w:tcW w:type="dxa" w:w="3704"/>
+          </w:tcPr>
+          <w:p>
+            <w:r>
+              <w:t>Use flexible data contracts, alias mapping, validation flags, and source-level quality status</w:t>
+            </w:r>
+          </w:p>
+        </w:tc>
+      </w:tr>
     </w:tbl>
     <w:p>
       <w:pPr>
@@ -16345,20 +16207,7 @@
             <w:vAlign w:val="center"/>
           </w:tcPr>
           <w:p>
-            <w:pPr>
-              <w:spacing w:after="0" w:line="360" w:lineRule="auto"/>
-              <w:rPr>
-                <w:rFonts w:ascii="Times New Roman" w:hAnsi="Times New Roman" w:cs="Times New Roman"/>
-                <w:sz w:val="24"/>
-                <w:szCs w:val="24"/>
-              </w:rPr>
-            </w:pPr>
-            <w:r>
-              <w:rPr>
-                <w:rFonts w:ascii="Times New Roman" w:hAnsi="Times New Roman" w:cs="Times New Roman"/>
-                <w:sz w:val="24"/>
-                <w:szCs w:val="24"/>
-              </w:rPr>
+            <w:r>
               <w:t>3</w:t>
             </w:r>
           </w:p>
@@ -16375,21 +16224,8 @@
             <w:vAlign w:val="center"/>
           </w:tcPr>
           <w:p>
-            <w:pPr>
-              <w:spacing w:after="0" w:line="360" w:lineRule="auto"/>
-              <w:rPr>
-                <w:rFonts w:ascii="Times New Roman" w:hAnsi="Times New Roman" w:cs="Times New Roman"/>
-                <w:sz w:val="24"/>
-                <w:szCs w:val="24"/>
-              </w:rPr>
-            </w:pPr>
-            <w:r>
-              <w:rPr>
-                <w:rFonts w:ascii="Times New Roman" w:hAnsi="Times New Roman" w:cs="Times New Roman"/>
-                <w:sz w:val="24"/>
-                <w:szCs w:val="24"/>
-              </w:rPr>
-              <w:t>Design BigQuery staging/core/mart schema, table relationships, matching keys, anonymised views, and recommendation log</w:t>
+            <w:r>
+              <w:t>Design Bronze/Silver/Gold BigQuery warehouse, dbt model layers, table relationships, matching keys, anonymised views, and recommendation log</w:t>
             </w:r>
           </w:p>
         </w:tc>
@@ -16405,21 +16241,8 @@
             <w:vAlign w:val="center"/>
           </w:tcPr>
           <w:p>
-            <w:pPr>
-              <w:spacing w:after="0" w:line="360" w:lineRule="auto"/>
-              <w:rPr>
-                <w:rFonts w:ascii="Times New Roman" w:hAnsi="Times New Roman" w:cs="Times New Roman"/>
-                <w:sz w:val="24"/>
-                <w:szCs w:val="24"/>
-              </w:rPr>
-            </w:pPr>
-            <w:r>
-              <w:rPr>
-                <w:rFonts w:ascii="Times New Roman" w:hAnsi="Times New Roman" w:cs="Times New Roman"/>
-                <w:sz w:val="24"/>
-                <w:szCs w:val="24"/>
-              </w:rPr>
-              <w:t>Warehouse design document</w:t>
+            <w:r>
+              <w:t>Warehouse and dbt design document</w:t>
             </w:r>
           </w:p>
         </w:tc>
@@ -16441,20 +16264,7 @@
             <w:vAlign w:val="center"/>
           </w:tcPr>
           <w:p>
-            <w:pPr>
-              <w:spacing w:after="0" w:line="360" w:lineRule="auto"/>
-              <w:rPr>
-                <w:rFonts w:ascii="Times New Roman" w:hAnsi="Times New Roman" w:cs="Times New Roman"/>
-                <w:sz w:val="24"/>
-                <w:szCs w:val="24"/>
-              </w:rPr>
-            </w:pPr>
-            <w:r>
-              <w:rPr>
-                <w:rFonts w:ascii="Times New Roman" w:hAnsi="Times New Roman" w:cs="Times New Roman"/>
-                <w:sz w:val="24"/>
-                <w:szCs w:val="24"/>
-              </w:rPr>
+            <w:r>
               <w:t>4</w:t>
             </w:r>
           </w:p>
@@ -16471,21 +16281,8 @@
             <w:vAlign w:val="center"/>
           </w:tcPr>
           <w:p>
-            <w:pPr>
-              <w:spacing w:after="0" w:line="360" w:lineRule="auto"/>
-              <w:rPr>
-                <w:rFonts w:ascii="Times New Roman" w:hAnsi="Times New Roman" w:cs="Times New Roman"/>
-                <w:sz w:val="24"/>
-                <w:szCs w:val="24"/>
-              </w:rPr>
-            </w:pPr>
-            <w:r>
-              <w:rPr>
-                <w:rFonts w:ascii="Times New Roman" w:hAnsi="Times New Roman" w:cs="Times New Roman"/>
-                <w:sz w:val="24"/>
-                <w:szCs w:val="24"/>
-              </w:rPr>
-              <w:t>Build Python ETL for data import, standardisation, validation flags, and inclusion/exclusion reporting</w:t>
+            <w:r>
+              <w:t>Build Python extraction/load scripts, flexible data contracts, validation flags, and Bronze raw loading</w:t>
             </w:r>
           </w:p>
         </w:tc>
@@ -16501,21 +16298,8 @@
             <w:vAlign w:val="center"/>
           </w:tcPr>
           <w:p>
-            <w:pPr>
-              <w:spacing w:after="0" w:line="360" w:lineRule="auto"/>
-              <w:rPr>
-                <w:rFonts w:ascii="Times New Roman" w:hAnsi="Times New Roman" w:cs="Times New Roman"/>
-                <w:sz w:val="24"/>
-                <w:szCs w:val="24"/>
-              </w:rPr>
-            </w:pPr>
-            <w:r>
-              <w:rPr>
-                <w:rFonts w:ascii="Times New Roman" w:hAnsi="Times New Roman" w:cs="Times New Roman"/>
-                <w:sz w:val="24"/>
-                <w:szCs w:val="24"/>
-              </w:rPr>
-              <w:t>Cleaned staging pipeline and data quality dashboard source</w:t>
+            <w:r>
+              <w:t>Bronze loading pipeline and source quality report</w:t>
             </w:r>
           </w:p>
         </w:tc>
@@ -16634,20 +16418,7 @@
             <w:vAlign w:val="center"/>
           </w:tcPr>
           <w:p>
-            <w:pPr>
-              <w:spacing w:after="0" w:line="360" w:lineRule="auto"/>
-              <w:rPr>
-                <w:rFonts w:ascii="Times New Roman" w:hAnsi="Times New Roman" w:cs="Times New Roman"/>
-                <w:sz w:val="24"/>
-                <w:szCs w:val="24"/>
-              </w:rPr>
-            </w:pPr>
-            <w:r>
-              <w:rPr>
-                <w:rFonts w:ascii="Times New Roman" w:hAnsi="Times New Roman" w:cs="Times New Roman"/>
-                <w:sz w:val="24"/>
-                <w:szCs w:val="24"/>
-              </w:rPr>
+            <w:r>
               <w:t>6</w:t>
             </w:r>
           </w:p>
@@ -16664,21 +16435,8 @@
             <w:vAlign w:val="center"/>
           </w:tcPr>
           <w:p>
-            <w:pPr>
-              <w:spacing w:after="0" w:line="360" w:lineRule="auto"/>
-              <w:rPr>
-                <w:rFonts w:ascii="Times New Roman" w:hAnsi="Times New Roman" w:cs="Times New Roman"/>
-                <w:sz w:val="24"/>
-                <w:szCs w:val="24"/>
-              </w:rPr>
-            </w:pPr>
-            <w:r>
-              <w:rPr>
-                <w:rFonts w:ascii="Times New Roman" w:hAnsi="Times New Roman" w:cs="Times New Roman"/>
-                <w:sz w:val="24"/>
-                <w:szCs w:val="24"/>
-              </w:rPr>
-              <w:t>Build descriptive analytics marts for dashboard overview, service, sales, warranty, refund, and scheduling</w:t>
+            <w:r>
+              <w:t>Build dbt staging, fact, dimension, and core descriptive marts for service, sales, warranty, refund, and scheduling</w:t>
             </w:r>
           </w:p>
         </w:tc>
@@ -16694,21 +16452,8 @@
             <w:vAlign w:val="center"/>
           </w:tcPr>
           <w:p>
-            <w:pPr>
-              <w:spacing w:after="0" w:line="360" w:lineRule="auto"/>
-              <w:rPr>
-                <w:rFonts w:ascii="Times New Roman" w:hAnsi="Times New Roman" w:cs="Times New Roman"/>
-                <w:sz w:val="24"/>
-                <w:szCs w:val="24"/>
-              </w:rPr>
-            </w:pPr>
-            <w:r>
-              <w:rPr>
-                <w:rFonts w:ascii="Times New Roman" w:hAnsi="Times New Roman" w:cs="Times New Roman"/>
-                <w:sz w:val="24"/>
-                <w:szCs w:val="24"/>
-              </w:rPr>
-              <w:t>Core BI marts</w:t>
+            <w:r>
+              <w:t>Silver tables and core Gold marts</w:t>
             </w:r>
           </w:p>
         </w:tc>
@@ -17018,20 +16763,7 @@
             <w:vAlign w:val="center"/>
           </w:tcPr>
           <w:p>
-            <w:pPr>
-              <w:spacing w:after="0" w:line="360" w:lineRule="auto"/>
-              <w:rPr>
-                <w:rFonts w:ascii="Times New Roman" w:hAnsi="Times New Roman" w:cs="Times New Roman"/>
-                <w:sz w:val="24"/>
-                <w:szCs w:val="24"/>
-              </w:rPr>
-            </w:pPr>
-            <w:r>
-              <w:rPr>
-                <w:rFonts w:ascii="Times New Roman" w:hAnsi="Times New Roman" w:cs="Times New Roman"/>
-                <w:sz w:val="24"/>
-                <w:szCs w:val="24"/>
-              </w:rPr>
+            <w:r>
               <w:t>10</w:t>
             </w:r>
           </w:p>
@@ -17048,21 +16780,8 @@
             <w:vAlign w:val="center"/>
           </w:tcPr>
           <w:p>
-            <w:pPr>
-              <w:spacing w:after="0" w:line="360" w:lineRule="auto"/>
-              <w:rPr>
-                <w:rFonts w:ascii="Times New Roman" w:hAnsi="Times New Roman" w:cs="Times New Roman"/>
-                <w:sz w:val="24"/>
-                <w:szCs w:val="24"/>
-              </w:rPr>
-            </w:pPr>
-            <w:r>
-              <w:rPr>
-                <w:rFonts w:ascii="Times New Roman" w:hAnsi="Times New Roman" w:cs="Times New Roman"/>
-                <w:sz w:val="24"/>
-                <w:szCs w:val="24"/>
-              </w:rPr>
-              <w:t>Connect Apache Superset to BigQuery and build first dashboard pages</w:t>
+            <w:r>
+              <w:t>Create Airflow DAG to orchestrate extraction, BigQuery loading, dbt models/tests, weather enrichment, and refresh logging</w:t>
             </w:r>
           </w:p>
         </w:tc>
@@ -17078,21 +16797,8 @@
             <w:vAlign w:val="center"/>
           </w:tcPr>
           <w:p>
-            <w:pPr>
-              <w:spacing w:after="0" w:line="360" w:lineRule="auto"/>
-              <w:rPr>
-                <w:rFonts w:ascii="Times New Roman" w:hAnsi="Times New Roman" w:cs="Times New Roman"/>
-                <w:sz w:val="24"/>
-                <w:szCs w:val="24"/>
-              </w:rPr>
-            </w:pPr>
-            <w:r>
-              <w:rPr>
-                <w:rFonts w:ascii="Times New Roman" w:hAnsi="Times New Roman" w:cs="Times New Roman"/>
-                <w:sz w:val="24"/>
-                <w:szCs w:val="24"/>
-              </w:rPr>
-              <w:t>Dashboard prototype v1</w:t>
+            <w:r>
+              <w:t>Airflow-orchestrated ELT prototype</w:t>
             </w:r>
           </w:p>
         </w:tc>
@@ -17114,20 +16820,7 @@
             <w:vAlign w:val="center"/>
           </w:tcPr>
           <w:p>
-            <w:pPr>
-              <w:spacing w:after="0" w:line="360" w:lineRule="auto"/>
-              <w:rPr>
-                <w:rFonts w:ascii="Times New Roman" w:hAnsi="Times New Roman" w:cs="Times New Roman"/>
-                <w:sz w:val="24"/>
-                <w:szCs w:val="24"/>
-              </w:rPr>
-            </w:pPr>
-            <w:r>
-              <w:rPr>
-                <w:rFonts w:ascii="Times New Roman" w:hAnsi="Times New Roman" w:cs="Times New Roman"/>
-                <w:sz w:val="24"/>
-                <w:szCs w:val="24"/>
-              </w:rPr>
+            <w:r>
               <w:t>11</w:t>
             </w:r>
           </w:p>
@@ -17144,21 +16837,8 @@
             <w:vAlign w:val="center"/>
           </w:tcPr>
           <w:p>
-            <w:pPr>
-              <w:spacing w:after="0" w:line="360" w:lineRule="auto"/>
-              <w:rPr>
-                <w:rFonts w:ascii="Times New Roman" w:hAnsi="Times New Roman" w:cs="Times New Roman"/>
-                <w:sz w:val="24"/>
-                <w:szCs w:val="24"/>
-              </w:rPr>
-            </w:pPr>
-            <w:r>
-              <w:rPr>
-                <w:rFonts w:ascii="Times New Roman" w:hAnsi="Times New Roman" w:cs="Times New Roman"/>
-                <w:sz w:val="24"/>
-                <w:szCs w:val="24"/>
-              </w:rPr>
-              <w:t>Refine filters, maps, data quality views, refresh status, rankings, and recommendations with company feedback</w:t>
+            <w:r>
+              <w:t>Connect Apache Superset to BigQuery Gold marts and build first dashboard pages</w:t>
             </w:r>
           </w:p>
         </w:tc>
@@ -17174,21 +16854,8 @@
             <w:vAlign w:val="center"/>
           </w:tcPr>
           <w:p>
-            <w:pPr>
-              <w:spacing w:after="0" w:line="360" w:lineRule="auto"/>
-              <w:rPr>
-                <w:rFonts w:ascii="Times New Roman" w:hAnsi="Times New Roman" w:cs="Times New Roman"/>
-                <w:sz w:val="24"/>
-                <w:szCs w:val="24"/>
-              </w:rPr>
-            </w:pPr>
-            <w:r>
-              <w:rPr>
-                <w:rFonts w:ascii="Times New Roman" w:hAnsi="Times New Roman" w:cs="Times New Roman"/>
-                <w:sz w:val="24"/>
-                <w:szCs w:val="24"/>
-              </w:rPr>
-              <w:t>Dashboard prototype v2</w:t>
+            <w:r>
+              <w:t>Dashboard prototype v1</w:t>
             </w:r>
           </w:p>
         </w:tc>
@@ -17210,20 +16877,7 @@
             <w:vAlign w:val="center"/>
           </w:tcPr>
           <w:p>
-            <w:pPr>
-              <w:spacing w:after="0" w:line="360" w:lineRule="auto"/>
-              <w:rPr>
-                <w:rFonts w:ascii="Times New Roman" w:hAnsi="Times New Roman" w:cs="Times New Roman"/>
-                <w:sz w:val="24"/>
-                <w:szCs w:val="24"/>
-              </w:rPr>
-            </w:pPr>
-            <w:r>
-              <w:rPr>
-                <w:rFonts w:ascii="Times New Roman" w:hAnsi="Times New Roman" w:cs="Times New Roman"/>
-                <w:sz w:val="24"/>
-                <w:szCs w:val="24"/>
-              </w:rPr>
+            <w:r>
               <w:t>12</w:t>
             </w:r>
           </w:p>
@@ -17240,21 +16894,8 @@
             <w:vAlign w:val="center"/>
           </w:tcPr>
           <w:p>
-            <w:pPr>
-              <w:spacing w:after="0" w:line="360" w:lineRule="auto"/>
-              <w:rPr>
-                <w:rFonts w:ascii="Times New Roman" w:hAnsi="Times New Roman" w:cs="Times New Roman"/>
-                <w:sz w:val="24"/>
-                <w:szCs w:val="24"/>
-              </w:rPr>
-            </w:pPr>
-            <w:r>
-              <w:rPr>
-                <w:rFonts w:ascii="Times New Roman" w:hAnsi="Times New Roman" w:cs="Times New Roman"/>
-                <w:sz w:val="24"/>
-                <w:szCs w:val="24"/>
-              </w:rPr>
-              <w:t>Evaluate dashboard against manual spreadsheet answers and collect usability feedback</w:t>
+            <w:r>
+              <w:t>Refine filters, maps, data quality views, pipeline status, rankings, and recommendations with company feedback</w:t>
             </w:r>
           </w:p>
         </w:tc>
@@ -17270,21 +16911,8 @@
             <w:vAlign w:val="center"/>
           </w:tcPr>
           <w:p>
-            <w:pPr>
-              <w:spacing w:after="0" w:line="360" w:lineRule="auto"/>
-              <w:rPr>
-                <w:rFonts w:ascii="Times New Roman" w:hAnsi="Times New Roman" w:cs="Times New Roman"/>
-                <w:sz w:val="24"/>
-                <w:szCs w:val="24"/>
-              </w:rPr>
-            </w:pPr>
-            <w:r>
-              <w:rPr>
-                <w:rFonts w:ascii="Times New Roman" w:hAnsi="Times New Roman" w:cs="Times New Roman"/>
-                <w:sz w:val="24"/>
-                <w:szCs w:val="24"/>
-              </w:rPr>
-              <w:t>Evaluation report draft</w:t>
+            <w:r>
+              <w:t>Dashboard prototype v2 and pipeline status view</w:t>
             </w:r>
           </w:p>
         </w:tc>
@@ -17306,20 +16934,7 @@
             <w:vAlign w:val="center"/>
           </w:tcPr>
           <w:p>
-            <w:pPr>
-              <w:spacing w:after="0" w:line="360" w:lineRule="auto"/>
-              <w:rPr>
-                <w:rFonts w:ascii="Times New Roman" w:hAnsi="Times New Roman" w:cs="Times New Roman"/>
-                <w:sz w:val="24"/>
-                <w:szCs w:val="24"/>
-              </w:rPr>
-            </w:pPr>
-            <w:r>
-              <w:rPr>
-                <w:rFonts w:ascii="Times New Roman" w:hAnsi="Times New Roman" w:cs="Times New Roman"/>
-                <w:sz w:val="24"/>
-                <w:szCs w:val="24"/>
-              </w:rPr>
+            <w:r>
               <w:t>13</w:t>
             </w:r>
           </w:p>
@@ -17336,21 +16951,8 @@
             <w:vAlign w:val="center"/>
           </w:tcPr>
           <w:p>
-            <w:pPr>
-              <w:spacing w:after="0" w:line="360" w:lineRule="auto"/>
-              <w:rPr>
-                <w:rFonts w:ascii="Times New Roman" w:hAnsi="Times New Roman" w:cs="Times New Roman"/>
-                <w:sz w:val="24"/>
-                <w:szCs w:val="24"/>
-              </w:rPr>
-            </w:pPr>
-            <w:r>
-              <w:rPr>
-                <w:rFonts w:ascii="Times New Roman" w:hAnsi="Times New Roman" w:cs="Times New Roman"/>
-                <w:sz w:val="24"/>
-                <w:szCs w:val="24"/>
-              </w:rPr>
-              <w:t>Prepare final report, screenshots, architecture diagram, data flow diagram, and viva explanation</w:t>
+            <w:r>
+              <w:t>Evaluate dashboard and pipeline against manual spreadsheet answers, dbt test results, and refresh logs</w:t>
             </w:r>
           </w:p>
         </w:tc>
@@ -17366,21 +16968,8 @@
             <w:vAlign w:val="center"/>
           </w:tcPr>
           <w:p>
-            <w:pPr>
-              <w:spacing w:after="0" w:line="360" w:lineRule="auto"/>
-              <w:rPr>
-                <w:rFonts w:ascii="Times New Roman" w:hAnsi="Times New Roman" w:cs="Times New Roman"/>
-                <w:sz w:val="24"/>
-                <w:szCs w:val="24"/>
-              </w:rPr>
-            </w:pPr>
-            <w:r>
-              <w:rPr>
-                <w:rFonts w:ascii="Times New Roman" w:hAnsi="Times New Roman" w:cs="Times New Roman"/>
-                <w:sz w:val="24"/>
-                <w:szCs w:val="24"/>
-              </w:rPr>
-              <w:t>Final documentation draft</w:t>
+            <w:r>
+              <w:t>Evaluation report draft</w:t>
             </w:r>
           </w:p>
         </w:tc>
@@ -17402,20 +16991,7 @@
             <w:vAlign w:val="center"/>
           </w:tcPr>
           <w:p>
-            <w:pPr>
-              <w:spacing w:after="0" w:line="360" w:lineRule="auto"/>
-              <w:rPr>
-                <w:rFonts w:ascii="Times New Roman" w:hAnsi="Times New Roman" w:cs="Times New Roman"/>
-                <w:sz w:val="24"/>
-                <w:szCs w:val="24"/>
-              </w:rPr>
-            </w:pPr>
-            <w:r>
-              <w:rPr>
-                <w:rFonts w:ascii="Times New Roman" w:hAnsi="Times New Roman" w:cs="Times New Roman"/>
-                <w:sz w:val="24"/>
-                <w:szCs w:val="24"/>
-              </w:rPr>
+            <w:r>
               <w:t>14</w:t>
             </w:r>
           </w:p>
@@ -17432,21 +17008,8 @@
             <w:vAlign w:val="center"/>
           </w:tcPr>
           <w:p>
-            <w:pPr>
-              <w:spacing w:after="0" w:line="360" w:lineRule="auto"/>
-              <w:rPr>
-                <w:rFonts w:ascii="Times New Roman" w:hAnsi="Times New Roman" w:cs="Times New Roman"/>
-                <w:sz w:val="24"/>
-                <w:szCs w:val="24"/>
-              </w:rPr>
-            </w:pPr>
-            <w:r>
-              <w:rPr>
-                <w:rFonts w:ascii="Times New Roman" w:hAnsi="Times New Roman" w:cs="Times New Roman"/>
-                <w:sz w:val="24"/>
-                <w:szCs w:val="24"/>
-              </w:rPr>
-              <w:t>Final testing, polishing, supervisor review, and submission packaging</w:t>
+            <w:r>
+              <w:t>Prepare final report, screenshots, architecture diagram, Airflow DAG view, dbt lineage graph, and viva explanation</w:t>
             </w:r>
           </w:p>
         </w:tc>
@@ -17462,20 +17025,7 @@
             <w:vAlign w:val="center"/>
           </w:tcPr>
           <w:p>
-            <w:pPr>
-              <w:spacing w:after="0" w:line="360" w:lineRule="auto"/>
-              <w:rPr>
-                <w:rFonts w:ascii="Times New Roman" w:hAnsi="Times New Roman" w:cs="Times New Roman"/>
-                <w:sz w:val="24"/>
-                <w:szCs w:val="24"/>
-              </w:rPr>
-            </w:pPr>
-            <w:r>
-              <w:rPr>
-                <w:rFonts w:ascii="Times New Roman" w:hAnsi="Times New Roman" w:cs="Times New Roman"/>
-                <w:sz w:val="24"/>
-                <w:szCs w:val="24"/>
-              </w:rPr>
+            <w:r>
               <w:t>Final project submission</w:t>
             </w:r>
           </w:p>
@@ -17852,21 +17402,8 @@
             <w:vAlign w:val="center"/>
           </w:tcPr>
           <w:p>
-            <w:pPr>
-              <w:spacing w:after="0" w:line="360" w:lineRule="auto"/>
-              <w:rPr>
-                <w:rFonts w:ascii="Times New Roman" w:hAnsi="Times New Roman" w:cs="Times New Roman"/>
-                <w:sz w:val="24"/>
-                <w:szCs w:val="24"/>
-              </w:rPr>
-            </w:pPr>
-            <w:r>
-              <w:rPr>
-                <w:rFonts w:ascii="Times New Roman" w:hAnsi="Times New Roman" w:cs="Times New Roman"/>
-                <w:sz w:val="24"/>
-                <w:szCs w:val="24"/>
-              </w:rPr>
-              <w:t>M3: BigQuery warehouse ready</w:t>
+            <w:r>
+              <w:t>M3: BigQuery and dbt warehouse ready</w:t>
             </w:r>
           </w:p>
         </w:tc>
@@ -17882,20 +17419,7 @@
             <w:vAlign w:val="center"/>
           </w:tcPr>
           <w:p>
-            <w:pPr>
-              <w:spacing w:after="0" w:line="360" w:lineRule="auto"/>
-              <w:rPr>
-                <w:rFonts w:ascii="Times New Roman" w:hAnsi="Times New Roman" w:cs="Times New Roman"/>
-                <w:sz w:val="24"/>
-                <w:szCs w:val="24"/>
-              </w:rPr>
-            </w:pPr>
-            <w:r>
-              <w:rPr>
-                <w:rFonts w:ascii="Times New Roman" w:hAnsi="Times New Roman" w:cs="Times New Roman"/>
-                <w:sz w:val="24"/>
-                <w:szCs w:val="24"/>
-              </w:rPr>
+            <w:r>
               <w:t>Week 6</w:t>
             </w:r>
           </w:p>
@@ -17912,21 +17436,8 @@
             <w:vAlign w:val="center"/>
           </w:tcPr>
           <w:p>
-            <w:pPr>
-              <w:spacing w:after="0" w:line="360" w:lineRule="auto"/>
-              <w:rPr>
-                <w:rFonts w:ascii="Times New Roman" w:hAnsi="Times New Roman" w:cs="Times New Roman"/>
-                <w:sz w:val="24"/>
-                <w:szCs w:val="24"/>
-              </w:rPr>
-            </w:pPr>
-            <w:r>
-              <w:rPr>
-                <w:rFonts w:ascii="Times New Roman" w:hAnsi="Times New Roman" w:cs="Times New Roman"/>
-                <w:sz w:val="24"/>
-                <w:szCs w:val="24"/>
-              </w:rPr>
-              <w:t>Staging, core, and mart tables created and populated</w:t>
+            <w:r>
+              <w:t>Bronze, Silver, and Gold tables created with dbt models and initial tests</w:t>
             </w:r>
           </w:p>
         </w:tc>
@@ -18044,21 +17555,8 @@
             <w:vAlign w:val="center"/>
           </w:tcPr>
           <w:p>
-            <w:pPr>
-              <w:spacing w:after="0" w:line="360" w:lineRule="auto"/>
-              <w:rPr>
-                <w:rFonts w:ascii="Times New Roman" w:hAnsi="Times New Roman" w:cs="Times New Roman"/>
-                <w:sz w:val="24"/>
-                <w:szCs w:val="24"/>
-              </w:rPr>
-            </w:pPr>
-            <w:r>
-              <w:rPr>
-                <w:rFonts w:ascii="Times New Roman" w:hAnsi="Times New Roman" w:cs="Times New Roman"/>
-                <w:sz w:val="24"/>
-                <w:szCs w:val="24"/>
-              </w:rPr>
-              <w:t>M5: Dashboard prototype complete</w:t>
+            <w:r>
+              <w:t>M5: Airflow and dashboard prototype complete</w:t>
             </w:r>
           </w:p>
         </w:tc>
@@ -18074,20 +17572,7 @@
             <w:vAlign w:val="center"/>
           </w:tcPr>
           <w:p>
-            <w:pPr>
-              <w:spacing w:after="0" w:line="360" w:lineRule="auto"/>
-              <w:rPr>
-                <w:rFonts w:ascii="Times New Roman" w:hAnsi="Times New Roman" w:cs="Times New Roman"/>
-                <w:sz w:val="24"/>
-                <w:szCs w:val="24"/>
-              </w:rPr>
-            </w:pPr>
-            <w:r>
-              <w:rPr>
-                <w:rFonts w:ascii="Times New Roman" w:hAnsi="Times New Roman" w:cs="Times New Roman"/>
-                <w:sz w:val="24"/>
-                <w:szCs w:val="24"/>
-              </w:rPr>
+            <w:r>
               <w:t>Week 11</w:t>
             </w:r>
           </w:p>
@@ -18104,21 +17589,8 @@
             <w:vAlign w:val="center"/>
           </w:tcPr>
           <w:p>
-            <w:pPr>
-              <w:spacing w:after="0" w:line="360" w:lineRule="auto"/>
-              <w:rPr>
-                <w:rFonts w:ascii="Times New Roman" w:hAnsi="Times New Roman" w:cs="Times New Roman"/>
-                <w:sz w:val="24"/>
-                <w:szCs w:val="24"/>
-              </w:rPr>
-            </w:pPr>
-            <w:r>
-              <w:rPr>
-                <w:rFonts w:ascii="Times New Roman" w:hAnsi="Times New Roman" w:cs="Times New Roman"/>
-                <w:sz w:val="24"/>
-                <w:szCs w:val="24"/>
-              </w:rPr>
-              <w:t>Superset dashboards answer key management questions including data quality and refresh status</w:t>
+            <w:r>
+              <w:t>Airflow DAG runs core pipeline and Superset dashboards answer key management questions</w:t>
             </w:r>
           </w:p>
         </w:tc>
@@ -18956,21 +18428,8 @@
             <w:vAlign w:val="center"/>
           </w:tcPr>
           <w:p>
-            <w:pPr>
-              <w:spacing w:after="0" w:line="360" w:lineRule="auto"/>
-              <w:rPr>
-                <w:rFonts w:ascii="Times New Roman" w:hAnsi="Times New Roman" w:cs="Times New Roman"/>
-                <w:sz w:val="24"/>
-                <w:szCs w:val="24"/>
-              </w:rPr>
-            </w:pPr>
-            <w:r>
-              <w:rPr>
-                <w:rFonts w:ascii="Times New Roman" w:hAnsi="Times New Roman" w:cs="Times New Roman"/>
-                <w:sz w:val="24"/>
-                <w:szCs w:val="24"/>
-              </w:rPr>
-              <w:t>Scheduled refresh fails or Google Sheets access changes</w:t>
+            <w:r>
+              <w:t>Airflow, dbt, or Google Sheets access fails during demo</w:t>
             </w:r>
           </w:p>
         </w:tc>
@@ -18986,21 +18445,8 @@
             <w:vAlign w:val="center"/>
           </w:tcPr>
           <w:p>
-            <w:pPr>
-              <w:spacing w:after="0" w:line="360" w:lineRule="auto"/>
-              <w:rPr>
-                <w:rFonts w:ascii="Times New Roman" w:hAnsi="Times New Roman" w:cs="Times New Roman"/>
-                <w:sz w:val="24"/>
-                <w:szCs w:val="24"/>
-              </w:rPr>
-            </w:pPr>
-            <w:r>
-              <w:rPr>
-                <w:rFonts w:ascii="Times New Roman" w:hAnsi="Times New Roman" w:cs="Times New Roman"/>
-                <w:sz w:val="24"/>
-                <w:szCs w:val="24"/>
-              </w:rPr>
-              <w:t>Dashboard may show stale data</w:t>
+            <w:r>
+              <w:t>Pipeline/dashboard may show stale data</w:t>
             </w:r>
           </w:p>
         </w:tc>
@@ -19016,21 +18462,8 @@
             <w:vAlign w:val="center"/>
           </w:tcPr>
           <w:p>
-            <w:pPr>
-              <w:spacing w:after="0" w:line="360" w:lineRule="auto"/>
-              <w:rPr>
-                <w:rFonts w:ascii="Times New Roman" w:hAnsi="Times New Roman" w:cs="Times New Roman"/>
-                <w:sz w:val="24"/>
-                <w:szCs w:val="24"/>
-              </w:rPr>
-            </w:pPr>
-            <w:r>
-              <w:rPr>
-                <w:rFonts w:ascii="Times New Roman" w:hAnsi="Times New Roman" w:cs="Times New Roman"/>
-                <w:sz w:val="24"/>
-                <w:szCs w:val="24"/>
-              </w:rPr>
-              <w:t>Show last successful refresh, failure status, and manual refresh fallback</w:t>
+            <w:r>
+              <w:t>Show last successful refresh, failed task status, manual run fallback, and static exported marts for backup</w:t>
             </w:r>
           </w:p>
         </w:tc>
@@ -19052,21 +18485,8 @@
             <w:vAlign w:val="center"/>
           </w:tcPr>
           <w:p>
-            <w:pPr>
-              <w:spacing w:after="0" w:line="360" w:lineRule="auto"/>
-              <w:rPr>
-                <w:rFonts w:ascii="Times New Roman" w:hAnsi="Times New Roman" w:cs="Times New Roman"/>
-                <w:sz w:val="24"/>
-                <w:szCs w:val="24"/>
-              </w:rPr>
-            </w:pPr>
-            <w:r>
-              <w:rPr>
-                <w:rFonts w:ascii="Times New Roman" w:hAnsi="Times New Roman" w:cs="Times New Roman"/>
-                <w:sz w:val="24"/>
-                <w:szCs w:val="24"/>
-              </w:rPr>
-              <w:t>BigQuery/Superset setup takes longer than expected</w:t>
+            <w:r>
+              <w:t>BigQuery/Superset/dbt setup takes longer than expected</w:t>
             </w:r>
           </w:p>
         </w:tc>
@@ -19082,20 +18502,7 @@
             <w:vAlign w:val="center"/>
           </w:tcPr>
           <w:p>
-            <w:pPr>
-              <w:spacing w:after="0" w:line="360" w:lineRule="auto"/>
-              <w:rPr>
-                <w:rFonts w:ascii="Times New Roman" w:hAnsi="Times New Roman" w:cs="Times New Roman"/>
-                <w:sz w:val="24"/>
-                <w:szCs w:val="24"/>
-              </w:rPr>
-            </w:pPr>
-            <w:r>
-              <w:rPr>
-                <w:rFonts w:ascii="Times New Roman" w:hAnsi="Times New Roman" w:cs="Times New Roman"/>
-                <w:sz w:val="24"/>
-                <w:szCs w:val="24"/>
-              </w:rPr>
+            <w:r>
               <w:t>Dashboard delivery risk</w:t>
             </w:r>
           </w:p>
@@ -19112,21 +18519,8 @@
             <w:vAlign w:val="center"/>
           </w:tcPr>
           <w:p>
-            <w:pPr>
-              <w:spacing w:after="0" w:line="360" w:lineRule="auto"/>
-              <w:rPr>
-                <w:rFonts w:ascii="Times New Roman" w:hAnsi="Times New Roman" w:cs="Times New Roman"/>
-                <w:sz w:val="24"/>
-                <w:szCs w:val="24"/>
-              </w:rPr>
-            </w:pPr>
-            <w:r>
-              <w:rPr>
-                <w:rFonts w:ascii="Times New Roman" w:hAnsi="Times New Roman" w:cs="Times New Roman"/>
-                <w:sz w:val="24"/>
-                <w:szCs w:val="24"/>
-              </w:rPr>
-              <w:t>Build static CSV fallback dashboards if connection issues occur</w:t>
+            <w:r>
+              <w:t>Build minimum Bronze/Silver/Gold path first and add advanced marts after core pipeline works</w:t>
             </w:r>
           </w:p>
         </w:tc>
@@ -19227,6 +18621,38 @@
           </w:p>
         </w:tc>
       </w:tr>
+      <w:tr>
+        <w:tc>
+          <w:tcPr>
+            <w:tcW w:type="dxa" w:w="3394"/>
+          </w:tcPr>
+          <w:p>
+            <w:r>
+              <w:t>Flexible contracts map a field incorrectly</w:t>
+            </w:r>
+          </w:p>
+        </w:tc>
+        <w:tc>
+          <w:tcPr>
+            <w:tcW w:type="dxa" w:w="2416"/>
+          </w:tcPr>
+          <w:p>
+            <w:r>
+              <w:t>Analytics may use wrong source meaning</w:t>
+            </w:r>
+          </w:p>
+        </w:tc>
+        <w:tc>
+          <w:tcPr>
+            <w:tcW w:type="dxa" w:w="3206"/>
+          </w:tcPr>
+          <w:p>
+            <w:r>
+              <w:t>Store source-to-standard mappings, mapping confidence, and manual review notes in the data quality report</w:t>
+            </w:r>
+          </w:p>
+        </w:tc>
+      </w:tr>
     </w:tbl>
     <w:p>
       <w:pPr>
@@ -19258,189 +18684,253 @@
       </w:r>
     </w:p>
     <w:p>
+      <w:pPr/>
+      <w:r>
+        <w:t>Apache Airflow. (2026). Apache Airflow documentation. https://airflow.apache.org/docs/</w:t>
+      </w:r>
+    </w:p>
+    <w:p>
+      <w:pPr/>
+      <w:r>
+        <w:t>Apache Airflow. (2026). DAGs. https://airflow.apache.org/docs/apache-airflow/stable/core-concepts/dags.html</w:t>
+      </w:r>
+    </w:p>
+    <w:p>
+      <w:pPr/>
       <w:r>
         <w:t>Apache Superset. (2026). Google BigQuery database support. https://superset.apache.org/user-docs/databases/supported/google-bigquery</w:t>
       </w:r>
     </w:p>
     <w:p>
+      <w:pPr/>
       <w:r>
         <w:t>Apache Superset. (2026). Introduction to Apache Superset. https://superset.apache.org/user-docs/intro/</w:t>
       </w:r>
     </w:p>
     <w:p>
+      <w:pPr/>
       <w:r>
         <w:t>Biswas, S., Mohite, J., &amp; Pappula, S. (2022). Systems and methods for pest forecasting using historical pesticide usage information. U.S. Patent No. US11397837B2. https://patents.google.com/patent/US11397837B2</w:t>
       </w:r>
     </w:p>
     <w:p>
+      <w:pPr/>
       <w:r>
         <w:t>Blacketer, C., Defalco, F. J., Ryan, P. B., &amp; Rijnbeek, P. R. (2021). Increasing trust in real-world evidence through evaluation of observational data quality. Journal of the American Medical Informatics Association, 28(10), 2251-2257. https://doi.org/10.1093/jamia/ocab132</w:t>
       </w:r>
     </w:p>
     <w:p>
+      <w:pPr/>
       <w:r>
-        <w:lastRenderedPageBreak/>
         <w:t>Brimblecombe, P., Muller, G., Schmidt, M., Tischhauser, W., Landau, I., &amp; Querner, P. (2023). Urban pest abundance and public enquiries in Zurich 1991-2022. Insects, 14(10), 798. https://doi.org/10.3390/insects14100798</w:t>
       </w:r>
     </w:p>
     <w:p>
+      <w:pPr/>
       <w:r>
         <w:t>Calatayud, J., Jornet, M., Mateu, J., &amp; Pinto, C. M. A. (2023). A new population model for urban infestations. Chaos, Solitons &amp; Fractals, 175, 113939. https://doi.org/10.1016/j.chaos.2023.113939</w:t>
       </w:r>
     </w:p>
     <w:p>
+      <w:pPr/>
       <w:r>
         <w:t>Choi, C., &amp; Hong, S.-Y. (2021). MDST-DBSCAN: A density-based clustering method for multidimensional spatiotemporal data. ISPRS International Journal of Geo-Information, 10(6), 391. https://doi.org/10.3390/ijgi10060391</w:t>
       </w:r>
     </w:p>
     <w:p>
+      <w:pPr/>
       <w:r>
         <w:t>Cordon, J. A. (2026). Temporal evolution of predictive heat maps for Periplaneta americana infestation in urban sanitation networks (April 7 - June 23, 2022). Zenodo. https://doi.org/10.5281/zenodo.18186918</w:t>
       </w:r>
     </w:p>
     <w:p>
+      <w:pPr/>
+      <w:r>
+        <w:t>dbt Labs. (2026). About dbt documentation. https://docs.getdbt.com/docs/build/documentation</w:t>
+      </w:r>
+    </w:p>
+    <w:p>
+      <w:pPr/>
+      <w:r>
+        <w:t>dbt Labs. (2026). What is dbt? https://docs.getdbt.com/docs/introduction</w:t>
+      </w:r>
+    </w:p>
+    <w:p>
+      <w:pPr/>
       <w:r>
         <w:t>Dey, S., &amp; Roy, S. (2025). Digital Guardians: Revolutionizing pest management with AI and IoT for a greener future. In IoT and advanced intelligence computation for smart agriculture. CRC Press. https://doi.org/10.1201/9781003527664-5</w:t>
       </w:r>
     </w:p>
     <w:p>
+      <w:pPr/>
       <w:r>
         <w:t>Ejike, O., Ndzi, D., &amp; Shakir, M. Z. (2025). Comparative study of machine learning-based rainfall prediction in tropical and temperate climates. Climate, 13(8), 167. https://doi.org/10.3390/cli13080167</w:t>
       </w:r>
     </w:p>
     <w:p>
+      <w:pPr/>
       <w:r>
         <w:t>Erguler, K., et al. (2024). VEClim: An early warning decision support system for climate-sensitive vector activity and vector-borne disease risk assessment. Wellcome Open Research, 9, 697. https://doi.org/10.12688/wellcomeopenres.23122.1</w:t>
       </w:r>
     </w:p>
     <w:p>
+      <w:pPr/>
       <w:r>
         <w:t>Fiori, M., Fois, G., Gerardi, M. S., Maggio, F., Milesi, C., &amp; Pinna, A. (2024). SMARTerra, a high-resolution decision support system for monitoring plant pests and diseases. Applied Sciences, 14(18), 8275. https://doi.org/10.3390/app14188275</w:t>
       </w:r>
     </w:p>
     <w:p>
+      <w:pPr/>
       <w:r>
         <w:t>Fu, Q., Nicholson, G. L., &amp; Easton, J. M. (2024). Understanding data quality in a data-driven industry context: Insights from the fundamentals. Journal of Industrial Information Integration, 42, 100729. https://doi.org/10.1016/j.jii.2024.100729</w:t>
       </w:r>
     </w:p>
     <w:p>
+      <w:pPr/>
+      <w:r>
+        <w:t>Google Calendar. (2026). Events: list. https://developers.google.com/workspace/calendar/api/v3/reference/events/list</w:t>
+      </w:r>
+    </w:p>
+    <w:p>
+      <w:pPr/>
       <w:r>
         <w:t>Google Calendar. (2026). Google Calendar API overview. https://developers.google.com/workspace/calendar/api/guides/overview</w:t>
       </w:r>
     </w:p>
     <w:p>
-      <w:r>
-        <w:t>Google Calendar. (2026). Events: list. https://developers.google.com/workspace/calendar/api/v3/reference/events/list</w:t>
-      </w:r>
-    </w:p>
-    <w:p>
+      <w:pPr/>
       <w:r>
         <w:t>Google Cloud. (2026). BigQuery documentation. https://cloud.google.com/bigquery/docs</w:t>
       </w:r>
     </w:p>
     <w:p>
+      <w:pPr/>
       <w:r>
         <w:t>Google Cloud. (2026). Introduction to BigQuery. https://cloud.google.com/bigquery/docs/introduction</w:t>
       </w:r>
     </w:p>
     <w:p>
+      <w:pPr/>
       <w:r>
         <w:t>Gurcan, F., Ayaz, A., Menekse Dalveren, G. G., &amp; Derawi, M. (2023). Business intelligence strategies, best practices, and latest trends: Analysis of scientometric data from 2003 to 2023 using machine learning. Sustainability, 15(13), 9854. https://doi.org/10.3390/su15139854</w:t>
       </w:r>
     </w:p>
     <w:p>
+      <w:pPr/>
       <w:r>
         <w:t>Hiscox, A., Spencer, F., Dennehy, J., Dyall, W., Jenkins, A., Narendran, A., Das, A., Logan, J. G., &amp; Jones, R. T. (2025). The impact of adverse weather events on cockroaches and flies, and the possible effects on disease. Medical and Veterinary Entomology, 39(3), 500-514. https://doi.org/10.1111/mve.12797</w:t>
       </w:r>
     </w:p>
     <w:p>
+      <w:pPr/>
       <w:r>
-        <w:lastRenderedPageBreak/>
         <w:t>Kaloudis, E., Agrafioti, P., Sakka, M. K., &amp; Lampiri, E. (2026). A temperature-driven population dynamics model based on biweekly insect trap counts for stored-product pest management. Preprints. https://www.preprints.org/manuscript/202603.0573</w:t>
       </w:r>
     </w:p>
     <w:p>
+      <w:pPr/>
       <w:r>
         <w:t>Leybourne, D. J., Musa, N., &amp; Yang, P. (2025). Can artificial intelligence be integrated into pest monitoring schemes to help achieve sustainable agriculture? An entomological, management and computational perspective. Agricultural and Forest Entomology, 27(1), 8-17. https://doi.org/10.1111/afe.12630</w:t>
       </w:r>
     </w:p>
     <w:p>
+      <w:pPr/>
       <w:r>
         <w:t>Li, W., Dodwell, E., &amp; Cook, D. (2023). A clustering algorithm to organize satellite hotspot data for the purpose of tracking bushfires remotely. The R Journal, 15(1), 17-33. https://journal.r-project.org/articles/RJ-2023-022/</w:t>
       </w:r>
     </w:p>
     <w:p>
+      <w:pPr/>
       <w:r>
         <w:t>Lu, X., Wijayaratna, K., Huang, Y., &amp; Qiu, A. (2022). AI-enabled opportunities and transformation challenges for SMEs in the post-pandemic era: A review and research agenda. Frontiers in Public Health, 10, 885067. https://doi.org/10.3389/fpubh.2022.885067</w:t>
       </w:r>
     </w:p>
     <w:p>
+      <w:pPr/>
       <w:r>
         <w:t>Malaysia OpenAPI. (2026). Weather: Malaysia official Open API. https://developer.data.gov.my/realtime-api/weather</w:t>
       </w:r>
     </w:p>
     <w:p>
+      <w:pPr/>
       <w:r>
         <w:t>Malaysian Meteorological Department. (2026). Web Service API. https://api.met.gov.my/</w:t>
       </w:r>
     </w:p>
     <w:p>
+      <w:pPr/>
       <w:r>
-        <w:t>Marinko, J., Blazica, B., Jorgensen, L. N., Matzen, N., Ramsden, M., &amp; Debeljak, M. (2024). Typology for decision support systems in integrated pest management and its implementation as a web application. Agronomy, 14(3), 485. https://doi.org/10.3390/agronomy14030485</w:t>
+        <w:t>Marinko, J., Blazica, B., Jorgensen, L. N., Matzen, N., Ramsden, M., &amp; Debeljak, M. (2024).</w:t>
       </w:r>
     </w:p>
     <w:p>
+      <w:pPr/>
       <w:r>
         <w:t>Marinko, J., Kuzmanovski, V., Ramsden, M., &amp; Debeljak, M. (2025). Overcoming barriers to the adoption of decision support systems in integrated pest management in some European countries. Agronomy, 15(2), 426. https://doi.org/10.3390/agronomy15020426</w:t>
       </w:r>
     </w:p>
     <w:p>
+      <w:pPr/>
       <w:r>
         <w:t>Open-Meteo. (2026). Historical Weather API. https://open-meteo.com/en/docs/historical-weather-api</w:t>
       </w:r>
     </w:p>
     <w:p>
+      <w:pPr/>
       <w:r>
         <w:t>Open-Meteo. (2026). Licence and data sources. https://open-meteo.com/en/licence</w:t>
       </w:r>
     </w:p>
     <w:p>
+      <w:pPr/>
       <w:r>
         <w:t>Pinto, A. F., Olmstead, D., Calixto, A. A., &amp; Gomez, M. I. (2025). Network for Environment and Weather Applications: An overview of the digital pest management decision support tool. Applied Economics Teaching Resources. https://www.aetrjournal.org/UserFiles/file/AETR_2025_0218%20Final.pdf</w:t>
       </w:r>
     </w:p>
     <w:p>
+      <w:pPr/>
       <w:r>
         <w:t>Ragazou, K., Passas, I., Garefalakis, A., &amp; Zopounidis, C. (2023). Business intelligence model empowering SMEs to make better decisions and enhance their competitive advantage. Discover Analytics, 1, 2. https://doi.org/10.1007/s44257-022-00002-3</w:t>
       </w:r>
     </w:p>
     <w:p>
+      <w:pPr/>
       <w:r>
         <w:t>Richardson, J. L., McCoy, E. P., Parlavecchio, N., et al. (2025). Increasing rat numbers in cities are linked to climate warming, urbanization, and human population. Science Advances, 11(5), eads6782. https://doi.org/10.1126/sciadv.ads6782</w:t>
       </w:r>
     </w:p>
     <w:p>
+      <w:pPr/>
       <w:r>
         <w:t>Schulze, A., Brand, F., Geppert, J., &amp; Bol, G.-F. (2023). Digital dashboards visualizing public health data: A systematic review. Frontiers in Public Health, 11, 999958. https://doi.org/10.3389/fpubh.2023.999958</w:t>
       </w:r>
     </w:p>
     <w:p>
+      <w:pPr/>
       <w:r>
         <w:t>Sumido, E. C., Feliscuzo, L. S., &amp; Aliac, C. J. G. (2023). Pest classification and prediction: Analyzing the impact of weather to pest occurrence through machine learning. Journal of Engineering Science and Technology, 18, 124-138.</w:t>
       </w:r>
     </w:p>
     <w:p>
+      <w:pPr/>
       <w:r>
-        <w:lastRenderedPageBreak/>
         <w:t>Tonle, F. B. N., Niassy, S., Ndadji, M. M. Z., Tchendji, M. T., Nzeukou, A., Mudereri, B. T., Senagi, K., &amp; Tonnang, H. E. Z. (2024). A road map for developing novel decision support system (DSS) for disseminating integrated pest management (IPM) technologies. Computers and Electronics in Agriculture, 217, 108526. https://doi.org/10.1016/j.compag.2023.108526</w:t>
       </w:r>
     </w:p>
     <w:p>
+      <w:pPr/>
+      <w:r>
+        <w:t>Typology for decision support systems in integrated pest management and its implementation as a web application. Agronomy, 14(3), 485. https://doi.org/10.3390/agronomy14030485</w:t>
+      </w:r>
+    </w:p>
+    <w:p>
+      <w:pPr/>
       <w:r>
         <w:t>Yao, J., Zhou, Z., Liu, H., Yao, S., &amp; Wu, J. (2026). Analyzing the influence of environment, demographic and socio-economic factors on Aedes albopictus (Diptera: Culicidae) mosquito density at the micro-level using XGBoost and SHAP. Parasites &amp; Vectors, 19, 71. https://doi.org/10.1186/s13071-025-07220-0</w:t>
       </w:r>
     </w:p>
     <w:p>
+      <w:pPr/>
       <w:r>
         <w:t>Zippenfenig, P. (2023). Open-Meteo.com Weather API [Computer software]. Zenodo. https://doi.org/10.5281/zenodo.7970649</w:t>
       </w:r>
@@ -19706,7 +19196,6 @@
           <w:rFonts w:ascii="Times New Roman" w:hAnsi="Times New Roman" w:cs="Times New Roman"/>
           <w:szCs w:val="24"/>
         </w:rPr>
-        <w:lastRenderedPageBreak/>
         <w:t>Upsell Intelligence</w:t>
       </w:r>
     </w:p>
@@ -19742,6 +19231,7 @@
           <w:rFonts w:ascii="Times New Roman" w:hAnsi="Times New Roman" w:cs="Times New Roman"/>
           <w:szCs w:val="24"/>
         </w:rPr>
+        <w:lastRenderedPageBreak/>
         <w:t>Scheduling Capacity</w:t>
       </w:r>
     </w:p>
@@ -20022,21 +19512,8 @@
             <w:vAlign w:val="center"/>
           </w:tcPr>
           <w:p>
-            <w:pPr>
-              <w:spacing w:after="0" w:line="360" w:lineRule="auto"/>
-              <w:rPr>
-                <w:rFonts w:ascii="Times New Roman" w:hAnsi="Times New Roman" w:cs="Times New Roman"/>
-                <w:sz w:val="24"/>
-                <w:szCs w:val="24"/>
-              </w:rPr>
-            </w:pPr>
-            <w:r>
-              <w:rPr>
-                <w:rFonts w:ascii="Times New Roman" w:hAnsi="Times New Roman" w:cs="Times New Roman"/>
-                <w:sz w:val="24"/>
-                <w:szCs w:val="24"/>
-              </w:rPr>
-              <w:t>stg_* tables</w:t>
+            <w:r>
+              <w:t>bronze_* tables</w:t>
             </w:r>
           </w:p>
         </w:tc>
@@ -20052,21 +19529,8 @@
             <w:vAlign w:val="center"/>
           </w:tcPr>
           <w:p>
-            <w:pPr>
-              <w:spacing w:after="0" w:line="360" w:lineRule="auto"/>
-              <w:rPr>
-                <w:rFonts w:ascii="Times New Roman" w:hAnsi="Times New Roman" w:cs="Times New Roman"/>
-                <w:sz w:val="24"/>
-                <w:szCs w:val="24"/>
-              </w:rPr>
-            </w:pPr>
-            <w:r>
-              <w:rPr>
-                <w:rFonts w:ascii="Times New Roman" w:hAnsi="Times New Roman" w:cs="Times New Roman"/>
-                <w:sz w:val="24"/>
-                <w:szCs w:val="24"/>
-              </w:rPr>
-              <w:t>Raw staging</w:t>
+            <w:r>
+              <w:t>Bronze raw</w:t>
             </w:r>
           </w:p>
         </w:tc>
@@ -20082,21 +19546,8 @@
             <w:vAlign w:val="center"/>
           </w:tcPr>
           <w:p>
-            <w:pPr>
-              <w:spacing w:after="0" w:line="360" w:lineRule="auto"/>
-              <w:rPr>
-                <w:rFonts w:ascii="Times New Roman" w:hAnsi="Times New Roman" w:cs="Times New Roman"/>
-                <w:sz w:val="24"/>
-                <w:szCs w:val="24"/>
-              </w:rPr>
-            </w:pPr>
-            <w:r>
-              <w:rPr>
-                <w:rFonts w:ascii="Times New Roman" w:hAnsi="Times New Roman" w:cs="Times New Roman"/>
-                <w:sz w:val="24"/>
-                <w:szCs w:val="24"/>
-              </w:rPr>
-              <w:t>Preserve imported Google Sheets/CSV/calendar data with source metadata</w:t>
+            <w:r>
+              <w:t>Preserve imported Google Sheets/CSV/calendar/weather data with source metadata, loaded_at, source_name, and row hash</w:t>
             </w:r>
           </w:p>
         </w:tc>
@@ -20420,7 +19871,6 @@
                 <w:sz w:val="24"/>
                 <w:szCs w:val="24"/>
               </w:rPr>
-              <w:lastRenderedPageBreak/>
               <w:t>fact_service</w:t>
             </w:r>
           </w:p>
@@ -20517,6 +19967,7 @@
                 <w:sz w:val="24"/>
                 <w:szCs w:val="24"/>
               </w:rPr>
+              <w:lastRenderedPageBreak/>
               <w:t>fact_warranty</w:t>
             </w:r>
           </w:p>
@@ -21079,21 +20530,8 @@
             <w:vAlign w:val="center"/>
           </w:tcPr>
           <w:p>
-            <w:pPr>
-              <w:spacing w:after="0" w:line="360" w:lineRule="auto"/>
-              <w:rPr>
-                <w:rFonts w:ascii="Times New Roman" w:hAnsi="Times New Roman" w:cs="Times New Roman"/>
-                <w:sz w:val="24"/>
-                <w:szCs w:val="24"/>
-              </w:rPr>
-            </w:pPr>
-            <w:r>
-              <w:rPr>
-                <w:rFonts w:ascii="Times New Roman" w:hAnsi="Times New Roman" w:cs="Times New Roman"/>
-                <w:sz w:val="24"/>
-                <w:szCs w:val="24"/>
-              </w:rPr>
-              <w:t>dq_validation_log</w:t>
+            <w:r>
+              <w:t>data_quality_log</w:t>
             </w:r>
           </w:p>
         </w:tc>
@@ -21109,20 +20547,7 @@
             <w:vAlign w:val="center"/>
           </w:tcPr>
           <w:p>
-            <w:pPr>
-              <w:spacing w:after="0" w:line="360" w:lineRule="auto"/>
-              <w:rPr>
-                <w:rFonts w:ascii="Times New Roman" w:hAnsi="Times New Roman" w:cs="Times New Roman"/>
-                <w:sz w:val="24"/>
-                <w:szCs w:val="24"/>
-              </w:rPr>
-            </w:pPr>
-            <w:r>
-              <w:rPr>
-                <w:rFonts w:ascii="Times New Roman" w:hAnsi="Times New Roman" w:cs="Times New Roman"/>
-                <w:sz w:val="24"/>
-                <w:szCs w:val="24"/>
-              </w:rPr>
+            <w:r>
               <w:t>Quality table</w:t>
             </w:r>
           </w:p>
@@ -21139,21 +20564,8 @@
             <w:vAlign w:val="center"/>
           </w:tcPr>
           <w:p>
-            <w:pPr>
-              <w:spacing w:after="0" w:line="360" w:lineRule="auto"/>
-              <w:rPr>
-                <w:rFonts w:ascii="Times New Roman" w:hAnsi="Times New Roman" w:cs="Times New Roman"/>
-                <w:sz w:val="24"/>
-                <w:szCs w:val="24"/>
-              </w:rPr>
-            </w:pPr>
-            <w:r>
-              <w:rPr>
-                <w:rFonts w:ascii="Times New Roman" w:hAnsi="Times New Roman" w:cs="Times New Roman"/>
-                <w:sz w:val="24"/>
-                <w:szCs w:val="24"/>
-              </w:rPr>
-              <w:t>Missing values, duplicate candidates, invalid dates, unmatched records, and source-level quality status</w:t>
+            <w:r>
+              <w:t>Missing values, duplicate candidates, invalid dates, failed data contracts, unmatched records, and source-level quality status</w:t>
             </w:r>
           </w:p>
         </w:tc>
@@ -21175,21 +20587,8 @@
             <w:vAlign w:val="center"/>
           </w:tcPr>
           <w:p>
-            <w:pPr>
-              <w:spacing w:after="0" w:line="360" w:lineRule="auto"/>
-              <w:rPr>
-                <w:rFonts w:ascii="Times New Roman" w:hAnsi="Times New Roman" w:cs="Times New Roman"/>
-                <w:sz w:val="24"/>
-                <w:szCs w:val="24"/>
-              </w:rPr>
-            </w:pPr>
-            <w:r>
-              <w:rPr>
-                <w:rFonts w:ascii="Times New Roman" w:hAnsi="Times New Roman" w:cs="Times New Roman"/>
-                <w:sz w:val="24"/>
-                <w:szCs w:val="24"/>
-              </w:rPr>
-              <w:t>dq_match_confidence</w:t>
+            <w:r>
+              <w:t>record_match_log</w:t>
             </w:r>
           </w:p>
         </w:tc>
@@ -21205,20 +20604,7 @@
             <w:vAlign w:val="center"/>
           </w:tcPr>
           <w:p>
-            <w:pPr>
-              <w:spacing w:after="0" w:line="360" w:lineRule="auto"/>
-              <w:rPr>
-                <w:rFonts w:ascii="Times New Roman" w:hAnsi="Times New Roman" w:cs="Times New Roman"/>
-                <w:sz w:val="24"/>
-                <w:szCs w:val="24"/>
-              </w:rPr>
-            </w:pPr>
-            <w:r>
-              <w:rPr>
-                <w:rFonts w:ascii="Times New Roman" w:hAnsi="Times New Roman" w:cs="Times New Roman"/>
-                <w:sz w:val="24"/>
-                <w:szCs w:val="24"/>
-              </w:rPr>
+            <w:r>
               <w:t>Quality table</w:t>
             </w:r>
           </w:p>
@@ -21235,20 +20621,7 @@
             <w:vAlign w:val="center"/>
           </w:tcPr>
           <w:p>
-            <w:pPr>
-              <w:spacing w:after="0" w:line="360" w:lineRule="auto"/>
-              <w:rPr>
-                <w:rFonts w:ascii="Times New Roman" w:hAnsi="Times New Roman" w:cs="Times New Roman"/>
-                <w:sz w:val="24"/>
-                <w:szCs w:val="24"/>
-              </w:rPr>
-            </w:pPr>
-            <w:r>
-              <w:rPr>
-                <w:rFonts w:ascii="Times New Roman" w:hAnsi="Times New Roman" w:cs="Times New Roman"/>
-                <w:sz w:val="24"/>
-                <w:szCs w:val="24"/>
-              </w:rPr>
+            <w:r>
               <w:t>Customer, calendar, area/postcode, and weather-enrichment match confidence</w:t>
             </w:r>
           </w:p>
@@ -21271,22 +20644,8 @@
             <w:vAlign w:val="center"/>
           </w:tcPr>
           <w:p>
-            <w:pPr>
-              <w:spacing w:after="0" w:line="360" w:lineRule="auto"/>
-              <w:rPr>
-                <w:rFonts w:ascii="Times New Roman" w:hAnsi="Times New Roman" w:cs="Times New Roman"/>
-                <w:sz w:val="24"/>
-                <w:szCs w:val="24"/>
-              </w:rPr>
-            </w:pPr>
-            <w:r>
-              <w:rPr>
-                <w:rFonts w:ascii="Times New Roman" w:hAnsi="Times New Roman" w:cs="Times New Roman"/>
-                <w:sz w:val="24"/>
-                <w:szCs w:val="24"/>
-              </w:rPr>
-              <w:lastRenderedPageBreak/>
-              <w:t>privacy_reporting_views</w:t>
+            <w:r>
+              <w:t>anonymised_reporting_views</w:t>
             </w:r>
           </w:p>
         </w:tc>
@@ -21302,20 +20661,7 @@
             <w:vAlign w:val="center"/>
           </w:tcPr>
           <w:p>
-            <w:pPr>
-              <w:spacing w:after="0" w:line="360" w:lineRule="auto"/>
-              <w:rPr>
-                <w:rFonts w:ascii="Times New Roman" w:hAnsi="Times New Roman" w:cs="Times New Roman"/>
-                <w:sz w:val="24"/>
-                <w:szCs w:val="24"/>
-              </w:rPr>
-            </w:pPr>
-            <w:r>
-              <w:rPr>
-                <w:rFonts w:ascii="Times New Roman" w:hAnsi="Times New Roman" w:cs="Times New Roman"/>
-                <w:sz w:val="24"/>
-                <w:szCs w:val="24"/>
-              </w:rPr>
+            <w:r>
               <w:t>Views</w:t>
             </w:r>
           </w:p>
@@ -21332,21 +20678,8 @@
             <w:vAlign w:val="center"/>
           </w:tcPr>
           <w:p>
-            <w:pPr>
-              <w:spacing w:after="0" w:line="360" w:lineRule="auto"/>
-              <w:rPr>
-                <w:rFonts w:ascii="Times New Roman" w:hAnsi="Times New Roman" w:cs="Times New Roman"/>
-                <w:sz w:val="24"/>
-                <w:szCs w:val="24"/>
-              </w:rPr>
-            </w:pPr>
-            <w:r>
-              <w:rPr>
-                <w:rFonts w:ascii="Times New Roman" w:hAnsi="Times New Roman" w:cs="Times New Roman"/>
-                <w:sz w:val="24"/>
-                <w:szCs w:val="24"/>
-              </w:rPr>
-              <w:t>Anonymised reporting outputs using customer ID and area/postcode instead of names/phone numbers</w:t>
+            <w:r>
+              <w:t>Reporting outputs using customer ID and area/postcode instead of names, phone numbers, emails, or full addresses</w:t>
             </w:r>
           </w:p>
         </w:tc>
@@ -21382,6 +20715,7 @@
                 <w:sz w:val="24"/>
                 <w:szCs w:val="24"/>
               </w:rPr>
+              <w:lastRenderedPageBreak/>
               <w:t>mart_area_risk</w:t>
             </w:r>
           </w:p>
@@ -21944,20 +21278,7 @@
             <w:vAlign w:val="center"/>
           </w:tcPr>
           <w:p>
-            <w:pPr>
-              <w:spacing w:after="0" w:line="360" w:lineRule="auto"/>
-              <w:rPr>
-                <w:rFonts w:ascii="Times New Roman" w:hAnsi="Times New Roman" w:cs="Times New Roman"/>
-                <w:sz w:val="24"/>
-                <w:szCs w:val="24"/>
-              </w:rPr>
-            </w:pPr>
-            <w:r>
-              <w:rPr>
-                <w:rFonts w:ascii="Times New Roman" w:hAnsi="Times New Roman" w:cs="Times New Roman"/>
-                <w:sz w:val="24"/>
-                <w:szCs w:val="24"/>
-              </w:rPr>
+            <w:r>
               <w:t>mart_refresh_status</w:t>
             </w:r>
           </w:p>
@@ -21974,20 +21295,7 @@
             <w:vAlign w:val="center"/>
           </w:tcPr>
           <w:p>
-            <w:pPr>
-              <w:spacing w:after="0" w:line="360" w:lineRule="auto"/>
-              <w:rPr>
-                <w:rFonts w:ascii="Times New Roman" w:hAnsi="Times New Roman" w:cs="Times New Roman"/>
-                <w:sz w:val="24"/>
-                <w:szCs w:val="24"/>
-              </w:rPr>
-            </w:pPr>
-            <w:r>
-              <w:rPr>
-                <w:rFonts w:ascii="Times New Roman" w:hAnsi="Times New Roman" w:cs="Times New Roman"/>
-                <w:sz w:val="24"/>
-                <w:szCs w:val="24"/>
-              </w:rPr>
+            <w:r>
               <w:t>Analytics mart</w:t>
             </w:r>
           </w:p>
@@ -22004,21 +21312,136 @@
             <w:vAlign w:val="center"/>
           </w:tcPr>
           <w:p>
-            <w:pPr>
-              <w:spacing w:after="0" w:line="360" w:lineRule="auto"/>
-              <w:rPr>
-                <w:rFonts w:ascii="Times New Roman" w:hAnsi="Times New Roman" w:cs="Times New Roman"/>
-                <w:sz w:val="24"/>
-                <w:szCs w:val="24"/>
-              </w:rPr>
-            </w:pPr>
-            <w:r>
-              <w:rPr>
-                <w:rFonts w:ascii="Times New Roman" w:hAnsi="Times New Roman" w:cs="Times New Roman"/>
-                <w:sz w:val="24"/>
-                <w:szCs w:val="24"/>
-              </w:rPr>
-              <w:t>Last successful refresh, failed refresh reason, row counts, and dashboard data freshness</w:t>
+            <w:r>
+              <w:t>Last successful refresh, failed refresh reason, Airflow run status, row counts, dbt test status, and dashboard data freshness</w:t>
+            </w:r>
+          </w:p>
+        </w:tc>
+      </w:tr>
+      <w:tr>
+        <w:tc>
+          <w:tcPr>
+            <w:tcW w:type="dxa" w:w="3764"/>
+          </w:tcPr>
+          <w:p>
+            <w:r>
+              <w:t>etl_run_log</w:t>
+            </w:r>
+          </w:p>
+        </w:tc>
+        <w:tc>
+          <w:tcPr>
+            <w:tcW w:type="dxa" w:w="1711"/>
+          </w:tcPr>
+          <w:p>
+            <w:r>
+              <w:t>Audit table</w:t>
+            </w:r>
+          </w:p>
+        </w:tc>
+        <w:tc>
+          <w:tcPr>
+            <w:tcW w:type="dxa" w:w="3541"/>
+          </w:tcPr>
+          <w:p>
+            <w:r>
+              <w:t>Airflow run ID, task name, source name, start/end time, rows extracted, rows loaded, rows failed, status, and error message</w:t>
+            </w:r>
+          </w:p>
+        </w:tc>
+      </w:tr>
+      <w:tr>
+        <w:tc>
+          <w:tcPr>
+            <w:tcW w:type="dxa" w:w="3764"/>
+          </w:tcPr>
+          <w:p>
+            <w:r>
+              <w:t>source_contract_status</w:t>
+            </w:r>
+          </w:p>
+        </w:tc>
+        <w:tc>
+          <w:tcPr>
+            <w:tcW w:type="dxa" w:w="1711"/>
+          </w:tcPr>
+          <w:p>
+            <w:r>
+              <w:t>Quality table</w:t>
+            </w:r>
+          </w:p>
+        </w:tc>
+        <w:tc>
+          <w:tcPr>
+            <w:tcW w:type="dxa" w:w="3541"/>
+          </w:tcPr>
+          <w:p>
+            <w:r>
+              <w:t>Expected fields, mapped aliases, missing critical fields, warnings, and source acceptance status</w:t>
+            </w:r>
+          </w:p>
+        </w:tc>
+      </w:tr>
+      <w:tr>
+        <w:tc>
+          <w:tcPr>
+            <w:tcW w:type="dxa" w:w="3764"/>
+          </w:tcPr>
+          <w:p>
+            <w:r>
+              <w:t>dbt_test_results</w:t>
+            </w:r>
+          </w:p>
+        </w:tc>
+        <w:tc>
+          <w:tcPr>
+            <w:tcW w:type="dxa" w:w="1711"/>
+          </w:tcPr>
+          <w:p>
+            <w:r>
+              <w:t>Quality table</w:t>
+            </w:r>
+          </w:p>
+        </w:tc>
+        <w:tc>
+          <w:tcPr>
+            <w:tcW w:type="dxa" w:w="3541"/>
+          </w:tcPr>
+          <w:p>
+            <w:r>
+              <w:t>dbt model test outcomes for not-null, unique, accepted values, and relationship checks</w:t>
+            </w:r>
+          </w:p>
+        </w:tc>
+      </w:tr>
+      <w:tr>
+        <w:tc>
+          <w:tcPr>
+            <w:tcW w:type="dxa" w:w="3764"/>
+          </w:tcPr>
+          <w:p>
+            <w:r>
+              <w:t>dbt_lineage_docs</w:t>
+            </w:r>
+          </w:p>
+        </w:tc>
+        <w:tc>
+          <w:tcPr>
+            <w:tcW w:type="dxa" w:w="1711"/>
+          </w:tcPr>
+          <w:p>
+            <w:r>
+              <w:t>Documentation output</w:t>
+            </w:r>
+          </w:p>
+        </w:tc>
+        <w:tc>
+          <w:tcPr>
+            <w:tcW w:type="dxa" w:w="3541"/>
+          </w:tcPr>
+          <w:p>
+            <w:r>
+              <w:t>Model/source lineage and table documentation generated from dbt for CP2 demonstration</w:t>
             </w:r>
           </w:p>
         </w:tc>
@@ -33718,6 +33141,29 @@
       </w:tcPr>
     </w:tblStylePr>
   </w:style>
+  <w:style w:type="character" w:styleId="Hyperlink">
+    <w:name w:val="Hyperlink"/>
+    <w:basedOn w:val="DefaultParagraphFont"/>
+    <w:uiPriority w:val="99"/>
+    <w:unhideWhenUsed/>
+    <w:rsid w:val="00737E62"/>
+    <w:rPr>
+      <w:color w:val="0000FF" w:themeColor="hyperlink"/>
+      <w:u w:val="single"/>
+    </w:rPr>
+  </w:style>
+  <w:style w:type="character" w:styleId="UnresolvedMention">
+    <w:name w:val="Unresolved Mention"/>
+    <w:basedOn w:val="DefaultParagraphFont"/>
+    <w:uiPriority w:val="99"/>
+    <w:semiHidden/>
+    <w:unhideWhenUsed/>
+    <w:rsid w:val="00737E62"/>
+    <w:rPr>
+      <w:color w:val="605E5C"/>
+      <w:shd w:val="clear" w:color="auto" w:fill="E1DFDD"/>
+    </w:rPr>
+  </w:style>
 </w:styles>
 </file>
 

</xml_diff>

<commit_message>
Restore proposal cover page formatting
</commit_message>
<xml_diff>
--- a/docs/Nomobug_Capstone_Proposal_CP1_Updated.docx
+++ b/docs/Nomobug_Capstone_Proposal_CP1_Updated.docx
@@ -4,8 +4,8 @@
   <w:body>
     <w:p>
       <w:pPr>
-        <w:spacing w:line="360" w:lineRule="auto" w:after="120"/>
-        <w:jc w:val="both"/>
+        <w:spacing w:line="276" w:lineRule="auto" w:after="80" w:before="0"/>
+        <w:jc w:val="center"/>
         <w:rPr>
           <w:rFonts w:ascii="Times New Roman" w:eastAsia="DengXian" w:hAnsi="Times New Roman" w:cs="Times New Roman"/>
           <w:b/>
@@ -19,8 +19,8 @@
     </w:p>
     <w:p>
       <w:pPr>
-        <w:spacing w:line="360" w:lineRule="auto" w:after="120"/>
-        <w:jc w:val="both"/>
+        <w:spacing w:line="276" w:lineRule="auto" w:after="120" w:before="0"/>
+        <w:jc w:val="center"/>
         <w:rPr>
           <w:rFonts w:ascii="Times New Roman" w:eastAsia="DengXian" w:hAnsi="Times New Roman" w:cs="Times New Roman"/>
           <w:b/>
@@ -37,7 +37,7 @@
           <w:b/>
           <w:noProof/>
           <w:kern w:val="20"/>
-          <w:sz w:val="24"/>
+          <w:sz w:val="32"/>
           <w:szCs w:val="28"/>
           <w:lang w:val="en-MY" w:eastAsia="en-MY"/>
         </w:rPr>
@@ -46,8 +46,8 @@
     </w:p>
     <w:p>
       <w:pPr>
-        <w:spacing w:line="360" w:lineRule="auto" w:after="120"/>
-        <w:jc w:val="both"/>
+        <w:spacing w:line="276" w:lineRule="auto" w:after="560" w:before="0"/>
+        <w:jc w:val="center"/>
         <w:rPr>
           <w:rFonts w:ascii="Times New Roman" w:eastAsia="DengXian" w:hAnsi="Times New Roman" w:cs="Times New Roman"/>
           <w:b/>
@@ -64,7 +64,7 @@
           <w:b/>
           <w:noProof/>
           <w:kern w:val="20"/>
-          <w:sz w:val="24"/>
+          <w:sz w:val="28"/>
           <w:szCs w:val="28"/>
           <w:lang w:val="en-MY" w:eastAsia="en-MY"/>
         </w:rPr>
@@ -73,8 +73,8 @@
     </w:p>
     <w:p>
       <w:pPr>
-        <w:spacing w:line="360" w:lineRule="auto" w:after="120"/>
-        <w:jc w:val="both"/>
+        <w:spacing w:line="276" w:lineRule="auto" w:after="80" w:before="0"/>
+        <w:jc w:val="center"/>
         <w:rPr>
           <w:rFonts w:ascii="Times New Roman" w:eastAsia="DengXian" w:hAnsi="Times New Roman" w:cs="Times New Roman"/>
           <w:b/>
@@ -87,8 +87,8 @@
     </w:p>
     <w:p>
       <w:pPr>
-        <w:spacing w:line="360" w:lineRule="auto" w:after="120"/>
-        <w:jc w:val="both"/>
+        <w:spacing w:line="276" w:lineRule="auto" w:after="160" w:before="0"/>
+        <w:jc w:val="center"/>
         <w:rPr>
           <w:rFonts w:ascii="Times New Roman" w:eastAsia="DengXian" w:hAnsi="Times New Roman" w:cs="Times New Roman"/>
           <w:bCs/>
@@ -113,8 +113,8 @@
     </w:p>
     <w:p>
       <w:pPr>
-        <w:spacing w:line="360" w:lineRule="auto" w:after="120"/>
-        <w:jc w:val="both"/>
+        <w:spacing w:line="276" w:lineRule="auto" w:after="560" w:before="0"/>
+        <w:jc w:val="center"/>
         <w:rPr>
           <w:rFonts w:ascii="Times New Roman" w:eastAsia="DengXian" w:hAnsi="Times New Roman" w:cs="Times New Roman"/>
           <w:b/>
@@ -131,7 +131,7 @@
           <w:b/>
           <w:bCs/>
           <w:kern w:val="20"/>
-          <w:sz w:val="24"/>
+          <w:sz w:val="28"/>
           <w:szCs w:val="24"/>
           <w:lang w:val="en-MY" w:eastAsia="zh-CN"/>
         </w:rPr>
@@ -140,8 +140,8 @@
     </w:p>
     <w:p>
       <w:pPr>
-        <w:spacing w:line="360" w:lineRule="auto" w:after="120"/>
-        <w:jc w:val="both"/>
+        <w:spacing w:line="276" w:lineRule="auto" w:after="80" w:before="0"/>
+        <w:jc w:val="center"/>
         <w:rPr>
           <w:rFonts w:ascii="Times New Roman" w:eastAsia="DengXian" w:hAnsi="Times New Roman" w:cs="Times New Roman"/>
           <w:b/>
@@ -155,8 +155,8 @@
     </w:p>
     <w:p>
       <w:pPr>
-        <w:spacing w:line="360" w:lineRule="auto" w:after="120"/>
-        <w:jc w:val="both"/>
+        <w:spacing w:line="276" w:lineRule="auto" w:after="160" w:before="0"/>
+        <w:jc w:val="center"/>
         <w:rPr>
           <w:rFonts w:ascii="Times New Roman" w:eastAsia="DengXian" w:hAnsi="Times New Roman" w:cs="Times New Roman"/>
           <w:kern w:val="20"/>
@@ -179,8 +179,8 @@
     </w:p>
     <w:p>
       <w:pPr>
-        <w:spacing w:line="360" w:lineRule="auto" w:after="120"/>
-        <w:jc w:val="both"/>
+        <w:spacing w:line="276" w:lineRule="auto" w:after="40" w:before="0"/>
+        <w:jc w:val="center"/>
         <w:rPr>
           <w:rFonts w:ascii="Times New Roman" w:eastAsia="DengXian" w:hAnsi="Times New Roman" w:cs="Times New Roman"/>
           <w:b/>
@@ -206,8 +206,8 @@
     </w:p>
     <w:p>
       <w:pPr>
-        <w:spacing w:line="360" w:lineRule="auto" w:after="120"/>
-        <w:jc w:val="both"/>
+        <w:spacing w:line="276" w:lineRule="auto" w:after="480" w:before="0"/>
+        <w:jc w:val="center"/>
         <w:rPr>
           <w:rFonts w:ascii="Times New Roman" w:eastAsia="DengXian" w:hAnsi="Times New Roman" w:cs="Times New Roman"/>
           <w:b/>
@@ -233,8 +233,8 @@
     </w:p>
     <w:p>
       <w:pPr>
-        <w:spacing w:line="360" w:lineRule="auto" w:after="120"/>
-        <w:jc w:val="both"/>
+        <w:spacing w:line="276" w:lineRule="auto" w:after="80" w:before="0"/>
+        <w:jc w:val="center"/>
         <w:rPr>
           <w:rFonts w:ascii="Times New Roman" w:eastAsia="DengXian" w:hAnsi="Times New Roman" w:cs="Times New Roman"/>
           <w:b/>
@@ -248,8 +248,8 @@
     </w:p>
     <w:p>
       <w:pPr>
-        <w:spacing w:line="360" w:lineRule="auto" w:after="120"/>
-        <w:jc w:val="both"/>
+        <w:spacing w:line="276" w:lineRule="auto" w:after="160" w:before="0"/>
+        <w:jc w:val="center"/>
         <w:rPr>
           <w:rFonts w:ascii="Times New Roman" w:eastAsia="Arial" w:hAnsi="Times New Roman" w:cs="Times New Roman"/>
           <w:b/>
@@ -273,8 +273,8 @@
     </w:p>
     <w:p>
       <w:pPr>
-        <w:spacing w:line="360" w:lineRule="auto" w:after="120"/>
-        <w:jc w:val="both"/>
+        <w:spacing w:line="276" w:lineRule="auto" w:after="480" w:before="0"/>
+        <w:jc w:val="center"/>
         <w:rPr>
           <w:rFonts w:ascii="Times New Roman" w:eastAsia="DengXian" w:hAnsi="Times New Roman" w:cs="Times New Roman"/>
           <w:b/>
@@ -299,8 +299,8 @@
     </w:p>
     <w:p>
       <w:pPr>
-        <w:spacing w:line="360" w:lineRule="auto" w:after="120"/>
-        <w:jc w:val="both"/>
+        <w:spacing w:line="276" w:lineRule="auto" w:after="80" w:before="0"/>
+        <w:jc w:val="center"/>
         <w:rPr>
           <w:rFonts w:ascii="Times New Roman" w:eastAsia="DengXian" w:hAnsi="Times New Roman" w:cs="Times New Roman"/>
           <w:b/>
@@ -312,8 +312,8 @@
     </w:p>
     <w:p>
       <w:pPr>
-        <w:spacing w:line="360" w:lineRule="auto" w:after="120"/>
-        <w:jc w:val="both"/>
+        <w:spacing w:line="276" w:lineRule="auto" w:after="160" w:before="0"/>
+        <w:jc w:val="center"/>
         <w:rPr>
           <w:rFonts w:ascii="Times New Roman" w:eastAsia="Times New Roman" w:hAnsi="Times New Roman" w:cs="Times New Roman"/>
           <w:b/>
@@ -337,8 +337,8 @@
     </w:p>
     <w:p>
       <w:pPr>
-        <w:spacing w:line="360" w:lineRule="auto" w:after="120"/>
-        <w:jc w:val="both"/>
+        <w:spacing w:line="276" w:lineRule="auto" w:after="720" w:before="0"/>
+        <w:jc w:val="center"/>
         <w:rPr>
           <w:rFonts w:ascii="Times New Roman" w:eastAsia="Times New Roman" w:hAnsi="Times New Roman" w:cs="Times New Roman"/>
           <w:b/>
@@ -361,8 +361,8 @@
     </w:p>
     <w:p>
       <w:pPr>
-        <w:spacing w:line="360" w:lineRule="auto" w:after="120"/>
-        <w:jc w:val="both"/>
+        <w:spacing w:line="276" w:lineRule="auto" w:after="80" w:before="0"/>
+        <w:jc w:val="center"/>
         <w:rPr>
           <w:rFonts w:ascii="Times New Roman" w:eastAsia="Times New Roman" w:hAnsi="Times New Roman" w:cs="Times New Roman"/>
           <w:sz w:val="24"/>
@@ -373,8 +373,8 @@
     </w:p>
     <w:p>
       <w:pPr>
-        <w:spacing w:line="360" w:lineRule="auto" w:after="120"/>
-        <w:jc w:val="both"/>
+        <w:spacing w:line="276" w:lineRule="auto" w:after="80" w:before="0"/>
+        <w:jc w:val="center"/>
         <w:rPr>
           <w:rFonts w:ascii="Times New Roman" w:eastAsia="Times New Roman" w:hAnsi="Times New Roman" w:cs="Times New Roman"/>
           <w:sz w:val="24"/>
@@ -385,8 +385,8 @@
     </w:p>
     <w:p>
       <w:pPr>
-        <w:spacing w:line="360" w:lineRule="auto" w:after="120"/>
-        <w:jc w:val="both"/>
+        <w:spacing w:line="276" w:lineRule="auto" w:after="80" w:before="0"/>
+        <w:jc w:val="center"/>
         <w:rPr>
           <w:rFonts w:ascii="Times New Roman" w:eastAsia="Times New Roman" w:hAnsi="Times New Roman" w:cs="Times New Roman"/>
           <w:sz w:val="24"/>
@@ -397,6 +397,7 @@
       <w:r>
         <w:rPr>
           <w:rFonts w:ascii="Times New Roman" w:eastAsia="Times New Roman" w:hAnsi="Times New Roman" w:cs="Times New Roman"/>
+          <w:b w:val="0"/>
           <w:sz w:val="24"/>
           <w:szCs w:val="24"/>
           <w:lang w:val="en" w:eastAsia="en-GB"/>
@@ -406,8 +407,8 @@
     </w:p>
     <w:p>
       <w:pPr>
-        <w:spacing w:line="360" w:lineRule="auto" w:after="120"/>
-        <w:jc w:val="both"/>
+        <w:spacing w:line="276" w:lineRule="auto" w:after="880" w:before="0"/>
+        <w:jc w:val="center"/>
         <w:rPr>
           <w:rFonts w:ascii="Times New Roman" w:eastAsia="Arial" w:hAnsi="Times New Roman" w:cs="Times New Roman"/>
           <w:sz w:val="24"/>
@@ -418,6 +419,7 @@
       <w:r>
         <w:rPr>
           <w:rFonts w:ascii="Times New Roman" w:eastAsia="Times New Roman" w:hAnsi="Times New Roman" w:cs="Times New Roman"/>
+          <w:b w:val="0"/>
           <w:sz w:val="24"/>
           <w:szCs w:val="24"/>
           <w:lang w:val="en" w:eastAsia="en-GB"/>
@@ -427,6 +429,7 @@
       <w:r>
         <w:rPr>
           <w:rFonts w:ascii="Times New Roman" w:eastAsia="Times New Roman" w:hAnsi="Times New Roman" w:cs="Times New Roman"/>
+          <w:b w:val="0"/>
           <w:noProof/>
           <w:sz w:val="24"/>
           <w:szCs w:val="24"/>
@@ -437,8 +440,8 @@
     </w:p>
     <w:p>
       <w:pPr>
-        <w:spacing w:line="360" w:lineRule="auto" w:after="120"/>
-        <w:jc w:val="both"/>
+        <w:spacing w:line="276" w:lineRule="auto" w:after="80" w:before="0"/>
+        <w:jc w:val="center"/>
         <w:rPr>
           <w:rFonts w:ascii="Times New Roman" w:eastAsia="Times New Roman" w:hAnsi="Times New Roman" w:cs="Times New Roman"/>
           <w:sz w:val="24"/>
@@ -449,8 +452,8 @@
     </w:p>
     <w:p>
       <w:pPr>
-        <w:spacing w:line="360" w:lineRule="auto" w:after="120"/>
-        <w:jc w:val="both"/>
+        <w:spacing w:line="276" w:lineRule="auto" w:after="80" w:before="0"/>
+        <w:jc w:val="center"/>
         <w:rPr>
           <w:rFonts w:ascii="Times New Roman" w:eastAsia="Times New Roman" w:hAnsi="Times New Roman" w:cs="Times New Roman"/>
           <w:sz w:val="24"/>
@@ -461,8 +464,8 @@
     </w:p>
     <w:p>
       <w:pPr>
-        <w:spacing w:line="360" w:lineRule="auto" w:after="120"/>
-        <w:jc w:val="both"/>
+        <w:spacing w:line="276" w:lineRule="auto" w:after="80" w:before="0"/>
+        <w:jc w:val="center"/>
         <w:rPr>
           <w:rFonts w:ascii="Times New Roman" w:eastAsia="Times New Roman" w:hAnsi="Times New Roman" w:cs="Times New Roman"/>
           <w:sz w:val="24"/>
@@ -483,8 +486,8 @@
     </w:p>
     <w:p>
       <w:pPr>
-        <w:spacing w:line="360" w:lineRule="auto" w:after="120"/>
-        <w:jc w:val="both"/>
+        <w:spacing w:line="276" w:lineRule="auto" w:after="80" w:before="0"/>
+        <w:jc w:val="center"/>
         <w:rPr>
           <w:rFonts w:ascii="Times New Roman" w:eastAsia="Times New Roman" w:hAnsi="Times New Roman" w:cs="Times New Roman"/>
           <w:sz w:val="24"/>
@@ -505,8 +508,8 @@
     </w:p>
     <w:p>
       <w:pPr>
-        <w:spacing w:line="360" w:lineRule="auto" w:after="120"/>
-        <w:jc w:val="both"/>
+        <w:spacing w:line="276" w:lineRule="auto" w:after="0" w:before="0"/>
+        <w:jc w:val="center"/>
         <w:rPr>
           <w:rFonts w:ascii="Times New Roman" w:eastAsia="Times New Roman" w:hAnsi="Times New Roman" w:cs="Times New Roman"/>
           <w:sz w:val="24"/>

</xml_diff>